<commit_message>
Trim opening and merge wrap-up sections (Piero's suggested cuts)
- Save pre-cut draft as vanLangren-Secret-R0.qmd for comparison
- Opening: keep the Minard/Guerry example, cite Raiders of the Lost
  Tombs (Nightingale, 2020) instead of linking; drop Milecz and
  Lightfoot anecdotes
- Merge "Every Cipher Tells a Story" and "Coda" into one closing
  section after the Bonus, keeping the time-and-knowledge theme
- Prose now ~4,290 words (from ~4,680)

Co-Authored-By: Claude Opus 5.5 <noreply@anthropic.com>
</commit_message>
<xml_diff>
--- a/vanLangren-Secret.docx
+++ b/vanLangren-Secret.docx
@@ -37,70 +37,13 @@
         <w:t xml:space="preserve"> </w:t>
       </w:r>
       <w:r>
-        <w:t xml:space="preserve">Cemetery and that his near neighbor there is Andre-Michel Guerry. The story of these and other historical excavations is told in</w:t>
-      </w:r>
-      <w:r>
-        <w:t xml:space="preserve"> </w:t>
-      </w:r>
-      <w:hyperlink r:id="rId9">
-        <w:r>
-          <w:rPr>
-            <w:rStyle w:val="Hyperlink"/>
-          </w:rPr>
-          <w:t xml:space="preserve">Raiders of the Lost Tombs</w:t>
-        </w:r>
-      </w:hyperlink>
-      <w:r>
-        <w:t xml:space="preserve">.</w:t>
-      </w:r>
-      <w:r>
-        <w:t xml:space="preserve"> </w:t>
-      </w:r>
-      <w:r>
-        <w:t xml:space="preserve">Or a hero nobody had noticed yet,</w:t>
-      </w:r>
-      <w:r>
-        <w:t xml:space="preserve"> </w:t>
-      </w:r>
-      <w:r>
-        <w:t xml:space="preserve">like the Hungarian cartographer Imre Milecz,</w:t>
-      </w:r>
-      <w:r>
-        <w:t xml:space="preserve"> </w:t>
-      </w:r>
-      <w:hyperlink r:id="rId10">
-        <w:r>
-          <w:rPr>
-            <w:rStyle w:val="Hyperlink"/>
-          </w:rPr>
-          <w:t xml:space="preserve">discovered by Attila Bátorfy</w:t>
-        </w:r>
-      </w:hyperlink>
-      <w:r>
-        <w:t xml:space="preserve"> </w:t>
-      </w:r>
-      <w:r>
-        <w:t xml:space="preserve">to have drawn the first flow map in 1773—decades before the credit usually goes to Minard or</w:t>
-      </w:r>
-      <w:r>
-        <w:t xml:space="preserve"> </w:t>
-      </w:r>
-      <w:hyperlink r:id="rId11">
-        <w:r>
-          <w:rPr>
-            <w:rStyle w:val="Hyperlink"/>
-          </w:rPr>
-          <w:t xml:space="preserve">Henry Harness</w:t>
-        </w:r>
-      </w:hyperlink>
-      <w:r>
-        <w:t xml:space="preserve">.</w:t>
-      </w:r>
-      <w:r>
-        <w:t xml:space="preserve"> </w:t>
-      </w:r>
-      <w:r>
-        <w:t xml:space="preserve">Or Frances Harriet Lightfoot, whose 1831</w:t>
+        <w:t xml:space="preserve">Cemetery and that his near neighbor there is Andre-Michel Guerry.</w:t>
+      </w:r>
+      <w:r>
+        <w:t xml:space="preserve"> </w:t>
+      </w:r>
+      <w:r>
+        <w:t xml:space="preserve">I told that story here in</w:t>
       </w:r>
       <w:r>
         <w:t xml:space="preserve"> </w:t>
@@ -110,25 +53,35 @@
           <w:i/>
           <w:iCs/>
         </w:rPr>
-        <w:t xml:space="preserve">An Embellished Chart of General History and Chronology</w:t>
-      </w:r>
-      <w:r>
-        <w:t xml:space="preserve"> </w:t>
-      </w:r>
-      <w:r>
-        <w:t xml:space="preserve">had gone essentially unknown to modern researchers until</w:t>
-      </w:r>
-      <w:r>
-        <w:t xml:space="preserve"> </w:t>
-      </w:r>
-      <w:hyperlink r:id="rId12">
-        <w:r>
-          <w:rPr>
-            <w:rStyle w:val="Hyperlink"/>
-          </w:rPr>
-          <w:t xml:space="preserve">RJ Andrews found it</w:t>
-        </w:r>
-      </w:hyperlink>
+        <w:t xml:space="preserve">Nightingale</w:t>
+      </w:r>
+      <w:r>
+        <w:t xml:space="preserve"> </w:t>
+      </w:r>
+      <w:r>
+        <w:t xml:space="preserve">in</w:t>
+      </w:r>
+      <w:r>
+        <w:t xml:space="preserve"> </w:t>
+      </w:r>
+      <w:r>
+        <w:t xml:space="preserve">“Raiders of the Lost Tombs”</w:t>
+      </w:r>
+      <w:r>
+        <w:t xml:space="preserve"> </w:t>
+      </w:r>
+      <w:r>
+        <w:t xml:space="preserve">(</w:t>
+      </w:r>
+      <w:r>
+        <w:t xml:space="preserve">Friendly and les Chevaliers</w:t>
+      </w:r>
+      <w:r>
+        <w:t xml:space="preserve"> </w:t>
+      </w:r>
+      <w:r>
+        <w:t xml:space="preserve">2020)</w:t>
+      </w:r>
       <w:r>
         <w:t xml:space="preserve">.</w:t>
       </w:r>
@@ -138,13 +91,13 @@
         <w:pStyle w:val="BodyText"/>
       </w:pPr>
       <w:r>
-        <w:t xml:space="preserve">Sometimes these surprises are more unsettling. The worst is the discovery that we got some piece of the historical record</w:t>
-      </w:r>
-      <w:r>
-        <w:t xml:space="preserve"> </w:t>
-      </w:r>
-      <w:r>
-        <w:t xml:space="preserve">or our interpretation entirely wrong.</w:t>
+        <w:t xml:space="preserve">Sometimes these surprises are more unsettling: the discovery that we got some piece of the historical record,</w:t>
+      </w:r>
+      <w:r>
+        <w:t xml:space="preserve"> </w:t>
+      </w:r>
+      <w:r>
+        <w:t xml:space="preserve">or our interpretation of it, entirely wrong.</w:t>
       </w:r>
       <w:r>
         <w:t xml:space="preserve"> </w:t>
@@ -159,25 +112,17 @@
       <w:r>
         <w:t xml:space="preserve">, for an accurate method of determining longitude at sea, is a surprise of this second kind.</w:t>
       </w:r>
-    </w:p>
-    <w:p>
-      <w:pPr>
-        <w:pStyle w:val="BodyText"/>
-      </w:pPr>
-      <w:r>
-        <w:t xml:space="preserve">Yet, to an amateur historian like myself, telling the story of this unwelcome surprise itself has a certain</w:t>
-      </w:r>
-      <w:r>
-        <w:t xml:space="preserve"> </w:t>
-      </w:r>
-      <w:r>
-        <w:t xml:space="preserve">reward. It is not just a matter of correcting the record; more that of an appreciation of</w:t>
-      </w:r>
-      <w:r>
-        <w:t xml:space="preserve"> </w:t>
-      </w:r>
-      <w:r>
-        <w:t xml:space="preserve">how our understanding of history continues to unfold, as new</w:t>
+      <w:r>
+        <w:t xml:space="preserve"> </w:t>
+      </w:r>
+      <w:r>
+        <w:t xml:space="preserve">Yet telling the story of an unwelcome surprise has its own reward: not just correcting the record, but seeing</w:t>
+      </w:r>
+      <w:r>
+        <w:t xml:space="preserve"> </w:t>
+      </w:r>
+      <w:r>
+        <w:t xml:space="preserve">how our understanding of history continues to unfold as new</w:t>
       </w:r>
       <w:r>
         <w:t xml:space="preserve"> </w:t>
@@ -189,19 +134,7 @@
         <w:t xml:space="preserve"> </w:t>
       </w:r>
       <w:r>
-        <w:t xml:space="preserve">is uncovered.</w:t>
-      </w:r>
-      <w:r>
-        <w:t xml:space="preserve"> </w:t>
-      </w:r>
-      <w:r>
-        <w:t xml:space="preserve">Perhaps paradoxically, history is not static.</w:t>
-      </w:r>
-      <w:r>
-        <w:t xml:space="preserve"> </w:t>
-      </w:r>
-      <w:r>
-        <w:t xml:space="preserve">History is always undergoing reexamination and reconsideration as new facts or perspectives arise.</w:t>
+        <w:t xml:space="preserve">are uncovered.</w:t>
       </w:r>
       <w:r>
         <w:t xml:space="preserve"> </w:t>
@@ -210,7 +143,7 @@
         <w:t xml:space="preserve">This is one such tale.</w:t>
       </w:r>
     </w:p>
-    <w:bookmarkStart w:id="33" w:name="how-i-got-here"/>
+    <w:bookmarkStart w:id="29" w:name="how-i-got-here"/>
     <w:p>
       <w:pPr>
         <w:pStyle w:val="Heading2"/>
@@ -253,7 +186,7 @@
       <w:r>
         <w:t xml:space="preserve"> </w:t>
       </w:r>
-      <w:hyperlink r:id="rId13">
+      <w:hyperlink r:id="rId9">
         <w:r>
           <w:rPr>
             <w:rStyle w:val="Hyperlink"/>
@@ -280,7 +213,7 @@
       <w:tr>
         <w:tc>
           <w:tcPr/>
-          <w:bookmarkStart w:id="17" w:name="fig-1628-letter"/>
+          <w:bookmarkStart w:id="13" w:name="fig-1628-letter"/>
           <w:p>
             <w:pPr>
               <w:pStyle w:val="Compact"/>
@@ -291,18 +224,18 @@
                 <wp:inline>
                   <wp:extent cx="5334000" cy="1656129"/>
                   <wp:effectExtent b="0" l="0" r="0" t="0"/>
-                  <wp:docPr descr="" title="" id="15" name="Picture"/>
+                  <wp:docPr descr="" title="" id="11" name="Picture"/>
                   <a:graphic>
                     <a:graphicData uri="http://schemas.openxmlformats.org/drawingml/2006/picture">
                       <pic:pic>
                         <pic:nvPicPr>
-                          <pic:cNvPr descr="images/vanLangren1628-graph.jpg" id="16" name="Picture"/>
+                          <pic:cNvPr descr="images/vanLangren1628-graph.jpg" id="12" name="Picture"/>
                           <pic:cNvPicPr>
                             <a:picLocks noChangeArrowheads="1" noChangeAspect="1"/>
                           </pic:cNvPicPr>
                         </pic:nvPicPr>
                         <pic:blipFill>
-                          <a:blip r:embed="rId14"/>
+                          <a:blip r:embed="rId10"/>
                           <a:stretch>
                             <a:fillRect/>
                           </a:stretch>
@@ -342,7 +275,7 @@
               <w:t xml:space="preserve">Figure 1: The graph from the undated 1628 letter: seven authorities’ estimates of the longitude difference between Toledo and Rome, plotted against a scale of degrees.</w:t>
             </w:r>
           </w:p>
-          <w:bookmarkEnd w:id="17"/>
+          <w:bookmarkEnd w:id="13"/>
         </w:tc>
       </w:tr>
     </w:tbl>
@@ -369,7 +302,7 @@
       <w:r>
         <w:t xml:space="preserve"> </w:t>
       </w:r>
-      <w:hyperlink r:id="rId18">
+      <w:hyperlink r:id="rId14">
         <w:r>
           <w:rPr>
             <w:rStyle w:val="Hyperlink"/>
@@ -506,7 +439,7 @@
         <w:rPr>
           <w:rStyle w:val="FootnoteReference"/>
         </w:rPr>
-        <w:footnoteReference w:id="19"/>
+        <w:footnoteReference w:id="15"/>
       </w:r>
       <w:r>
         <w:t xml:space="preserve"> </w:t>
@@ -598,7 +531,7 @@
       <w:tr>
         <w:tc>
           <w:tcPr/>
-          <w:bookmarkStart w:id="23" w:name="fig-1644-overlay"/>
+          <w:bookmarkStart w:id="19" w:name="fig-1644-overlay"/>
           <w:p>
             <w:pPr>
               <w:pStyle w:val="Compact"/>
@@ -609,18 +542,18 @@
                 <wp:inline>
                   <wp:extent cx="5334000" cy="1067954"/>
                   <wp:effectExtent b="0" l="0" r="0" t="0"/>
-                  <wp:docPr descr="" title="" id="21" name="Picture"/>
+                  <wp:docPr descr="" title="" id="17" name="Picture"/>
                   <a:graphic>
                     <a:graphicData uri="http://schemas.openxmlformats.org/drawingml/2006/picture">
                       <pic:pic>
                         <pic:nvPicPr>
-                          <pic:cNvPr descr="images/Langren1644-overlay.jpg" id="22" name="Picture"/>
+                          <pic:cNvPr descr="images/Langren1644-overlay.jpg" id="18" name="Picture"/>
                           <pic:cNvPicPr>
                             <a:picLocks noChangeArrowheads="1" noChangeAspect="1"/>
                           </pic:cNvPicPr>
                         </pic:nvPicPr>
                         <pic:blipFill>
-                          <a:blip r:embed="rId20"/>
+                          <a:blip r:embed="rId16"/>
                           <a:stretch>
                             <a:fillRect/>
                           </a:stretch>
@@ -660,7 +593,7 @@
               <w:t xml:space="preserve">Figure 2: van Langren’s 1644 graph showing 12 estimates of the longitude distance from Toledo to Rome by eminent astronomers, overlaid on a modern map</w:t>
             </w:r>
           </w:p>
-          <w:bookmarkEnd w:id="23"/>
+          <w:bookmarkEnd w:id="19"/>
         </w:tc>
       </w:tr>
     </w:tbl>
@@ -719,7 +652,7 @@
       <w:r>
         <w:t xml:space="preserve"> </w:t>
       </w:r>
-      <w:hyperlink r:id="rId24">
+      <w:hyperlink r:id="rId20">
         <w:r>
           <w:rPr>
             <w:rStyle w:val="Hyperlink"/>
@@ -756,7 +689,7 @@
       <w:r>
         <w:t xml:space="preserve"> </w:t>
       </w:r>
-      <w:hyperlink r:id="rId25">
+      <w:hyperlink r:id="rId21">
         <w:r>
           <w:rPr>
             <w:rStyle w:val="Hyperlink"/>
@@ -789,7 +722,7 @@
       <w:tr>
         <w:tc>
           <w:tcPr/>
-          <w:bookmarkStart w:id="29" w:name="fig-cipher-page"/>
+          <w:bookmarkStart w:id="25" w:name="fig-cipher-page"/>
           <w:p>
             <w:pPr>
               <w:pStyle w:val="Compact"/>
@@ -800,18 +733,18 @@
                 <wp:inline>
                   <wp:extent cx="4267200" cy="2120302"/>
                   <wp:effectExtent b="0" l="0" r="0" t="0"/>
-                  <wp:docPr descr="" title="" id="27" name="Picture"/>
+                  <wp:docPr descr="" title="" id="23" name="Picture"/>
                   <a:graphic>
                     <a:graphicData uri="http://schemas.openxmlformats.org/drawingml/2006/picture">
                       <pic:pic>
                         <pic:nvPicPr>
-                          <pic:cNvPr descr="images/verdadera-cipher.jpg" id="28" name="Picture"/>
+                          <pic:cNvPr descr="images/verdadera-cipher.jpg" id="24" name="Picture"/>
                           <pic:cNvPicPr>
                             <a:picLocks noChangeArrowheads="1" noChangeAspect="1"/>
                           </pic:cNvPicPr>
                         </pic:nvPicPr>
                         <pic:blipFill>
-                          <a:blip r:embed="rId26"/>
+                          <a:blip r:embed="rId22"/>
                           <a:stretch>
                             <a:fillRect/>
                           </a:stretch>
@@ -867,7 +800,7 @@
               <w:t xml:space="preserve">(1644): the printed cipher, exactly as van Langren’s readers first saw it.</w:t>
             </w:r>
           </w:p>
-          <w:bookmarkEnd w:id="29"/>
+          <w:bookmarkEnd w:id="25"/>
         </w:tc>
       </w:tr>
     </w:tbl>
@@ -881,7 +814,7 @@
       <w:r>
         <w:t xml:space="preserve"> </w:t>
       </w:r>
-      <w:hyperlink r:id="rId30">
+      <w:hyperlink r:id="rId26">
         <w:r>
           <w:rPr>
             <w:rStyle w:val="Hyperlink"/>
@@ -890,7 +823,7 @@
         </w:r>
       </w:hyperlink>
       <w:r>
-        <w:t xml:space="preserve">—the thing that stumped everyone, including me:</w:t>
+        <w:t xml:space="preserve">—a text file of 17 lines of cipher, the thing that stumped everyone, including me:</w:t>
       </w:r>
     </w:p>
     <w:p>
@@ -954,7 +887,7 @@
         <w:pStyle w:val="FirstParagraph"/>
       </w:pPr>
       <w:r>
-        <w:t xml:space="preserve">Two hundred and four of those space-separated groups, every one of them four to eight characters long, no group repeating often enough to be a common word in any language. Take a minute and look at it before reading on—this is exactly what stared back at van Langren’s readers for 376 years.</w:t>
+        <w:t xml:space="preserve">It contains 204 of those space-separated groups, nearly all of them four to eight characters long, no group repeating often enough to be a common word in any language. Take a minute and look at it before reading on—this is exactly what stared back at van Langren’s readers for 376 years.</w:t>
       </w:r>
     </w:p>
     <w:p>
@@ -967,7 +900,7 @@
       <w:r>
         <w:t xml:space="preserve"> </w:t>
       </w:r>
-      <w:hyperlink r:id="rId31">
+      <w:hyperlink r:id="rId27">
         <w:r>
           <w:rPr>
             <w:rStyle w:val="Hyperlink"/>
@@ -989,7 +922,7 @@
       <w:r>
         <w:t xml:space="preserve"> </w:t>
       </w:r>
-      <w:hyperlink r:id="rId32">
+      <w:hyperlink r:id="rId28">
         <w:r>
           <w:rPr>
             <w:rStyle w:val="Hyperlink"/>
@@ -1004,8 +937,8 @@
         <w:t xml:space="preserve">which provided data for computing the position of the Sun, Moon and planets relative to the fixed stars. It also made a good (his)story back then. But, alas, it was also wrong.</w:t>
       </w:r>
     </w:p>
-    <w:bookmarkEnd w:id="33"/>
-    <w:bookmarkStart w:id="34" w:name="the-problem-of-longitude"/>
+    <w:bookmarkEnd w:id="29"/>
+    <w:bookmarkStart w:id="30" w:name="the-problem-of-longitude"/>
     <w:p>
       <w:pPr>
         <w:pStyle w:val="Heading2"/>
@@ -1446,8 +1379,8 @@
         <w:t xml:space="preserve">method nor a mechanical clock. It was a water clock.</w:t>
       </w:r>
     </w:p>
-    <w:bookmarkEnd w:id="34"/>
-    <w:bookmarkStart w:id="49" w:name="the-cipher-falls"/>
+    <w:bookmarkEnd w:id="30"/>
+    <w:bookmarkStart w:id="45" w:name="the-cipher-falls"/>
     <w:p>
       <w:pPr>
         <w:pStyle w:val="Heading2"/>
@@ -1474,7 +1407,7 @@
       <w:r>
         <w:t xml:space="preserve"> </w:t>
       </w:r>
-      <w:hyperlink r:id="rId35">
+      <w:hyperlink r:id="rId31">
         <w:r>
           <w:rPr>
             <w:rStyle w:val="Hyperlink"/>
@@ -1490,7 +1423,7 @@
       <w:r>
         <w:t xml:space="preserve"> </w:t>
       </w:r>
-      <w:hyperlink r:id="rId36">
+      <w:hyperlink r:id="rId32">
         <w:r>
           <w:rPr>
             <w:rStyle w:val="Hyperlink"/>
@@ -1512,7 +1445,7 @@
       <w:r>
         <w:t xml:space="preserve"> </w:t>
       </w:r>
-      <w:hyperlink r:id="rId37">
+      <w:hyperlink r:id="rId33">
         <w:r>
           <w:rPr>
             <w:rStyle w:val="Hyperlink"/>
@@ -1524,7 +1457,7 @@
         <w:rPr>
           <w:rStyle w:val="FootnoteReference"/>
         </w:rPr>
-        <w:footnoteReference w:id="38"/>
+        <w:footnoteReference w:id="34"/>
       </w:r>
       <w:r>
         <w:t xml:space="preserve">, a 340-character code unsolved for 51 years. Huylebrouck read the news, tracked down Van Eycke, and handed him the</w:t>
@@ -1597,7 +1530,7 @@
       <w:r>
         <w:t xml:space="preserve"> </w:t>
       </w:r>
-      <w:hyperlink r:id="rId39">
+      <w:hyperlink r:id="rId35">
         <w:r>
           <w:rPr>
             <w:rStyle w:val="Hyperlink"/>
@@ -1624,7 +1557,7 @@
         <w:rPr>
           <w:rStyle w:val="FootnoteReference"/>
         </w:rPr>
-        <w:footnoteReference w:id="40"/>
+        <w:footnoteReference w:id="36"/>
       </w:r>
       <w:r>
         <w:t xml:space="preserve">. He found that the capital letters scattered through the text were pure decoys—meaningless once removed.</w:t>
@@ -1676,7 +1609,7 @@
       <w:r>
         <w:t xml:space="preserve"> </w:t>
       </w:r>
-      <w:hyperlink r:id="rId42">
+      <w:hyperlink r:id="rId38">
         <w:r>
           <w:rPr>
             <w:rStyle w:val="Hyperlink"/>
@@ -1726,7 +1659,7 @@
         <w:t xml:space="preserve">Van Eycke sent him by email—not a verbatim quote, and not self-published. With that caveat, here’s what happens when you run Van Eycke’s described steps against the actual ciphertext from our 2010 supplementary materials.</w:t>
       </w:r>
     </w:p>
-    <w:bookmarkStart w:id="43" w:name="step-1-the-words-are-a-decoy"/>
+    <w:bookmarkStart w:id="39" w:name="step-1-the-words-are-a-decoy"/>
     <w:p>
       <w:pPr>
         <w:pStyle w:val="Heading3"/>
@@ -2266,8 +2199,8 @@
         </w:tc>
       </w:tr>
     </w:tbl>
-    <w:bookmarkEnd w:id="43"/>
-    <w:bookmarkStart w:id="45" w:name="step-2-strip-spaces-and-decoy-capitals"/>
+    <w:bookmarkEnd w:id="39"/>
+    <w:bookmarkStart w:id="41" w:name="step-2-strip-spaces-and-decoy-capitals"/>
     <w:p>
       <w:pPr>
         <w:pStyle w:val="Heading3"/>
@@ -2319,7 +2252,7 @@
         <w:rPr>
           <w:rStyle w:val="FootnoteReference"/>
         </w:rPr>
-        <w:footnoteReference w:id="44"/>
+        <w:footnoteReference w:id="40"/>
       </w:r>
       <w:r>
         <w:t xml:space="preserve"> </w:t>
@@ -2328,8 +2261,8 @@
         <w:t xml:space="preserve">Deleting these leaves a single unbroken run of 987 lowercase letters, long-s (ſ) characters, and digits.</w:t>
       </w:r>
     </w:p>
-    <w:bookmarkEnd w:id="45"/>
-    <w:bookmarkStart w:id="46" w:name="Xf4252676e6dfa0fda2e27468b9cdc9528dee206"/>
+    <w:bookmarkEnd w:id="41"/>
+    <w:bookmarkStart w:id="42" w:name="Xf4252676e6dfa0fda2e27468b9cdc9528dee206"/>
     <w:p>
       <w:pPr>
         <w:pStyle w:val="Heading3"/>
@@ -2346,8 +2279,8 @@
         <w:t xml:space="preserve">Taking every third character—positions 1, 4, 7, …—out of that run still isn’t readable, but the letter patterns already look far more like language than the raw ciphertext did.</w:t>
       </w:r>
     </w:p>
-    <w:bookmarkEnd w:id="46"/>
-    <w:bookmarkStart w:id="48" w:name="step-4-undo-the-digit-substitution"/>
+    <w:bookmarkEnd w:id="42"/>
+    <w:bookmarkStart w:id="44" w:name="step-4-undo-the-digit-substitution"/>
     <w:p>
       <w:pPr>
         <w:pStyle w:val="Heading3"/>
@@ -2516,7 +2449,7 @@
       <w:r>
         <w:t xml:space="preserve"> </w:t>
       </w:r>
-      <w:hyperlink r:id="rId47">
+      <w:hyperlink r:id="rId43">
         <w:r>
           <w:rPr>
             <w:rStyle w:val="VerbatimChar"/>
@@ -2528,9 +2461,9 @@
         <w:t xml:space="preserve">.</w:t>
       </w:r>
     </w:p>
-    <w:bookmarkEnd w:id="48"/>
-    <w:bookmarkEnd w:id="49"/>
-    <w:bookmarkStart w:id="62" w:name="what-van-langren-was-hiding"/>
+    <w:bookmarkEnd w:id="44"/>
+    <w:bookmarkEnd w:id="45"/>
+    <w:bookmarkStart w:id="58" w:name="what-van-langren-was-hiding"/>
     <w:p>
       <w:pPr>
         <w:pStyle w:val="Heading2"/>
@@ -2644,7 +2577,7 @@
       <w:tr>
         <w:tc>
           <w:tcPr/>
-          <w:bookmarkStart w:id="53" w:name="fig-waterclock"/>
+          <w:bookmarkStart w:id="49" w:name="fig-waterclock"/>
           <w:p>
             <w:pPr>
               <w:pStyle w:val="Compact"/>
@@ -2655,18 +2588,18 @@
                 <wp:inline>
                   <wp:extent cx="4267200" cy="2726266"/>
                   <wp:effectExtent b="0" l="0" r="0" t="0"/>
-                  <wp:docPr descr="" title="" id="51" name="Picture"/>
+                  <wp:docPr descr="" title="" id="47" name="Picture"/>
                   <a:graphic>
                     <a:graphicData uri="http://schemas.openxmlformats.org/drawingml/2006/picture">
                       <pic:pic>
                         <pic:nvPicPr>
-                          <pic:cNvPr descr="images/vanlangren-waterclock.png" id="52" name="Picture"/>
+                          <pic:cNvPr descr="images/vanlangren-waterclock.png" id="48" name="Picture"/>
                           <pic:cNvPicPr>
                             <a:picLocks noChangeArrowheads="1" noChangeAspect="1"/>
                           </pic:cNvPicPr>
                         </pic:nvPicPr>
                         <pic:blipFill>
-                          <a:blip r:embed="rId50"/>
+                          <a:blip r:embed="rId46"/>
                           <a:stretch>
                             <a:fillRect/>
                           </a:stretch>
@@ -2706,7 +2639,7 @@
               <w:t xml:space="preserve">Figure 4: How van Langren’s water-clock method was meant to determine longitude at sea.</w:t>
             </w:r>
           </w:p>
-          <w:bookmarkEnd w:id="53"/>
+          <w:bookmarkEnd w:id="49"/>
         </w:tc>
       </w:tr>
     </w:tbl>
@@ -2723,7 +2656,7 @@
       <w:tr>
         <w:tc>
           <w:tcPr/>
-          <w:bookmarkStart w:id="58" w:name="fig-harrison"/>
+          <w:bookmarkStart w:id="54" w:name="fig-harrison"/>
           <w:p>
             <w:pPr>
               <w:pStyle w:val="Compact"/>
@@ -2734,18 +2667,18 @@
                 <wp:inline>
                   <wp:extent cx="1270000" cy="1493520"/>
                   <wp:effectExtent b="0" l="0" r="0" t="0"/>
-                  <wp:docPr descr="" title="" id="55" name="Picture"/>
+                  <wp:docPr descr="" title="" id="51" name="Picture"/>
                   <a:graphic>
                     <a:graphicData uri="http://schemas.openxmlformats.org/drawingml/2006/picture">
                       <pic:pic>
                         <pic:nvPicPr>
-                          <pic:cNvPr descr="images/Harrison-H1_low_250.jpg" id="56" name="Picture"/>
+                          <pic:cNvPr descr="images/Harrison-H1_low_250.jpg" id="52" name="Picture"/>
                           <pic:cNvPicPr>
                             <a:picLocks noChangeArrowheads="1" noChangeAspect="1"/>
                           </pic:cNvPicPr>
                         </pic:nvPicPr>
                         <pic:blipFill>
-                          <a:blip r:embed="rId54"/>
+                          <a:blip r:embed="rId50"/>
                           <a:stretch>
                             <a:fillRect/>
                           </a:stretch>
@@ -2787,7 +2720,7 @@
             <w:r>
               <w:t xml:space="preserve"> </w:t>
             </w:r>
-            <w:hyperlink r:id="rId57">
+            <w:hyperlink r:id="rId53">
               <w:r>
                 <w:rPr>
                   <w:rStyle w:val="Hyperlink"/>
@@ -2799,7 +2732,7 @@
               <w:t xml:space="preserve">.</w:t>
             </w:r>
           </w:p>
-          <w:bookmarkEnd w:id="58"/>
+          <w:bookmarkEnd w:id="54"/>
         </w:tc>
       </w:tr>
     </w:tbl>
@@ -2813,7 +2746,7 @@
       <w:r>
         <w:t xml:space="preserve"> </w:t>
       </w:r>
-      <w:hyperlink r:id="rId59">
+      <w:hyperlink r:id="rId55">
         <w:r>
           <w:rPr>
             <w:rStyle w:val="Hyperlink"/>
@@ -2827,7 +2760,7 @@
       <w:r>
         <w:t xml:space="preserve"> </w:t>
       </w:r>
-      <w:hyperlink r:id="rId60">
+      <w:hyperlink r:id="rId56">
         <w:r>
           <w:rPr>
             <w:rStyle w:val="Hyperlink"/>
@@ -2852,7 +2785,7 @@
       <w:r>
         <w:t xml:space="preserve"> </w:t>
       </w:r>
-      <w:hyperlink r:id="rId61">
+      <w:hyperlink r:id="rId57">
         <w:r>
           <w:rPr>
             <w:rStyle w:val="Hyperlink"/>
@@ -2864,14 +2797,14 @@
         <w:t xml:space="preserve">, more than a century. He wasn’t naive. He was reaching for the best tool of his moment to solve a problem no tool of his era could actually solve.</w:t>
       </w:r>
     </w:p>
-    <w:bookmarkEnd w:id="62"/>
-    <w:bookmarkStart w:id="63" w:name="every-cipher-tells-a-story"/>
+    <w:bookmarkEnd w:id="58"/>
+    <w:bookmarkStart w:id="78" w:name="bonus-reproducing-langrens-1644-graph"/>
     <w:p>
       <w:pPr>
         <w:pStyle w:val="Heading2"/>
       </w:pPr>
       <w:r>
-        <w:t xml:space="preserve">Every Cipher Tells a Story</w:t>
+        <w:t xml:space="preserve">Bonus: Reproducing Langren’s 1644 Graph</w:t>
       </w:r>
     </w:p>
     <w:p>
@@ -2879,45 +2812,6 @@
         <w:pStyle w:val="FirstParagraph"/>
       </w:pPr>
       <w:r>
-        <w:t xml:space="preserve">I keep coming back to the epigraph we used to open the 2010 paper, borrowed a little irreverently from Rod Stewart:</w:t>
-      </w:r>
-      <w:r>
-        <w:t xml:space="preserve"> </w:t>
-      </w:r>
-      <w:r>
-        <w:rPr>
-          <w:i/>
-          <w:iCs/>
-        </w:rPr>
-        <w:t xml:space="preserve">every picture tells a story</w:t>
-      </w:r>
-      <w:r>
-        <w:t xml:space="preserve">. It turns out the same is true of every cipher, and this one told two stories at once. The first is about van Langren himself—a man who staked years of court patronage on a secret that turned out to be an old idea applied to an impossible environment; and one who is, with some justice, remembered instead for the achievement he didn’t encrypt: the first comprehensive map of the moon.</w:t>
-      </w:r>
-    </w:p>
-    <w:p>
-      <w:pPr>
-        <w:pStyle w:val="BodyText"/>
-      </w:pPr>
-      <w:r>
-        <w:t xml:space="preserve">The second story is about the people who finally read it. Not a professional historian of science, not a specialist in seventeenth-century cryptography, but a chain of amateurs and one extraordinarily talented codebreaker: an astronomy hobbyist who wouldn’t let the puzzle drop, a mathematician who spent a decade asking strangers on forums for help, and a warehouse worker in Flanders who had, a few weeks earlier, helped unmask a serial killer. Joaquín’s ancestor’s papers gave us the graph’s true origin in 2009. Jarl Van Eycke’s week of work gave us, in 2021, the thing van Langren had been most careful to hide, and the thing I, writing about him in the years between, was never able to find.</w:t>
-      </w:r>
-    </w:p>
-    <w:bookmarkEnd w:id="63"/>
-    <w:bookmarkStart w:id="83" w:name="bonus-reproducing-langrens-1644-graph"/>
-    <w:p>
-      <w:pPr>
-        <w:pStyle w:val="Heading2"/>
-      </w:pPr>
-      <w:r>
-        <w:t xml:space="preserve">Bonus: Reproducing Langren’s 1644 Graph</w:t>
-      </w:r>
-    </w:p>
-    <w:p>
-      <w:pPr>
-        <w:pStyle w:val="FirstParagraph"/>
-      </w:pPr>
-      <w:r>
         <w:t xml:space="preserve">Reproducing a historical graph with modern tools is not just technical imitation.</w:t>
       </w:r>
       <w:r>
@@ -2929,7 +2823,7 @@
       <w:r>
         <w:t xml:space="preserve"> </w:t>
       </w:r>
-      <w:hyperlink r:id="rId64">
+      <w:hyperlink r:id="rId59">
         <w:r>
           <w:rPr>
             <w:rStyle w:val="Hyperlink"/>
@@ -3150,7 +3044,7 @@
       <w:r>
         <w:t xml:space="preserve"> </w:t>
       </w:r>
-      <w:hyperlink r:id="rId65">
+      <w:hyperlink r:id="rId60">
         <w:r>
           <w:rPr>
             <w:rStyle w:val="Hyperlink"/>
@@ -3167,7 +3061,7 @@
       <w:r>
         <w:t xml:space="preserve"> </w:t>
       </w:r>
-      <w:hyperlink r:id="rId66">
+      <w:hyperlink r:id="rId61">
         <w:r>
           <w:rPr>
             <w:rStyle w:val="Hyperlink"/>
@@ -3187,7 +3081,7 @@
       <w:r>
         <w:t xml:space="preserve"> </w:t>
       </w:r>
-      <w:hyperlink r:id="rId67">
+      <w:hyperlink r:id="rId62">
         <w:r>
           <w:rPr>
             <w:rStyle w:val="VerbatimChar"/>
@@ -3212,7 +3106,7 @@
       <w:tr>
         <w:tc>
           <w:tcPr/>
-          <w:bookmarkStart w:id="71" w:name="fig-overlay"/>
+          <w:bookmarkStart w:id="66" w:name="fig-overlay"/>
           <w:p>
             <w:pPr>
               <w:pStyle w:val="Compact"/>
@@ -3223,18 +3117,18 @@
                 <wp:inline>
                   <wp:extent cx="4620126" cy="914400"/>
                   <wp:effectExtent b="0" l="0" r="0" t="0"/>
-                  <wp:docPr descr="" title="" id="69" name="Picture"/>
+                  <wp:docPr descr="" title="" id="64" name="Picture"/>
                   <a:graphic>
                     <a:graphicData uri="http://schemas.openxmlformats.org/drawingml/2006/picture">
                       <pic:pic>
                         <pic:nvPicPr>
-                          <pic:cNvPr descr="vanLangren-Secret_files/figure-docx/fig-overlay-1.png" id="70" name="Picture"/>
+                          <pic:cNvPr descr="vanLangren-Secret_files/figure-docx/fig-overlay-1.png" id="65" name="Picture"/>
                           <pic:cNvPicPr>
                             <a:picLocks noChangeArrowheads="1" noChangeAspect="1"/>
                           </pic:cNvPicPr>
                         </pic:nvPicPr>
                         <pic:blipFill>
-                          <a:blip r:embed="rId68"/>
+                          <a:blip r:embed="rId63"/>
                           <a:stretch>
                             <a:fillRect/>
                           </a:stretch>
@@ -3274,7 +3168,7 @@
               <w:t xml:space="preserve">Figure 6: van Langren’s 1644 estimates, rebuilt layer by layer as an overlay on a modern map.</w:t>
             </w:r>
           </w:p>
-          <w:bookmarkEnd w:id="71"/>
+          <w:bookmarkEnd w:id="66"/>
         </w:tc>
       </w:tr>
     </w:tbl>
@@ -3298,7 +3192,7 @@
         <w:t xml:space="preserve">someone (him) deserved a reward for having a better one.</w:t>
       </w:r>
     </w:p>
-    <w:bookmarkStart w:id="82" w:name="i-did-that-better-by-hand"/>
+    <w:bookmarkStart w:id="77" w:name="i-did-that-better-by-hand"/>
     <w:p>
       <w:pPr>
         <w:pStyle w:val="Heading3"/>
@@ -3433,7 +3327,7 @@
       <w:tr>
         <w:tc>
           <w:tcPr/>
-          <w:bookmarkStart w:id="75" w:name="fig-1644-original"/>
+          <w:bookmarkStart w:id="70" w:name="fig-1644-original"/>
           <w:p>
             <w:pPr>
               <w:pStyle w:val="Compact"/>
@@ -3444,18 +3338,18 @@
                 <wp:inline>
                   <wp:extent cx="5334000" cy="1349828"/>
                   <wp:effectExtent b="0" l="0" r="0" t="0"/>
-                  <wp:docPr descr="" title="" id="73" name="Picture"/>
+                  <wp:docPr descr="" title="" id="68" name="Picture"/>
                   <a:graphic>
                     <a:graphicData uri="http://schemas.openxmlformats.org/drawingml/2006/picture">
                       <pic:pic>
                         <pic:nvPicPr>
-                          <pic:cNvPr descr="images/Langren1644.jpg" id="74" name="Picture"/>
+                          <pic:cNvPr descr="images/Langren1644.jpg" id="69" name="Picture"/>
                           <pic:cNvPicPr>
                             <a:picLocks noChangeArrowheads="1" noChangeAspect="1"/>
                           </pic:cNvPicPr>
                         </pic:nvPicPr>
                         <pic:blipFill>
-                          <a:blip r:embed="rId72"/>
+                          <a:blip r:embed="rId67"/>
                           <a:stretch>
                             <a:fillRect/>
                           </a:stretch>
@@ -3495,7 +3389,7 @@
               <w:t xml:space="preserve">Figure 7: Van Langren’s original 1644 graph</w:t>
             </w:r>
           </w:p>
-          <w:bookmarkEnd w:id="75"/>
+          <w:bookmarkEnd w:id="70"/>
         </w:tc>
       </w:tr>
     </w:tbl>
@@ -3834,7 +3728,7 @@
       <w:r>
         <w:t xml:space="preserve"> </w:t>
       </w:r>
-      <w:hyperlink r:id="rId76">
+      <w:hyperlink r:id="rId71">
         <w:r>
           <w:rPr>
             <w:rStyle w:val="VerbatimChar"/>
@@ -3870,7 +3764,7 @@
       <w:tr>
         <w:tc>
           <w:tcPr/>
-          <w:bookmarkStart w:id="80" w:name="fig-reconstruction"/>
+          <w:bookmarkStart w:id="75" w:name="fig-reconstruction"/>
           <w:p>
             <w:pPr>
               <w:pStyle w:val="Compact"/>
@@ -3881,18 +3775,18 @@
                 <wp:inline>
                   <wp:extent cx="5334000" cy="1143000"/>
                   <wp:effectExtent b="0" l="0" r="0" t="0"/>
-                  <wp:docPr descr="" title="" id="78" name="Picture"/>
+                  <wp:docPr descr="" title="" id="73" name="Picture"/>
                   <a:graphic>
                     <a:graphicData uri="http://schemas.openxmlformats.org/drawingml/2006/picture">
                       <pic:pic>
                         <pic:nvPicPr>
-                          <pic:cNvPr descr="vanLangren-Secret_files/figure-docx/fig-reconstruction-1.png" id="79" name="Picture"/>
+                          <pic:cNvPr descr="vanLangren-Secret_files/figure-docx/fig-reconstruction-1.png" id="74" name="Picture"/>
                           <pic:cNvPicPr>
                             <a:picLocks noChangeArrowheads="1" noChangeAspect="1"/>
                           </pic:cNvPicPr>
                         </pic:nvPicPr>
                         <pic:blipFill>
-                          <a:blip r:embed="rId77"/>
+                          <a:blip r:embed="rId72"/>
                           <a:stretch>
                             <a:fillRect/>
                           </a:stretch>
@@ -3932,7 +3826,7 @@
               <w:t xml:space="preserve">Figure 8: A ggplot2 reconstruction of van Langren’s 1644 graph.</w:t>
             </w:r>
           </w:p>
-          <w:bookmarkEnd w:id="80"/>
+          <w:bookmarkEnd w:id="75"/>
         </w:tc>
       </w:tr>
     </w:tbl>
@@ -3991,7 +3885,7 @@
       <w:r>
         <w:t xml:space="preserve"> </w:t>
       </w:r>
-      <w:hyperlink r:id="rId81">
+      <w:hyperlink r:id="rId76">
         <w:r>
           <w:rPr>
             <w:rStyle w:val="Hyperlink"/>
@@ -4035,15 +3929,15 @@
         <w:t xml:space="preserve">true answer of 16°31’.</w:t>
       </w:r>
     </w:p>
-    <w:bookmarkEnd w:id="82"/>
-    <w:bookmarkEnd w:id="83"/>
-    <w:bookmarkStart w:id="88" w:name="coda"/>
+    <w:bookmarkEnd w:id="77"/>
+    <w:bookmarkEnd w:id="78"/>
+    <w:bookmarkStart w:id="85" w:name="every-cipher-tells-a-story"/>
     <w:p>
       <w:pPr>
         <w:pStyle w:val="Heading2"/>
       </w:pPr>
       <w:r>
-        <w:t xml:space="preserve">Coda</w:t>
+        <w:t xml:space="preserve">Every Cipher Tells a Story</w:t>
       </w:r>
     </w:p>
     <w:p>
@@ -4051,15 +3945,7 @@
         <w:pStyle w:val="FirstParagraph"/>
       </w:pPr>
       <w:r>
-        <w:t xml:space="preserve">Van Langren hid his method and published his graph in letters to the King. History can now remember it the right way around.</w:t>
-      </w:r>
-    </w:p>
-    <w:p>
-      <w:pPr>
-        <w:pStyle w:val="BodyText"/>
-      </w:pPr>
-      <w:r>
-        <w:t xml:space="preserve">The cipher protected an idea that the technology of the seventeenth century made unsuitable—copper cones that couldn’t hold time steady on a heaving ship. His method was guarded for nearly four centuries by an ingenious three-layer scramble. The graph, printed openly on the same page, showed only the</w:t>
+        <w:t xml:space="preserve">We opened the 2010 paper with an epigraph borrowed, a little irreverently, from Rod Stewart:</w:t>
       </w:r>
       <w:r>
         <w:t xml:space="preserve"> </w:t>
@@ -4069,13 +3955,10 @@
           <w:i/>
           <w:iCs/>
         </w:rPr>
-        <w:t xml:space="preserve">problem</w:t>
-      </w:r>
-      <w:r>
-        <w:t xml:space="preserve"> </w:t>
-      </w:r>
-      <w:r>
-        <w:t xml:space="preserve">he claimed to solve.</w:t>
+        <w:t xml:space="preserve">every picture tells a story</w:t>
+      </w:r>
+      <w:r>
+        <w:t xml:space="preserve">. So, it turns out, does every cipher, and this one told two.</w:t>
       </w:r>
     </w:p>
     <w:p>
@@ -4083,19 +3966,7 @@
         <w:pStyle w:val="BodyText"/>
       </w:pPr>
       <w:r>
-        <w:t xml:space="preserve">That graph is the earliest known statistical graph, which was exactly the right tool for communicating</w:t>
-      </w:r>
-      <w:r>
-        <w:t xml:space="preserve"> </w:t>
-      </w:r>
-      <w:r>
-        <w:t xml:space="preserve">the nature of the problem.</w:t>
-      </w:r>
-      <w:r>
-        <w:t xml:space="preserve"> </w:t>
-      </w:r>
-      <w:r>
-        <w:t xml:space="preserve">The cipher, finally decoded, shows a man who understood the longitude problem deeply enough to devise a plausible solution, but who was simply working with tools the task made impossible. His attempt was neither naive nor foolish; it was reasonable given the tools available. And, as he hid this in his code of</w:t>
+        <w:t xml:space="preserve">The first is about van Langren himself: a man who understood the longitude problem well enough to devise a plausible solution, but whose copper cones could never have held time steady on a heaving ship. His idea was neither naive nor foolish, and hiding it in</w:t>
       </w:r>
       <w:r>
         <w:t xml:space="preserve"> </w:t>
@@ -4104,27 +3975,10 @@
         <w:t xml:space="preserve">“dark letters”</w:t>
       </w:r>
       <w:r>
-        <w:t xml:space="preserve">, it was</w:t>
-      </w:r>
-      <w:r>
-        <w:t xml:space="preserve"> </w:t>
-      </w:r>
-      <w:r>
-        <w:t xml:space="preserve">a brilliant example of grantsmanship, to gain a royal patron.</w:t>
-      </w:r>
-      <w:r>
-        <w:t xml:space="preserve"> </w:t>
-      </w:r>
-      <w:r>
-        <w:t xml:space="preserve">Our mistake, to interpret the cipher as describing a lunar method, was equally reasonable given what we could read.</w:t>
-      </w:r>
-    </w:p>
-    <w:p>
-      <w:pPr>
-        <w:pStyle w:val="BodyText"/>
-      </w:pPr>
-      <w:r>
-        <w:t xml:space="preserve">What van Langren is actually remembered for, when he’s remembered at all, is his 1645</w:t>
+        <w:t xml:space="preserve"> </w:t>
+      </w:r>
+      <w:r>
+        <w:t xml:space="preserve">was a brilliant piece of grantsmanship. He is remembered instead for what he didn’t encrypt: the graph that made the</w:t>
       </w:r>
       <w:r>
         <w:t xml:space="preserve"> </w:t>
@@ -4134,13 +3988,13 @@
           <w:i/>
           <w:iCs/>
         </w:rPr>
-        <w:t xml:space="preserve">Selenographia</w:t>
-      </w:r>
-      <w:r>
-        <w:t xml:space="preserve"> </w:t>
-      </w:r>
-      <w:r>
-        <w:t xml:space="preserve">— the first detailed map of the moon, with craters named after European monarchs and scientists, strategic flattery disguising a petition. His longitude method failed, but the map endures, as does the name of the lunar crater</w:t>
+        <w:t xml:space="preserve">problem</w:t>
+      </w:r>
+      <w:r>
+        <w:t xml:space="preserve"> </w:t>
+      </w:r>
+      <w:r>
+        <w:t xml:space="preserve">visible, and his 1645 map of the moon, where the crater</w:t>
       </w:r>
       <w:r>
         <w:t xml:space="preserve"> </w:t>
@@ -4153,28 +4007,58 @@
         <w:t xml:space="preserve">Langrenus</w:t>
       </w:r>
       <w:r>
-        <w:t xml:space="preserve">, a prominent, 132-km-wide impact crater located near the eastern lunar limb on the shores of</w:t>
-      </w:r>
-      <w:r>
-        <w:t xml:space="preserve"> </w:t>
+        <w:t xml:space="preserve"> </w:t>
+      </w:r>
+      <w:r>
+        <w:t xml:space="preserve">still bears his name.</w:t>
+      </w:r>
+    </w:p>
+    <w:p>
+      <w:pPr>
+        <w:pStyle w:val="BodyText"/>
+      </w:pPr>
+      <w:r>
+        <w:t xml:space="preserve">The second is about time and what we can know. The cipher sat unread for 376 years, and our lunar interpretation of it sat unchallenged for a decade: reasonable given what we could read, and wrong. It took a chain of amateurs and one extraordinary codebreaker to set it right. History is not static; the answer to the historian’s question—</w:t>
       </w:r>
       <w:r>
         <w:rPr>
           <w:i/>
           <w:iCs/>
         </w:rPr>
-        <w:t xml:space="preserve">Mare Fecunditatis</w:t>
-      </w:r>
-      <w:r>
-        <w:t xml:space="preserve">.</w:t>
-      </w:r>
-    </w:p>
-    <w:p>
-      <w:pPr>
-        <w:pStyle w:val="BodyText"/>
-      </w:pPr>
-      <w:r>
-        <w:t xml:space="preserve">The answer to the question historians always ask—</w:t>
+        <w:t xml:space="preserve">what was he thinking?</w:t>
+      </w:r>
+      <w:r>
+        <w:t xml:space="preserve">—can change whenever new evidence turns up. Here it turned out to be: something clever, impractical, and beautifully encrypted.</w:t>
+      </w:r>
+    </w:p>
+    <w:p>
+      <w:pPr>
+        <w:pStyle w:val="PullQuote"/>
+      </w:pPr>
+      <w:r>
+        <w:t xml:space="preserve">The shock of finding our interpretation wrong is replaced, in the end, by a feeling of satisfaction in being able to right the ship of history.</w:t>
+      </w:r>
+    </w:p>
+    <w:bookmarkStart w:id="84" w:name="refs"/>
+    <w:bookmarkStart w:id="79" w:name="ref-Friendly:2006:hbook"/>
+    <w:p>
+      <w:pPr>
+        <w:pStyle w:val="Bibliography"/>
+      </w:pPr>
+      <w:r>
+        <w:t xml:space="preserve">Friendly, Michael. 2007.</w:t>
+      </w:r>
+      <w:r>
+        <w:t xml:space="preserve"> </w:t>
+      </w:r>
+      <w:r>
+        <w:t xml:space="preserve">“A Brief History of Data Visualization.”</w:t>
+      </w:r>
+      <w:r>
+        <w:t xml:space="preserve"> </w:t>
+      </w:r>
+      <w:r>
+        <w:t xml:space="preserve">Chap. 1 in</w:t>
       </w:r>
       <w:r>
         <w:t xml:space="preserve"> </w:t>
@@ -4184,43 +4068,23 @@
           <w:i/>
           <w:iCs/>
         </w:rPr>
-        <w:t xml:space="preserve">what was he thinking?</w:t>
-      </w:r>
-      <w:r>
-        <w:t xml:space="preserve"> </w:t>
-      </w:r>
-      <w:r>
-        <w:t xml:space="preserve">— turns out to be: something clever, impractical, and beautifully encrypted.</w:t>
-      </w:r>
-    </w:p>
-    <w:p>
-      <w:pPr>
-        <w:pStyle w:val="PullQuote"/>
-      </w:pPr>
-      <w:r>
-        <w:t xml:space="preserve">The shock of finding our interpretation wrong is replaced, in the end, by a feeling of satisfaction in being able to right the ship of history.</w:t>
-      </w:r>
-    </w:p>
-    <w:bookmarkStart w:id="87" w:name="refs"/>
-    <w:bookmarkStart w:id="84" w:name="ref-Friendly:2006:hbook"/>
+        <w:t xml:space="preserve">Handbook of Computational Statistics: Data Visualization</w:t>
+      </w:r>
+      <w:r>
+        <w:t xml:space="preserve">, edited by C. Chen, Wolfgang Härdle, and Antony Unwin, III. Springer-Verlag.</w:t>
+      </w:r>
+    </w:p>
+    <w:bookmarkEnd w:id="79"/>
+    <w:bookmarkStart w:id="81" w:name="ref-FriendlyChevaliers:2020"/>
     <w:p>
       <w:pPr>
         <w:pStyle w:val="Bibliography"/>
       </w:pPr>
       <w:r>
-        <w:t xml:space="preserve">Friendly, Michael. 2007.</w:t>
-      </w:r>
-      <w:r>
-        <w:t xml:space="preserve"> </w:t>
-      </w:r>
-      <w:r>
-        <w:t xml:space="preserve">“A Brief History of Data Visualization.”</w:t>
-      </w:r>
-      <w:r>
-        <w:t xml:space="preserve"> </w:t>
-      </w:r>
-      <w:r>
-        <w:t xml:space="preserve">Chap. 1 in</w:t>
+        <w:t xml:space="preserve">Friendly, Michael, and les Chevaliers</w:t>
+      </w:r>
+      <w:r>
+        <w:t xml:space="preserve">. 2020.</w:t>
       </w:r>
       <w:r>
         <w:t xml:space="preserve"> </w:t>
@@ -4230,14 +4094,28 @@
           <w:i/>
           <w:iCs/>
         </w:rPr>
-        <w:t xml:space="preserve">Handbook of Computational Statistics: Data Visualization</w:t>
-      </w:r>
-      <w:r>
-        <w:t xml:space="preserve">, edited by C. Chen, Wolfgang Härdle, and Antony Unwin, III. Springer-Verlag.</w:t>
-      </w:r>
-    </w:p>
-    <w:bookmarkEnd w:id="84"/>
-    <w:bookmarkStart w:id="86" w:name="ref-Friendly:2010:langren"/>
+        <w:t xml:space="preserve">Raiders of the Lost Tombs: The Search for Some Heroes of the History of Data Visualization</w:t>
+      </w:r>
+      <w:r>
+        <w:t xml:space="preserve">. Online.</w:t>
+      </w:r>
+      <w:r>
+        <w:t xml:space="preserve"> </w:t>
+      </w:r>
+      <w:hyperlink r:id="rId80">
+        <w:r>
+          <w:rPr>
+            <w:rStyle w:val="Hyperlink"/>
+          </w:rPr>
+          <w:t xml:space="preserve">https://medium.com/nightingale/raiders-of-the-lost-tombs-the-search-for-some-heroes-of-the-history-of-data-visualization-c4a4b4690d24</w:t>
+        </w:r>
+      </w:hyperlink>
+      <w:r>
+        <w:t xml:space="preserve">.</w:t>
+      </w:r>
+    </w:p>
+    <w:bookmarkEnd w:id="81"/>
+    <w:bookmarkStart w:id="83" w:name="ref-Friendly:2010:langren"/>
     <w:p>
       <w:pPr>
         <w:pStyle w:val="Bibliography"/>
@@ -4309,7 +4187,7 @@
       <w:r>
         <w:t xml:space="preserve"> </w:t>
       </w:r>
-      <w:hyperlink r:id="rId85">
+      <w:hyperlink r:id="rId82">
         <w:r>
           <w:rPr>
             <w:rStyle w:val="Hyperlink"/>
@@ -4321,9 +4199,9 @@
         <w:t xml:space="preserve">.</w:t>
       </w:r>
     </w:p>
-    <w:bookmarkEnd w:id="86"/>
-    <w:bookmarkEnd w:id="87"/>
-    <w:bookmarkEnd w:id="88"/>
+    <w:bookmarkEnd w:id="83"/>
+    <w:bookmarkEnd w:id="84"/>
+    <w:bookmarkEnd w:id="85"/>
     <w:sectPr/>
   </w:body>
 </w:document>
@@ -4349,7 +4227,7 @@
       </w:r>
     </w:p>
   </w:footnote>
-  <w:footnote w:id="19">
+  <w:footnote w:id="15">
     <w:p>
       <w:pPr>
         <w:pStyle w:val="FootnoteText"/>
@@ -4416,7 +4294,7 @@
       </w:r>
     </w:p>
   </w:footnote>
-  <w:footnote w:id="38">
+  <w:footnote w:id="34">
     <w:p>
       <w:pPr>
         <w:pStyle w:val="FootnoteText"/>
@@ -4453,7 +4331,7 @@
       </w:r>
     </w:p>
   </w:footnote>
-  <w:footnote w:id="40">
+  <w:footnote w:id="36">
     <w:p>
       <w:pPr>
         <w:pStyle w:val="FootnoteText"/>
@@ -4506,7 +4384,7 @@
       <w:r>
         <w:t xml:space="preserve"> </w:t>
       </w:r>
-      <w:hyperlink r:id="rId41">
+      <w:hyperlink r:id="rId37">
         <w:r>
           <w:rPr>
             <w:rStyle w:val="Hyperlink"/>
@@ -4524,7 +4402,7 @@
       </w:hyperlink>
     </w:p>
   </w:footnote>
-  <w:footnote w:id="44">
+  <w:footnote w:id="40">
     <w:p>
       <w:pPr>
         <w:pStyle w:val="FootnoteText"/>

</xml_diff>

<commit_message>
Set cipher excerpt in 9pt for Word output so lines don't wrap
Add cipher-block.lua filter: code blocks with class .cipher are
emitted as 9pt Consolas in docx; other code and formats unchanged.

Co-Authored-By: Claude Opus 5.5 <noreply@anthropic.com>
</commit_message>
<xml_diff>
--- a/vanLangren-Secret.docx
+++ b/vanLangren-Secret.docx
@@ -833,6 +833,8 @@
       <w:r>
         <w:rPr>
           <w:rStyle w:val="VerbatimChar"/>
+          <w:sz w:val="18"/>
+          <w:szCs w:val="18"/>
         </w:rPr>
         <w:t xml:space="preserve">ImIeV9 ap3Apa Ihrr5e tlSmeIf9 5lesEortEr 5e eadnu9c Rtl9e9T omgupea Nſnnd cAlveMa</w:t>
       </w:r>
@@ -842,6 +844,8 @@
       <w:r>
         <w:rPr>
           <w:rStyle w:val="VerbatimChar"/>
+          <w:sz w:val="18"/>
+          <w:szCs w:val="18"/>
         </w:rPr>
         <w:t xml:space="preserve">dfneagL p9rIir5 rEant tdTeo9Im nc5T9t noqCtuN veroQn nnmEef alarRl 9kIe raIman</w:t>
       </w:r>
@@ -851,6 +855,8 @@
       <w:r>
         <w:rPr>
           <w:rStyle w:val="VerbatimChar"/>
+          <w:sz w:val="18"/>
+          <w:szCs w:val="18"/>
         </w:rPr>
         <w:t xml:space="preserve">Me4tn eqtIu u4xV eu ulriqDa ſuVne etſelId ſe5tſ couAu 9ſ9Vldu lir5te Tce4o vEe7oſnE</w:t>
       </w:r>
@@ -860,6 +866,8 @@
       <w:r>
         <w:rPr>
           <w:rStyle w:val="VerbatimChar"/>
+          <w:sz w:val="18"/>
+          <w:szCs w:val="18"/>
         </w:rPr>
         <w:t xml:space="preserve">i5uameg Ebſe lodRa 9ebtſl Sa95u rVcmai AenprIt a9dL3do9 9nRt e3enqQe cun5ef</w:t>
       </w:r>
@@ -869,6 +877,8 @@
       <w:r>
         <w:rPr>
           <w:rStyle w:val="VerbatimChar"/>
+          <w:sz w:val="18"/>
+          <w:szCs w:val="18"/>
         </w:rPr>
         <w:t xml:space="preserve">Etſot dEr 5emus Oeacdſae 5ucſoMe e9lrrI9 acnuoEd umr92 L5d9a5 eI9cnai dnneNt t4pAIeai</w:t>
       </w:r>
@@ -878,13 +888,15 @@
       <w:r>
         <w:rPr>
           <w:rStyle w:val="VerbatimChar"/>
+          <w:sz w:val="18"/>
+          <w:szCs w:val="18"/>
         </w:rPr>
         <w:t xml:space="preserve">gPrmrO e5e VnſzbmF oaenſeS5 uſlOnt teoDe p9noIl l9lo Enen trEge59 cut To 9uned</w:t>
       </w:r>
     </w:p>
     <w:p>
       <w:pPr>
-        <w:pStyle w:val="FirstParagraph"/>
+        <w:pStyle w:val="BodyText"/>
       </w:pPr>
       <w:r>
         <w:t xml:space="preserve">It contains 204 of those space-separated groups, nearly all of them four to eight characters long, no group repeating often enough to be a common word in any language. Take a minute and look at it before reading on—this is exactly what stared back at van Langren’s readers for 376 years.</w:t>

</xml_diff>

<commit_message>
Tighten How I Got Here and The Cipher Falls; fix Word output
- Condense sourcing note to one sentence
- How I Got Here: tighten prose, shorten methods footnote, cite 2010
  paper, King Philip IV
- The Cipher Falls: merge bullet summary into Steps 1-4, shorten
  backstory, fix Z340 sentence and Zodiac footnote typos
- docx-color.lua: honour span colour (red table cells) in Word
- highlight-excerpt chunk emits OpenXML highlight for Word (raw HTML
  was silently dropped); fix esc() escaping order
- README: "nearly 400-year-old cipher"

Co-Authored-By: Claude Opus 5.5 <noreply@anthropic.com>
</commit_message>
<xml_diff>
--- a/vanLangren-Secret.docx
+++ b/vanLangren-Secret.docx
@@ -143,7 +143,7 @@
         <w:t xml:space="preserve">This is one such tale.</w:t>
       </w:r>
     </w:p>
-    <w:bookmarkStart w:id="29" w:name="how-i-got-here"/>
+    <w:bookmarkStart w:id="27" w:name="how-i-got-here"/>
     <w:p>
       <w:pPr>
         <w:pStyle w:val="Heading2"/>
@@ -157,7 +157,7 @@
         <w:pStyle w:val="FirstParagraph"/>
       </w:pPr>
       <w:r>
-        <w:t xml:space="preserve">In Dec. 2008 I received an out-of-the-blue email from Joaquín Ibáñez Ulargui, a materials scientist in Madrid. He had been going through the papers of an ancestor—fray Íñigo de Brizuela, President of the</w:t>
+        <w:t xml:space="preserve">In December 2008 I received an out-of-the-blue email from Joaquín Ibáñez Ulargui, a materials scientist in Madrid. Going through the papers of an ancestor—fray Íñigo de Brizuela, President of the</w:t>
       </w:r>
       <w:r>
         <w:t xml:space="preserve"> </w:t>
@@ -173,7 +173,7 @@
         <w:t xml:space="preserve"> </w:t>
       </w:r>
       <w:r>
-        <w:t xml:space="preserve">in the 1620s. He had found something odd tucked among them: a letter, from Feb/Mar 1628, in old Spanish, containing a small graph. He wondered if I was interested. I was indeed! Graduate students at my university were on strike; no classes meant I had plenty of time to consider a new historical hero.</w:t>
+        <w:t xml:space="preserve">in the 1620s—he had found a letter from early 1628, in old Spanish, containing a small graph. Was I interested? I was indeed! Graduate students at my university were on strike, so I had plenty of time for a new historical hero.</w:t>
       </w:r>
     </w:p>
     <w:p>
@@ -181,7 +181,7 @@
         <w:pStyle w:val="BodyText"/>
       </w:pPr>
       <w:r>
-        <w:t xml:space="preserve">The graph showed seven names, a scale of degrees, a scatter of estimates for the distance in longitude between Toledo and Rome. It looked very much like the famous 1644 diagram in Michael Florent van Langren’s</w:t>
+        <w:t xml:space="preserve">The graph showed seven names on a scale of degrees: a scatter of estimates of the difference in longitude between Toledo and Rome. It looked very much like the famous 1644 diagram in Michael Florent van Langren’s</w:t>
       </w:r>
       <w:r>
         <w:t xml:space="preserve"> </w:t>
@@ -197,7 +197,7 @@
         </w:r>
       </w:hyperlink>
       <w:r>
-        <w:t xml:space="preserve">—except this letter predated that publication by at least sixteen years. The amateur historical sleuth in me was energized!</w:t>
+        <w:t xml:space="preserve">—except this letter predated that publication by at least sixteen years.</w:t>
       </w:r>
     </w:p>
     <w:tbl>
@@ -297,43 +297,11 @@
         <w:t xml:space="preserve">The American Statistician</w:t>
       </w:r>
       <w:r>
-        <w:t xml:space="preserve">:</w:t>
-      </w:r>
-      <w:r>
-        <w:t xml:space="preserve"> </w:t>
-      </w:r>
-      <w:hyperlink r:id="rId14">
-        <w:r>
-          <w:rPr>
-            <w:rStyle w:val="Hyperlink"/>
-          </w:rPr>
-          <w:t xml:space="preserve">“The First (Known) Statistical Graph: Michael Florent van Langren and the</w:t>
-        </w:r>
-        <w:r>
-          <w:rPr>
-            <w:rStyle w:val="Hyperlink"/>
-          </w:rPr>
-          <w:t xml:space="preserve"> </w:t>
-        </w:r>
-        <w:r>
-          <w:rPr>
-            <w:rStyle w:val="Hyperlink"/>
-          </w:rPr>
-          <w:t xml:space="preserve">‘Secret’</w:t>
-        </w:r>
-        <w:r>
-          <w:rPr>
-            <w:rStyle w:val="Hyperlink"/>
-          </w:rPr>
-          <w:t xml:space="preserve"> </w:t>
-        </w:r>
-        <w:r>
-          <w:rPr>
-            <w:rStyle w:val="Hyperlink"/>
-          </w:rPr>
-          <w:t xml:space="preserve">of Longitude.”</w:t>
-        </w:r>
-      </w:hyperlink>
+        <w:t xml:space="preserve"> </w:t>
+      </w:r>
+      <w:r>
+        <w:t xml:space="preserve">(Friendly et al. 2010)</w:t>
+      </w:r>
       <w:r>
         <w:t xml:space="preserve">.</w:t>
       </w:r>
@@ -341,7 +309,7 @@
         <w:t xml:space="preserve"> </w:t>
       </w:r>
       <w:r>
-        <w:t xml:space="preserve">What was particularly of interest was to understand</w:t>
+        <w:t xml:space="preserve">What interested us most was</w:t>
       </w:r>
       <w:r>
         <w:t xml:space="preserve"> </w:t>
@@ -357,13 +325,7 @@
         <w:t xml:space="preserve"> </w:t>
       </w:r>
       <w:r>
-        <w:t xml:space="preserve">van Langren chose to display the previous estimates</w:t>
-      </w:r>
-      <w:r>
-        <w:t xml:space="preserve"> </w:t>
-      </w:r>
-      <w:r>
-        <w:t xml:space="preserve">of the longitude distance from Toledo to Rome in what would be the</w:t>
+        <w:t xml:space="preserve">van Langren showed the earlier estimates in what would be the</w:t>
       </w:r>
       <w:r>
         <w:t xml:space="preserve"> </w:t>
@@ -376,13 +338,7 @@
         <w:t xml:space="preserve">first graphical display of quantitative data</w:t>
       </w:r>
       <w:r>
-        <w:t xml:space="preserve">, using a 1D dot plot.</w:t>
-      </w:r>
-      <w:r>
-        <w:t xml:space="preserve"> </w:t>
-      </w:r>
-      <w:r>
-        <w:t xml:space="preserve">Why didn’t he just use a simple table, which was nearly always used at the time. We always ask:</w:t>
+        <w:t xml:space="preserve">, a 1D dot plot, rather than in the table anyone else at the time would have used. We always ask:</w:t>
       </w:r>
     </w:p>
     <w:p>
@@ -402,13 +358,7 @@
         <w:pStyle w:val="FirstParagraph"/>
       </w:pPr>
       <w:r>
-        <w:t xml:space="preserve">Our conclusion was that only a one-dimensional</w:t>
-      </w:r>
-      <w:r>
-        <w:t xml:space="preserve"> </w:t>
-      </w:r>
-      <w:r>
-        <w:t xml:space="preserve">dot plot of the estimates would show directly what he wanted the King to</w:t>
+        <w:t xml:space="preserve">Our answer was that only a dot plot would let the King</w:t>
       </w:r>
       <w:r>
         <w:t xml:space="preserve"> </w:t>
@@ -421,31 +371,34 @@
         <w:t xml:space="preserve">see</w:t>
       </w:r>
       <w:r>
-        <w:t xml:space="preserve">:</w:t>
-      </w:r>
-      <w:r>
-        <w:t xml:space="preserve"> </w:t>
-      </w:r>
-      <w:r>
-        <w:t xml:space="preserve">all previous methods were so variable, and therefore with such large errors, as to be useless</w:t>
-      </w:r>
-      <w:r>
-        <w:t xml:space="preserve"> </w:t>
-      </w:r>
-      <w:r>
-        <w:t xml:space="preserve">for accurate navigation at sea.</w:t>
+        <w:t xml:space="preserve"> </w:t>
+      </w:r>
+      <w:r>
+        <w:t xml:space="preserve">what van Langren wanted him to see:</w:t>
+      </w:r>
+      <w:r>
+        <w:t xml:space="preserve"> </w:t>
+      </w:r>
+      <w:r>
+        <w:t xml:space="preserve">all previous methods</w:t>
       </w:r>
       <w:r>
         <w:rPr>
           <w:rStyle w:val="FootnoteReference"/>
         </w:rPr>
-        <w:footnoteReference w:id="15"/>
-      </w:r>
-      <w:r>
-        <w:t xml:space="preserve"> </w:t>
-      </w:r>
-      <w:r>
-        <w:t xml:space="preserve">In the version of this graph from 1644, overlaid on the modern map in</w:t>
+        <w:footnoteReference w:id="14"/>
+      </w:r>
+      <w:r>
+        <w:t xml:space="preserve"> </w:t>
+      </w:r>
+      <w:r>
+        <w:t xml:space="preserve">were so variable as to be useless for navigation at sea.</w:t>
+      </w:r>
+      <w:r>
+        <w:t xml:space="preserve"> </w:t>
+      </w:r>
+      <w:r>
+        <w:t xml:space="preserve">In the 1644 version, overlaid on a modern map in</w:t>
       </w:r>
       <w:r>
         <w:t xml:space="preserve"> </w:t>
@@ -459,19 +412,7 @@
         </w:r>
       </w:hyperlink>
       <w:r>
-        <w:t xml:space="preserve">,</w:t>
-      </w:r>
-      <w:r>
-        <w:t xml:space="preserve"> </w:t>
-      </w:r>
-      <w:r>
-        <w:t xml:space="preserve">you can see how wide</w:t>
-      </w:r>
-      <w:r>
-        <w:t xml:space="preserve"> </w:t>
-      </w:r>
-      <w:r>
-        <w:t xml:space="preserve">the range of estimates is: over 40% of the range from Toledo to Rome shown.</w:t>
+        <w:t xml:space="preserve">, the estimates span over 40% of the distance from Toledo to Rome.</w:t>
       </w:r>
       <w:r>
         <w:t xml:space="preserve"> </w:t>
@@ -531,7 +472,7 @@
       <w:tr>
         <w:tc>
           <w:tcPr/>
-          <w:bookmarkStart w:id="19" w:name="fig-1644-overlay"/>
+          <w:bookmarkStart w:id="18" w:name="fig-1644-overlay"/>
           <w:p>
             <w:pPr>
               <w:pStyle w:val="Compact"/>
@@ -542,18 +483,18 @@
                 <wp:inline>
                   <wp:extent cx="5334000" cy="1067954"/>
                   <wp:effectExtent b="0" l="0" r="0" t="0"/>
-                  <wp:docPr descr="" title="" id="17" name="Picture"/>
+                  <wp:docPr descr="" title="" id="16" name="Picture"/>
                   <a:graphic>
                     <a:graphicData uri="http://schemas.openxmlformats.org/drawingml/2006/picture">
                       <pic:pic>
                         <pic:nvPicPr>
-                          <pic:cNvPr descr="images/Langren1644-overlay.jpg" id="18" name="Picture"/>
+                          <pic:cNvPr descr="images/Langren1644-overlay.jpg" id="17" name="Picture"/>
                           <pic:cNvPicPr>
                             <a:picLocks noChangeArrowheads="1" noChangeAspect="1"/>
                           </pic:cNvPicPr>
                         </pic:nvPicPr>
                         <pic:blipFill>
-                          <a:blip r:embed="rId16"/>
+                          <a:blip r:embed="rId15"/>
                           <a:stretch>
                             <a:fillRect/>
                           </a:stretch>
@@ -593,7 +534,7 @@
               <w:t xml:space="preserve">Figure 2: van Langren’s 1644 graph showing 12 estimates of the longitude distance from Toledo to Rome by eminent astronomers, overlaid on a modern map</w:t>
             </w:r>
           </w:p>
-          <w:bookmarkEnd w:id="19"/>
+          <w:bookmarkEnd w:id="18"/>
         </w:tc>
       </w:tr>
     </w:tbl>
@@ -602,25 +543,7 @@
         <w:pStyle w:val="BodyText"/>
       </w:pPr>
       <w:r>
-        <w:t xml:space="preserve">We traced van Langren’s graph back to its origin in this 1628 patronage letter, sent to Isabella Clara Eugenia, governor of the Spanish Netherlands. van Langren laid out, with more salesmanship than science, the case that longitude determination was a mess, and King Fillipe of Spain</w:t>
-      </w:r>
-      <w:r>
-        <w:t xml:space="preserve"> </w:t>
-      </w:r>
-      <w:r>
-        <w:t xml:space="preserve">surely needed to solve this for exploration (and plunder!). He said boldly</w:t>
-      </w:r>
-      <w:r>
-        <w:t xml:space="preserve"> </w:t>
-      </w:r>
-      <w:r>
-        <w:t xml:space="preserve">that he, Michael Florent van Langren, descendant of great Dutch globe-makers and</w:t>
-      </w:r>
-      <w:r>
-        <w:t xml:space="preserve"> </w:t>
-      </w:r>
-      <w:r>
-        <w:t xml:space="preserve">mathematician to His Majesty, had found a solution and deserved a reward.</w:t>
+        <w:t xml:space="preserve">The 1628 letter was a request for patronage, sent to Isabella Clara Eugenia, governor of the Spanish Netherlands. With more salesmanship than science, van Langren argued that longitude determination was a mess, that King Philip IV surely needed it solved for exploration (and plunder!), and that he—descendant of great Dutch globe-makers and mathematician to His Majesty—had found a solution and deserved a reward.</w:t>
       </w:r>
     </w:p>
     <w:p>
@@ -628,7 +551,7 @@
         <w:pStyle w:val="BodyText"/>
       </w:pPr>
       <w:r>
-        <w:t xml:space="preserve">He never said what the fix was. In</w:t>
+        <w:t xml:space="preserve">He never said what the fix was. On page 8 of</w:t>
       </w:r>
       <w:r>
         <w:t xml:space="preserve"> </w:t>
@@ -641,18 +564,15 @@
         <w:t xml:space="preserve">La Verdadera</w:t>
       </w:r>
       <w:r>
-        <w:t xml:space="preserve">, on page 8, he printed his idea anyway—but in cipher. He told the king he’d reveal the plaintext after suitable compensation. This was a classic request</w:t>
-      </w:r>
-      <w:r>
-        <w:t xml:space="preserve"> </w:t>
-      </w:r>
-      <w:r>
-        <w:t xml:space="preserve">for patronage, but couched as a puzzle. Except for the puzzle, the</w:t>
-      </w:r>
-      <w:r>
-        <w:t xml:space="preserve"> </w:t>
-      </w:r>
-      <w:hyperlink r:id="rId20">
+        <w:t xml:space="preserve"> </w:t>
+      </w:r>
+      <w:r>
+        <w:t xml:space="preserve">he printed it anyway—but in cipher, promising to reveal the plaintext after suitable compensation. Except for the puzzle, the</w:t>
+      </w:r>
+      <w:r>
+        <w:t xml:space="preserve"> </w:t>
+      </w:r>
+      <w:hyperlink r:id="rId19">
         <w:r>
           <w:rPr>
             <w:rStyle w:val="Hyperlink"/>
@@ -689,7 +609,7 @@
       <w:r>
         <w:t xml:space="preserve"> </w:t>
       </w:r>
-      <w:hyperlink r:id="rId21">
+      <w:hyperlink r:id="rId20">
         <w:r>
           <w:rPr>
             <w:rStyle w:val="Hyperlink"/>
@@ -698,7 +618,7 @@
         </w:r>
       </w:hyperlink>
       <w:r>
-        <w:t xml:space="preserve">, posed a few open questions about what kind of cipher it might be, and moved on.</w:t>
+        <w:t xml:space="preserve">, posed a few questions about what kind of cipher it might be, and moved on.</w:t>
       </w:r>
     </w:p>
     <w:p>
@@ -706,7 +626,7 @@
         <w:pStyle w:val="BodyText"/>
       </w:pPr>
       <w:r>
-        <w:t xml:space="preserve">Except I didn’t quite move on right away. In 2009 and 2010 I went looking for codebreakers on what the internet was back then, tracking down a handful of people—a few retired from the CIA, a couple from NASA—who I thought might enjoy a fun historical puzzle. Several wrote back, and a few actually gave it a real attempt. But van Langren beat them all. (We’ll see why when we get to the final solution.)</w:t>
+        <w:t xml:space="preserve">Not quite right away. In 2009 and 2010 I tracked down a handful of codebreakers—a few retired from the CIA, a couple from NASA—who I thought might enjoy a historical puzzle. A few gave it a real try. Van Langren beat them all.</w:t>
       </w:r>
     </w:p>
     <w:tbl>
@@ -722,7 +642,7 @@
       <w:tr>
         <w:tc>
           <w:tcPr/>
-          <w:bookmarkStart w:id="25" w:name="fig-cipher-page"/>
+          <w:bookmarkStart w:id="24" w:name="fig-cipher-page"/>
           <w:p>
             <w:pPr>
               <w:pStyle w:val="Compact"/>
@@ -733,18 +653,18 @@
                 <wp:inline>
                   <wp:extent cx="4267200" cy="2120302"/>
                   <wp:effectExtent b="0" l="0" r="0" t="0"/>
-                  <wp:docPr descr="" title="" id="23" name="Picture"/>
+                  <wp:docPr descr="" title="" id="22" name="Picture"/>
                   <a:graphic>
                     <a:graphicData uri="http://schemas.openxmlformats.org/drawingml/2006/picture">
                       <pic:pic>
                         <pic:nvPicPr>
-                          <pic:cNvPr descr="images/verdadera-cipher.jpg" id="24" name="Picture"/>
+                          <pic:cNvPr descr="images/verdadera-cipher.jpg" id="23" name="Picture"/>
                           <pic:cNvPicPr>
                             <a:picLocks noChangeArrowheads="1" noChangeAspect="1"/>
                           </pic:cNvPicPr>
                         </pic:nvPicPr>
                         <pic:blipFill>
-                          <a:blip r:embed="rId22"/>
+                          <a:blip r:embed="rId21"/>
                           <a:stretch>
                             <a:fillRect/>
                           </a:stretch>
@@ -800,7 +720,7 @@
               <w:t xml:space="preserve">(1644): the printed cipher, exactly as van Langren’s readers first saw it.</w:t>
             </w:r>
           </w:p>
-          <w:bookmarkEnd w:id="25"/>
+          <w:bookmarkEnd w:id="24"/>
         </w:tc>
       </w:tr>
     </w:tbl>
@@ -814,7 +734,7 @@
       <w:r>
         <w:t xml:space="preserve"> </w:t>
       </w:r>
-      <w:hyperlink r:id="rId26">
+      <w:hyperlink r:id="rId25">
         <w:r>
           <w:rPr>
             <w:rStyle w:val="Hyperlink"/>
@@ -907,12 +827,12 @@
         <w:pStyle w:val="BodyText"/>
       </w:pPr>
       <w:r>
-        <w:t xml:space="preserve">I assumed, as I think most people who have written about van Langren have assumed, that whatever he was hiding had something to do with the achievement he’s actually remembered for:</w:t>
-      </w:r>
-      <w:r>
-        <w:t xml:space="preserve"> </w:t>
-      </w:r>
-      <w:hyperlink r:id="rId27">
+        <w:t xml:space="preserve">I assumed, as I think most people who have written about van Langren did, that his secret had to do with the achievement he’s actually remembered for:</w:t>
+      </w:r>
+      <w:r>
+        <w:t xml:space="preserve"> </w:t>
+      </w:r>
+      <w:hyperlink r:id="rId26">
         <w:r>
           <w:rPr>
             <w:rStyle w:val="Hyperlink"/>
@@ -921,36 +841,11 @@
         </w:r>
       </w:hyperlink>
       <w:r>
-        <w:t xml:space="preserve">, the first comprehensive survey of the moon’s craters and mountains, and the method he spent years trying to build around it—using the sunrise and sunset lines crossing named lunar peaks as a kind of celestial clock, visible everywhere the moon was visible.</w:t>
-      </w:r>
-    </w:p>
-    <w:p>
-      <w:pPr>
-        <w:pStyle w:val="BodyText"/>
-      </w:pPr>
-      <w:r>
-        <w:t xml:space="preserve">It was a reasonable guess, backed by details about the</w:t>
-      </w:r>
-      <w:r>
-        <w:t xml:space="preserve"> </w:t>
-      </w:r>
-      <w:hyperlink r:id="rId28">
-        <w:r>
-          <w:rPr>
-            <w:rStyle w:val="Hyperlink"/>
-          </w:rPr>
-          <w:t xml:space="preserve">Alfonsine Tables</w:t>
-        </w:r>
-      </w:hyperlink>
-      <w:r>
-        <w:t xml:space="preserve"> </w:t>
-      </w:r>
-      <w:r>
-        <w:t xml:space="preserve">which provided data for computing the position of the Sun, Moon and planets relative to the fixed stars. It also made a good (his)story back then. But, alas, it was also wrong.</w:t>
-      </w:r>
-    </w:p>
-    <w:bookmarkEnd w:id="29"/>
-    <w:bookmarkStart w:id="30" w:name="the-problem-of-longitude"/>
+        <w:t xml:space="preserve">, the first comprehensive survey of the moon’s craters and mountains, and the method he built around it—using the sunrise and sunset lines crossing named lunar peaks as a celestial clock, visible wherever the moon was. It was a reasonable guess, and it made a good (his)story. It was also wrong.</w:t>
+      </w:r>
+    </w:p>
+    <w:bookmarkEnd w:id="27"/>
+    <w:bookmarkStart w:id="28" w:name="the-problem-of-longitude"/>
     <w:p>
       <w:pPr>
         <w:pStyle w:val="Heading2"/>
@@ -1391,8 +1286,8 @@
         <w:t xml:space="preserve">method nor a mechanical clock. It was a water clock.</w:t>
       </w:r>
     </w:p>
-    <w:bookmarkEnd w:id="30"/>
-    <w:bookmarkStart w:id="45" w:name="the-cipher-falls"/>
+    <w:bookmarkEnd w:id="28"/>
+    <w:bookmarkStart w:id="41" w:name="the-cipher-falls"/>
     <w:p>
       <w:pPr>
         <w:pStyle w:val="Heading2"/>
@@ -1406,7 +1301,7 @@
         <w:pStyle w:val="FirstParagraph"/>
       </w:pPr>
       <w:r>
-        <w:t xml:space="preserve">Eleven years after our paper—long enough that I had filed the cryptogram away as one of those historical loose ends nobody would ever tie off—I learned that it had been solved. Not by a historian of science. By a Belgian warehouse worker and amateur cryptographer who loved a good puzzle.</w:t>
+        <w:t xml:space="preserve">Eleven years after our paper—long enough that I had filed the cryptogram away as a loose end nobody would ever tie off—I learned that it had been solved. Not by a historian of science, but by a Belgian warehouse worker and amateur cryptographer who loved a good puzzle.</w:t>
       </w:r>
     </w:p>
     <w:p>
@@ -1414,28 +1309,12 @@
         <w:pStyle w:val="BodyText"/>
       </w:pPr>
       <w:r>
-        <w:t xml:space="preserve">The backstory has its own small comedy of persistence. Klaus Schmeh, a German cryptology writer who maintains a blog called</w:t>
-      </w:r>
-      <w:r>
-        <w:t xml:space="preserve"> </w:t>
-      </w:r>
-      <w:hyperlink r:id="rId31">
-        <w:r>
-          <w:rPr>
-            <w:rStyle w:val="Hyperlink"/>
-            <w:i/>
-            <w:iCs/>
-          </w:rPr>
-          <w:t xml:space="preserve">Cipherbrain</w:t>
-        </w:r>
-      </w:hyperlink>
-      <w:r>
-        <w:t xml:space="preserve">, had stumbled on the van Langren cipher in 2015 and flagged it as a genuinely interesting unsolved historical cryptogram that nobody in the crypto world seemed to know about. An Antwerp amateur astronomer, Jos Pauwels, took an interest and kept it alive.</w:t>
-      </w:r>
-      <w:r>
-        <w:t xml:space="preserve"> </w:t>
-      </w:r>
-      <w:hyperlink r:id="rId32">
+        <w:t xml:space="preserve">The cipher had been kept alive by other amateurs: the cryptology blogger Klaus Schmeh flagged it in 2015 as a neglected historical puzzle, and the mathematician</w:t>
+      </w:r>
+      <w:r>
+        <w:t xml:space="preserve"> </w:t>
+      </w:r>
+      <w:hyperlink r:id="rId29">
         <w:r>
           <w:rPr>
             <w:rStyle w:val="Hyperlink"/>
@@ -1444,20 +1323,15 @@
         </w:r>
       </w:hyperlink>
       <w:r>
-        <w:t xml:space="preserve">, a mathematician at KU Leuven, had been shopping the puzzle around online forums for the better part of a decade, by his own account without success.</w:t>
-      </w:r>
-    </w:p>
-    <w:p>
-      <w:pPr>
-        <w:pStyle w:val="BodyText"/>
-      </w:pPr>
-      <w:r>
-        <w:t xml:space="preserve">Then, in December 2020, a trio of codebreakers—David Oranchak, Sam Blake, and a Belgian warehouse operator and programmer named Jarl Van Eycke—who had cracked the</w:t>
-      </w:r>
-      <w:r>
-        <w:t xml:space="preserve"> </w:t>
-      </w:r>
-      <w:hyperlink r:id="rId33">
+        <w:t xml:space="preserve"> </w:t>
+      </w:r>
+      <w:r>
+        <w:t xml:space="preserve">spent years shopping it around online forums, without success. Then, in December 2020, a trio of codebreakers—David Oranchak, Sam Blake, and Jarl Van Eycke—cracked the</w:t>
+      </w:r>
+      <w:r>
+        <w:t xml:space="preserve"> </w:t>
+      </w:r>
+      <w:hyperlink r:id="rId30">
         <w:r>
           <w:rPr>
             <w:rStyle w:val="Hyperlink"/>
@@ -1466,13 +1340,19 @@
         </w:r>
       </w:hyperlink>
       <w:r>
+        <w:t xml:space="preserve">,</w:t>
+      </w:r>
+      <w:r>
         <w:rPr>
           <w:rStyle w:val="FootnoteReference"/>
         </w:rPr>
-        <w:footnoteReference w:id="34"/>
-      </w:r>
-      <w:r>
-        <w:t xml:space="preserve">, a 340-character code unsolved for 51 years. Huylebrouck read the news, tracked down Van Eycke, and handed him the</w:t>
+        <w:footnoteReference w:id="31"/>
+      </w:r>
+      <w:r>
+        <w:t xml:space="preserve"> </w:t>
+      </w:r>
+      <w:r>
+        <w:t xml:space="preserve">unsolved for 51 years. Huylebrouck read the news, tracked down Van Eycke, and handed him the</w:t>
       </w:r>
       <w:r>
         <w:t xml:space="preserve"> </w:t>
@@ -1501,90 +1381,45 @@
         <w:pStyle w:val="BodyText"/>
       </w:pPr>
       <w:r>
-        <w:t xml:space="preserve">His approach was pure applied cryptanalysis, and it’s worth walking through because it’s a small master class in how you break a cipher with no known key and no certainty about what kind of cipher it even is.</w:t>
-      </w:r>
-    </w:p>
-    <w:p>
-      <w:pPr>
-        <w:pStyle w:val="Compact"/>
-        <w:numPr>
-          <w:ilvl w:val="0"/>
-          <w:numId w:val="1001"/>
-        </w:numPr>
-      </w:pPr>
-      <w:r>
-        <w:t xml:space="preserve">He started by noticing that the</w:t>
-      </w:r>
-      <w:r>
-        <w:t xml:space="preserve"> </w:t>
-      </w:r>
-      <w:r>
-        <w:t xml:space="preserve">“words”</w:t>
-      </w:r>
-      <w:r>
-        <w:t xml:space="preserve"> </w:t>
-      </w:r>
-      <w:r>
-        <w:t xml:space="preserve">in the transcribed ciphertext were suspiciously uniform in length—a giveaway that the spacing was cosmetic, meant to look like word breaks without being so.</w:t>
-      </w:r>
-    </w:p>
-    <w:p>
-      <w:pPr>
-        <w:pStyle w:val="Compact"/>
-        <w:numPr>
-          <w:ilvl w:val="0"/>
-          <w:numId w:val="1001"/>
-        </w:numPr>
-      </w:pPr>
-      <w:r>
-        <w:t xml:space="preserve">He stripped the spaces and ran statistical tests for</w:t>
-      </w:r>
-      <w:r>
-        <w:t xml:space="preserve"> </w:t>
-      </w:r>
-      <w:hyperlink r:id="rId35">
+        <w:t xml:space="preserve">Van Eycke never published his own account of the break; what follows retraces his steps as</w:t>
+      </w:r>
+      <w:r>
+        <w:t xml:space="preserve"> </w:t>
+      </w:r>
+      <w:hyperlink r:id="rId32">
         <w:r>
           <w:rPr>
             <w:rStyle w:val="Hyperlink"/>
           </w:rPr>
-          <w:t xml:space="preserve">periodic transposition</w:t>
+          <w:t xml:space="preserve">Klaus Schmeh reported them</w:t>
         </w:r>
       </w:hyperlink>
       <w:r>
-        <w:t xml:space="preserve">, the classic technique of simply reordering letters rather than substituting them. Nothing came of this.</w:t>
-      </w:r>
-    </w:p>
-    <w:p>
-      <w:pPr>
-        <w:pStyle w:val="Compact"/>
-        <w:numPr>
-          <w:ilvl w:val="0"/>
-          <w:numId w:val="1001"/>
-        </w:numPr>
-      </w:pPr>
-      <w:r>
-        <w:t xml:space="preserve">He then tried removing different classes of symbols to see what improved the letter-trigram statistics</w:t>
-      </w:r>
-      <w:r>
-        <w:rPr>
-          <w:rStyle w:val="FootnoteReference"/>
-        </w:rPr>
-        <w:footnoteReference w:id="36"/>
-      </w:r>
-      <w:r>
-        <w:t xml:space="preserve">. He found that the capital letters scattered through the text were pure decoys—meaningless once removed.</w:t>
-      </w:r>
-    </w:p>
-    <w:p>
-      <w:pPr>
-        <w:pStyle w:val="Compact"/>
-        <w:numPr>
-          <w:ilvl w:val="0"/>
-          <w:numId w:val="1001"/>
-        </w:numPr>
-      </w:pPr>
-      <w:r>
-        <w:t xml:space="preserve">With capitals and spaces both gone, he tried reading the remaining letters at different intervals, and found that taking every third letter suddenly produced recognizable fragments of real words.</w:t>
+        <w:t xml:space="preserve"> </w:t>
+      </w:r>
+      <w:r>
+        <w:t xml:space="preserve">from Van Eycke’s email, applied to the ciphertext from our 2010 supplementary materials. It’s a small master class in breaking a cipher with no known key and no certainty about what kind of cipher it even is.</w:t>
+      </w:r>
+    </w:p>
+    <w:bookmarkStart w:id="33" w:name="step-1-the-words-are-a-decoy"/>
+    <w:p>
+      <w:pPr>
+        <w:pStyle w:val="Heading3"/>
+      </w:pPr>
+      <w:r>
+        <w:t xml:space="preserve">Step 1: the</w:t>
+      </w:r>
+      <w:r>
+        <w:t xml:space="preserve"> </w:t>
+      </w:r>
+      <w:r>
+        <w:t xml:space="preserve">“words”</w:t>
+      </w:r>
+      <w:r>
+        <w:t xml:space="preserve"> </w:t>
+      </w:r>
+      <w:r>
+        <w:t xml:space="preserve">are a decoy</w:t>
       </w:r>
     </w:p>
     <w:p>
@@ -1592,163 +1427,51 @@
         <w:pStyle w:val="FirstParagraph"/>
       </w:pPr>
       <w:r>
-        <w:t xml:space="preserve">That was the structural key: the plaintext had been split across three interleaved streams before a final substitution—digits standing in for letters—was layered on top. Once he had the interleaving and the substitution, the message resolved into continuous prose. And the prose wasn’t in the Spanish that both van Langren’s introduction and our own paper had led everyone to expect. It was seventeenth-century French.</w:t>
-      </w:r>
-      <w:r>
-        <w:t xml:space="preserve"> </w:t>
+        <w:t xml:space="preserve">204</w:t>
+      </w:r>
+      <w:r>
+        <w:t xml:space="preserve"> </w:t>
+      </w:r>
+      <w:r>
+        <w:t xml:space="preserve">“words,”</w:t>
+      </w:r>
+      <w:r>
+        <w:t xml:space="preserve"> </w:t>
+      </w:r>
+      <w:r>
+        <w:t xml:space="preserve">and the lengths cluster almost entirely between 4 and 8 characters—you can see it in the</w:t>
+      </w:r>
+      <w:r>
+        <w:t xml:space="preserve"> </w:t>
+      </w:r>
+      <w:r>
+        <w:t xml:space="preserve">“rivers”</w:t>
+      </w:r>
+      <w:r>
+        <w:t xml:space="preserve"> </w:t>
+      </w:r>
+      <w:r>
+        <w:t xml:space="preserve">of spaces running down the lines. In French prose (the plaintext language, as it turns out), roughly 30% of words are 1–2 letters—</w:t>
       </w:r>
       <w:r>
         <w:rPr>
           <w:i/>
           <w:iCs/>
         </w:rPr>
-        <w:t xml:space="preserve">Quelle surprise!</w:t>
-      </w:r>
-      <w:r>
-        <w:t xml:space="preserve"> </w:t>
-      </w:r>
-      <w:r>
-        <w:t xml:space="preserve">It is of some interest to show some of these steps using R.</w:t>
-      </w:r>
-    </w:p>
-    <w:p>
-      <w:pPr>
-        <w:pStyle w:val="BodyText"/>
-      </w:pPr>
-      <w:r>
-        <w:t xml:space="preserve">A quick note on sourcing before I reproduce any of this: Van Eycke never published his own account of the break. Every version of this story, including mine, traces back to</w:t>
-      </w:r>
-      <w:r>
-        <w:t xml:space="preserve"> </w:t>
-      </w:r>
-      <w:hyperlink r:id="rId38">
-        <w:r>
-          <w:rPr>
-            <w:rStyle w:val="Hyperlink"/>
-          </w:rPr>
-          <w:t xml:space="preserve">Klaus Schmeh’s</w:t>
-        </w:r>
-        <w:r>
-          <w:rPr>
-            <w:rStyle w:val="Hyperlink"/>
-          </w:rPr>
-          <w:t xml:space="preserve"> </w:t>
-        </w:r>
-        <w:r>
-          <w:rPr>
-            <w:rStyle w:val="Hyperlink"/>
-            <w:i/>
-            <w:iCs/>
-          </w:rPr>
-          <w:t xml:space="preserve">Cipherbrain</w:t>
-        </w:r>
-        <w:r>
-          <w:rPr>
-            <w:rStyle w:val="Hyperlink"/>
-          </w:rPr>
-          <w:t xml:space="preserve"> </w:t>
-        </w:r>
-        <w:r>
-          <w:rPr>
-            <w:rStyle w:val="Hyperlink"/>
-          </w:rPr>
-          <w:t xml:space="preserve">post</w:t>
-        </w:r>
-      </w:hyperlink>
-      <w:r>
-        <w:t xml:space="preserve">, which is Schmeh’s own paraphrase of</w:t>
-      </w:r>
-      <w:r>
-        <w:t xml:space="preserve"> </w:t>
-      </w:r>
-      <w:r>
-        <w:t xml:space="preserve">“a detailed description”</w:t>
-      </w:r>
-      <w:r>
-        <w:t xml:space="preserve"> </w:t>
-      </w:r>
-      <w:r>
-        <w:t xml:space="preserve">Van Eycke sent him by email—not a verbatim quote, and not self-published. With that caveat, here’s what happens when you run Van Eycke’s described steps against the actual ciphertext from our 2010 supplementary materials.</w:t>
-      </w:r>
-    </w:p>
-    <w:bookmarkStart w:id="39" w:name="step-1-the-words-are-a-decoy"/>
-    <w:p>
-      <w:pPr>
-        <w:pStyle w:val="Heading3"/>
-      </w:pPr>
-      <w:r>
-        <w:t xml:space="preserve">Step 1: the</w:t>
-      </w:r>
-      <w:r>
-        <w:t xml:space="preserve"> </w:t>
-      </w:r>
-      <w:r>
-        <w:t xml:space="preserve">“words”</w:t>
-      </w:r>
-      <w:r>
-        <w:t xml:space="preserve"> </w:t>
-      </w:r>
-      <w:r>
-        <w:t xml:space="preserve">are a decoy</w:t>
-      </w:r>
-    </w:p>
-    <w:p>
-      <w:pPr>
-        <w:pStyle w:val="FirstParagraph"/>
-      </w:pPr>
-      <w:r>
-        <w:t xml:space="preserve">The distribution of</w:t>
-      </w:r>
-      <w:r>
-        <w:t xml:space="preserve"> </w:t>
-      </w:r>
-      <w:r>
-        <w:t xml:space="preserve">“word”</w:t>
-      </w:r>
-      <w:r>
-        <w:t xml:space="preserve"> </w:t>
-      </w:r>
-      <w:r>
-        <w:t xml:space="preserve">length in the cipher gives some clues:</w:t>
-      </w:r>
-    </w:p>
-    <w:p>
-      <w:pPr>
-        <w:pStyle w:val="BodyText"/>
-      </w:pPr>
-      <w:r>
-        <w:t xml:space="preserve">204</w:t>
-      </w:r>
-      <w:r>
-        <w:t xml:space="preserve"> </w:t>
-      </w:r>
-      <w:r>
-        <w:t xml:space="preserve">“words,”</w:t>
-      </w:r>
-      <w:r>
-        <w:t xml:space="preserve"> </w:t>
-      </w:r>
-      <w:r>
-        <w:t xml:space="preserve">and the lengths cluster almost entirely between 4 and 8 characters. You can actually see this narrow range of word lengths in the</w:t>
-      </w:r>
-      <w:r>
-        <w:t xml:space="preserve"> </w:t>
-      </w:r>
-      <w:r>
-        <w:t xml:space="preserve">“rivers”</w:t>
-      </w:r>
-      <w:r>
-        <w:t xml:space="preserve"> </w:t>
-      </w:r>
-      <w:r>
-        <w:t xml:space="preserve">of spaces that run down the lines in the cipher text. In French prose (the plaintext language, as it turns out), roughly 30% of words are 1–2 letters—</w:t>
+        <w:t xml:space="preserve">de</w:t>
+      </w:r>
+      <w:r>
+        <w:t xml:space="preserve">,</w:t>
+      </w:r>
+      <w:r>
+        <w:t xml:space="preserve"> </w:t>
       </w:r>
       <w:r>
         <w:rPr>
           <w:i/>
           <w:iCs/>
         </w:rPr>
-        <w:t xml:space="preserve">de</w:t>
+        <w:t xml:space="preserve">en</w:t>
       </w:r>
       <w:r>
         <w:t xml:space="preserve">,</w:t>
@@ -1761,7 +1484,7 @@
           <w:i/>
           <w:iCs/>
         </w:rPr>
-        <w:t xml:space="preserve">en</w:t>
+        <w:t xml:space="preserve">le</w:t>
       </w:r>
       <w:r>
         <w:t xml:space="preserve">,</w:t>
@@ -1774,36 +1497,10 @@
           <w:i/>
           <w:iCs/>
         </w:rPr>
-        <w:t xml:space="preserve">le</w:t>
-      </w:r>
-      <w:r>
-        <w:t xml:space="preserve">,</w:t>
-      </w:r>
-      <w:r>
-        <w:t xml:space="preserve"> </w:t>
-      </w:r>
-      <w:r>
-        <w:rPr>
-          <w:i/>
-          <w:iCs/>
-        </w:rPr>
         <w:t xml:space="preserve">il</w:t>
       </w:r>
       <w:r>
-        <w:t xml:space="preserve">,</w:t>
-      </w:r>
-      <w:r>
-        <w:t xml:space="preserve"> </w:t>
-      </w:r>
-      <w:r>
-        <w:rPr>
-          <w:i/>
-          <w:iCs/>
-        </w:rPr>
-        <w:t xml:space="preserve">se</w:t>
-      </w:r>
-      <w:r>
-        <w:t xml:space="preserve">, the connective tissue of any sentence. In the cipher, barely 3% are that short; the rest pile up in the 4–8 character range at a frequency no natural language produces. The spacing is decorative and purposely deceptive, not linguistic.</w:t>
+        <w:t xml:space="preserve">, the connective tissue of any sentence. In the cipher, barely 3% are that short. The spacing is decorative and purposely deceptive, not linguistic.</w:t>
       </w:r>
     </w:p>
     <w:p>
@@ -1976,7 +1673,7 @@
             <w:r>
               <w:rPr>
                 <w:b/>
-                <w:bCs/>
+                <w:color w:val="C00000"/>
               </w:rPr>
               <w:t xml:space="preserve">3</w:t>
             </w:r>
@@ -2126,7 +1823,7 @@
             <w:r>
               <w:rPr>
                 <w:b/>
-                <w:bCs/>
+                <w:color w:val="C00000"/>
               </w:rPr>
               <w:t xml:space="preserve">55</w:t>
             </w:r>
@@ -2203,7 +1900,7 @@
             <w:r>
               <w:rPr>
                 <w:b/>
-                <w:bCs/>
+                <w:color w:val="C00000"/>
               </w:rPr>
               <w:t xml:space="preserve">&lt;1</w:t>
             </w:r>
@@ -2211,8 +1908,8 @@
         </w:tc>
       </w:tr>
     </w:tbl>
-    <w:bookmarkEnd w:id="39"/>
-    <w:bookmarkStart w:id="41" w:name="step-2-strip-spaces-and-decoy-capitals"/>
+    <w:bookmarkEnd w:id="33"/>
+    <w:bookmarkStart w:id="37" w:name="step-2-strip-spaces-and-decoy-capitals"/>
     <w:p>
       <w:pPr>
         <w:pStyle w:val="Heading3"/>
@@ -2226,25 +1923,185 @@
         <w:pStyle w:val="FirstParagraph"/>
       </w:pPr>
       <w:r>
-        <w:t xml:space="preserve">Removing the space characters and capital letters in the ciphertext is easily handled</w:t>
-      </w:r>
-      <w:r>
-        <w:t xml:space="preserve"> </w:t>
-      </w:r>
-      <w:r>
-        <w:t xml:space="preserve">by</w:t>
-      </w:r>
-      <w:r>
-        <w:t xml:space="preserve"> </w:t>
-      </w:r>
+        <w:t xml:space="preserve">With the spaces gone, Van Eycke first tested for</w:t>
+      </w:r>
+      <w:r>
+        <w:t xml:space="preserve"> </w:t>
+      </w:r>
+      <w:hyperlink r:id="rId34">
+        <w:r>
+          <w:rPr>
+            <w:rStyle w:val="Hyperlink"/>
+          </w:rPr>
+          <w:t xml:space="preserve">periodic transposition</w:t>
+        </w:r>
+      </w:hyperlink>
+      <w:r>
+        <w:t xml:space="preserve">—letters simply reordered rather than substituted. Nothing. He then tried removing different classes of symbols to see what improved the letter-trigram statistics.</w:t>
+      </w:r>
+      <w:r>
+        <w:rPr>
+          <w:rStyle w:val="FootnoteReference"/>
+        </w:rPr>
+        <w:footnoteReference w:id="35"/>
+      </w:r>
+      <w:r>
+        <w:t xml:space="preserve"> </w:t>
+      </w:r>
+      <w:r>
+        <w:t xml:space="preserve">The capital letters sprinkled through the text turned out to be pure noise, meant to further deceive any rival who might try to steal van Langren’s thunder.</w:t>
+      </w:r>
+      <w:r>
+        <w:rPr>
+          <w:rStyle w:val="FootnoteReference"/>
+        </w:rPr>
+        <w:footnoteReference w:id="36"/>
+      </w:r>
+      <w:r>
+        <w:t xml:space="preserve"> </w:t>
+      </w:r>
+      <w:r>
+        <w:t xml:space="preserve">Deleting them leaves a single unbroken run of 987 lowercase letters, long-s (ſ) characters, and digits.</w:t>
+      </w:r>
+    </w:p>
+    <w:bookmarkEnd w:id="37"/>
+    <w:bookmarkStart w:id="38" w:name="Xf4252676e6dfa0fda2e27468b9cdc9528dee206"/>
+    <w:p>
+      <w:pPr>
+        <w:pStyle w:val="Heading3"/>
+      </w:pPr>
+      <w:r>
+        <w:t xml:space="preserve">Step 3: split into three interleaved streams</w:t>
+      </w:r>
+    </w:p>
+    <w:p>
+      <w:pPr>
+        <w:pStyle w:val="FirstParagraph"/>
+      </w:pPr>
+      <w:r>
+        <w:t xml:space="preserve">Reading the run at different intervals, Van Eycke found that taking every third character—positions 1, 4, 7, …—suddenly produced fragments of real words. The plaintext had been split across three interleaved streams.</w:t>
+      </w:r>
+    </w:p>
+    <w:bookmarkEnd w:id="38"/>
+    <w:bookmarkStart w:id="40" w:name="step-4-undo-the-digit-substitution"/>
+    <w:p>
+      <w:pPr>
+        <w:pStyle w:val="Heading3"/>
+      </w:pPr>
+      <w:r>
+        <w:t xml:space="preserve">Step 4: undo the digit substitution</w:t>
+      </w:r>
+    </w:p>
+    <w:p>
+      <w:pPr>
+        <w:pStyle w:val="FirstParagraph"/>
+      </w:pPr>
+      <w:r>
+        <w:t xml:space="preserve">The last layer is a simple key: 1 = a, 2 = b, … 9 = i. Concatenating the three streams in order and substituting resolves the whole thing into continuous prose—not in the Spanish that both van Langren’s introduction and our own paper had led everyone to expect, but seventeenth-century French.</w:t>
+      </w:r>
+      <w:r>
+        <w:t xml:space="preserve"> </w:t>
+      </w:r>
+      <w:r>
+        <w:rPr>
+          <w:i/>
+          <w:iCs/>
+        </w:rPr>
+        <w:t xml:space="preserve">Quelle surprise!</w:t>
+      </w:r>
+    </w:p>
+    <w:p>
+      <w:pPr>
+        <w:pStyle w:val="BodyText"/>
+      </w:pPr>
+      <w:r>
+        <w:t xml:space="preserve">Here is the passage that describes his method:</w:t>
+      </w:r>
+    </w:p>
+    <w:p>
+      <w:pPr>
+        <w:pStyle w:val="SourceCode"/>
+      </w:pPr>
       <w:r>
         <w:rPr>
           <w:rStyle w:val="VerbatimChar"/>
-        </w:rPr>
-        <w:t xml:space="preserve">gsub()</w:t>
-      </w:r>
-      <w:r>
-        <w:t xml:space="preserve">, mapping these into NULL (““) characters.</w:t>
+          <w:sz w:val="18"/>
+          <w:szCs w:val="18"/>
+        </w:rPr>
+        <w:t xml:space="preserve">ditesuasesetlesaiantssoitvuideeeafinderoncognoisteraparlesestoillese</w:t>
+      </w:r>
+      <w:r>
+        <w:br/>
+      </w:r>
+      <w:r>
+        <w:rPr>
+          <w:rStyle w:val="VerbatimChar"/>
+          <w:sz w:val="18"/>
+          <w:szCs w:val="18"/>
+        </w:rPr>
+        <w:t xml:space="preserve">ncombiendetempsellesseuuidenteeqraaumesmemeridiendulieouueichelflore</w:t>
+      </w:r>
+      <w:r>
+        <w:br/>
+      </w:r>
+      <w:r>
+        <w:rPr>
+          <w:rStyle w:val="VerbatimChar"/>
+          <w:sz w:val="18"/>
+          <w:szCs w:val="18"/>
+        </w:rPr>
+        <w:t xml:space="preserve">nciouan</w:t>
+      </w:r>
+      <w:r>
+        <w:rPr>
+          <w:rStyle w:val="VerbatimChar"/>
+          <w:highlight w:val="yellow"/>
+          <w:sz w:val="18"/>
+          <w:szCs w:val="18"/>
+        </w:rPr>
+        <w:t xml:space="preserve">langrendictqvonfairadeuxuisesdecuiuredesemblablecipaciteenfor</w:t>
+      </w:r>
+      <w:r>
+        <w:br/>
+      </w:r>
+      <w:r>
+        <w:rPr>
+          <w:rStyle w:val="VerbatimChar"/>
+          <w:highlight w:val="yellow"/>
+          <w:sz w:val="18"/>
+          <w:szCs w:val="18"/>
+        </w:rPr>
+        <w:t xml:space="preserve">medecelindre</w:t>
+      </w:r>
+      <w:r>
+        <w:rPr>
+          <w:rStyle w:val="VerbatimChar"/>
+          <w:sz w:val="18"/>
+          <w:szCs w:val="18"/>
+        </w:rPr>
+        <w:t xml:space="preserve">aiantpimesmeestoillereuientaumesmemeridonpartitilnefault</w:t>
+      </w:r>
+      <w:r>
+        <w:br/>
+      </w:r>
+      <w:r>
+        <w:rPr>
+          <w:rStyle w:val="VerbatimChar"/>
+          <w:sz w:val="18"/>
+          <w:szCs w:val="18"/>
+        </w:rPr>
+        <w:t xml:space="preserve">queprendrecestedifferenceparlesestoillesdufirmamentautentantquelapre</w:t>
+      </w:r>
+      <w:r>
+        <w:br/>
+      </w:r>
+      <w:r>
+        <w:rPr>
+          <w:rStyle w:val="VerbatimChar"/>
+          <w:sz w:val="18"/>
+          <w:szCs w:val="18"/>
+        </w:rPr>
+        <w:t xml:space="preserve">miereuastremplideleaudelamnneraouuertnrealasecondelaqnellefiniraauss</w:t>
       </w:r>
     </w:p>
     <w:p>
@@ -2252,83 +2109,7 @@
         <w:pStyle w:val="BodyText"/>
       </w:pPr>
       <w:r>
-        <w:t xml:space="preserve">Van Eycke also found that the capital letters sprinkled through the text carried no useful information.</w:t>
-      </w:r>
-      <w:r>
-        <w:t xml:space="preserve"> </w:t>
-      </w:r>
-      <w:r>
-        <w:t xml:space="preserve">They were pure noise, meant to further deceive any rival who would try to steal his thunder.</w:t>
-      </w:r>
-      <w:r>
-        <w:rPr>
-          <w:rStyle w:val="FootnoteReference"/>
-        </w:rPr>
-        <w:footnoteReference w:id="40"/>
-      </w:r>
-      <w:r>
-        <w:t xml:space="preserve"> </w:t>
-      </w:r>
-      <w:r>
-        <w:t xml:space="preserve">Deleting these leaves a single unbroken run of 987 lowercase letters, long-s (ſ) characters, and digits.</w:t>
-      </w:r>
-    </w:p>
-    <w:bookmarkEnd w:id="41"/>
-    <w:bookmarkStart w:id="42" w:name="Xf4252676e6dfa0fda2e27468b9cdc9528dee206"/>
-    <w:p>
-      <w:pPr>
-        <w:pStyle w:val="Heading3"/>
-      </w:pPr>
-      <w:r>
-        <w:t xml:space="preserve">Step 3: split into three interleaved streams</w:t>
-      </w:r>
-    </w:p>
-    <w:p>
-      <w:pPr>
-        <w:pStyle w:val="FirstParagraph"/>
-      </w:pPr>
-      <w:r>
-        <w:t xml:space="preserve">Taking every third character—positions 1, 4, 7, …—out of that run still isn’t readable, but the letter patterns already look far more like language than the raw ciphertext did.</w:t>
-      </w:r>
-    </w:p>
-    <w:bookmarkEnd w:id="42"/>
-    <w:bookmarkStart w:id="44" w:name="step-4-undo-the-digit-substitution"/>
-    <w:p>
-      <w:pPr>
-        <w:pStyle w:val="Heading3"/>
-      </w:pPr>
-      <w:r>
-        <w:t xml:space="preserve">Step 4: undo the digit substitution</w:t>
-      </w:r>
-    </w:p>
-    <w:p>
-      <w:pPr>
-        <w:pStyle w:val="FirstParagraph"/>
-      </w:pPr>
-      <w:r>
-        <w:t xml:space="preserve">The last layer is a simple key: 1 = a, 2 = b, … 9 = i. Concatenating the three streams in order and substituting resolves the whole thing into continuous prose.</w:t>
-      </w:r>
-    </w:p>
-    <w:p>
-      <w:pPr>
-        <w:pStyle w:val="BodyText"/>
-      </w:pPr>
-      <w:r>
-        <w:t xml:space="preserve">I used a bit of extra work to highlight the section that mentions his method, shown below</w:t>
-      </w:r>
-      <w:r>
-        <w:t xml:space="preserve"> </w:t>
-      </w:r>
-      <w:r>
-        <w:t xml:space="preserve">in French and translated into English</w:t>
-      </w:r>
-    </w:p>
-    <w:p>
-      <w:pPr>
-        <w:pStyle w:val="BodyText"/>
-      </w:pPr>
-      <w:r>
-        <w:t xml:space="preserve">Even with the word breaks still missing and a rough patch or two (likely a transcription slip somewhere in the 2010</w:t>
+        <w:t xml:space="preserve">Even with the word breaks missing and a rough patch or two (likely a transcription slip in our 2010</w:t>
       </w:r>
       <w:r>
         <w:t xml:space="preserve"> </w:t>
@@ -2340,7 +2121,7 @@
         <w:t xml:space="preserve">cipher.txt</w:t>
       </w:r>
       <w:r>
-        <w:t xml:space="preserve">, fifteen years old at this point), real seventeenth-century French is unmistakably there:</w:t>
+        <w:t xml:space="preserve">), real seventeenth-century French is unmistakably there:</w:t>
       </w:r>
       <w:r>
         <w:t xml:space="preserve"> </w:t>
@@ -2456,12 +2237,12 @@
         <w:pStyle w:val="BodyText"/>
       </w:pPr>
       <w:r>
-        <w:t xml:space="preserve">That’s the same instruction already quoted in English translation above, arriving from the other direction, out of a 380-year-old jumble of letters and digits. The full R code reproducing all four of Van Eycke’s steps, including the excerpt-highlighting logic, is on GitHub:</w:t>
-      </w:r>
-      <w:r>
-        <w:t xml:space="preserve"> </w:t>
-      </w:r>
-      <w:hyperlink r:id="rId43">
+        <w:t xml:space="preserve">The full R code reproducing all four steps is on GitHub:</w:t>
+      </w:r>
+      <w:r>
+        <w:t xml:space="preserve"> </w:t>
+      </w:r>
+      <w:hyperlink r:id="rId39">
         <w:r>
           <w:rPr>
             <w:rStyle w:val="VerbatimChar"/>
@@ -2473,9 +2254,9 @@
         <w:t xml:space="preserve">.</w:t>
       </w:r>
     </w:p>
-    <w:bookmarkEnd w:id="44"/>
-    <w:bookmarkEnd w:id="45"/>
-    <w:bookmarkStart w:id="58" w:name="what-van-langren-was-hiding"/>
+    <w:bookmarkEnd w:id="40"/>
+    <w:bookmarkEnd w:id="41"/>
+    <w:bookmarkStart w:id="54" w:name="what-van-langren-was-hiding"/>
     <w:p>
       <w:pPr>
         <w:pStyle w:val="Heading2"/>
@@ -2589,7 +2370,7 @@
       <w:tr>
         <w:tc>
           <w:tcPr/>
-          <w:bookmarkStart w:id="49" w:name="fig-waterclock"/>
+          <w:bookmarkStart w:id="45" w:name="fig-waterclock"/>
           <w:p>
             <w:pPr>
               <w:pStyle w:val="Compact"/>
@@ -2600,18 +2381,18 @@
                 <wp:inline>
                   <wp:extent cx="4267200" cy="2726266"/>
                   <wp:effectExtent b="0" l="0" r="0" t="0"/>
-                  <wp:docPr descr="" title="" id="47" name="Picture"/>
+                  <wp:docPr descr="" title="" id="43" name="Picture"/>
                   <a:graphic>
                     <a:graphicData uri="http://schemas.openxmlformats.org/drawingml/2006/picture">
                       <pic:pic>
                         <pic:nvPicPr>
-                          <pic:cNvPr descr="images/vanlangren-waterclock.png" id="48" name="Picture"/>
+                          <pic:cNvPr descr="images/vanlangren-waterclock.png" id="44" name="Picture"/>
                           <pic:cNvPicPr>
                             <a:picLocks noChangeArrowheads="1" noChangeAspect="1"/>
                           </pic:cNvPicPr>
                         </pic:nvPicPr>
                         <pic:blipFill>
-                          <a:blip r:embed="rId46"/>
+                          <a:blip r:embed="rId42"/>
                           <a:stretch>
                             <a:fillRect/>
                           </a:stretch>
@@ -2651,7 +2432,7 @@
               <w:t xml:space="preserve">Figure 4: How van Langren’s water-clock method was meant to determine longitude at sea.</w:t>
             </w:r>
           </w:p>
-          <w:bookmarkEnd w:id="49"/>
+          <w:bookmarkEnd w:id="45"/>
         </w:tc>
       </w:tr>
     </w:tbl>
@@ -2668,7 +2449,7 @@
       <w:tr>
         <w:tc>
           <w:tcPr/>
-          <w:bookmarkStart w:id="54" w:name="fig-harrison"/>
+          <w:bookmarkStart w:id="50" w:name="fig-harrison"/>
           <w:p>
             <w:pPr>
               <w:pStyle w:val="Compact"/>
@@ -2679,18 +2460,18 @@
                 <wp:inline>
                   <wp:extent cx="1270000" cy="1493520"/>
                   <wp:effectExtent b="0" l="0" r="0" t="0"/>
-                  <wp:docPr descr="" title="" id="51" name="Picture"/>
+                  <wp:docPr descr="" title="" id="47" name="Picture"/>
                   <a:graphic>
                     <a:graphicData uri="http://schemas.openxmlformats.org/drawingml/2006/picture">
                       <pic:pic>
                         <pic:nvPicPr>
-                          <pic:cNvPr descr="images/Harrison-H1_low_250.jpg" id="52" name="Picture"/>
+                          <pic:cNvPr descr="images/Harrison-H1_low_250.jpg" id="48" name="Picture"/>
                           <pic:cNvPicPr>
                             <a:picLocks noChangeArrowheads="1" noChangeAspect="1"/>
                           </pic:cNvPicPr>
                         </pic:nvPicPr>
                         <pic:blipFill>
-                          <a:blip r:embed="rId50"/>
+                          <a:blip r:embed="rId46"/>
                           <a:stretch>
                             <a:fillRect/>
                           </a:stretch>
@@ -2732,7 +2513,7 @@
             <w:r>
               <w:t xml:space="preserve"> </w:t>
             </w:r>
-            <w:hyperlink r:id="rId53">
+            <w:hyperlink r:id="rId49">
               <w:r>
                 <w:rPr>
                   <w:rStyle w:val="Hyperlink"/>
@@ -2744,7 +2525,7 @@
               <w:t xml:space="preserve">.</w:t>
             </w:r>
           </w:p>
-          <w:bookmarkEnd w:id="54"/>
+          <w:bookmarkEnd w:id="50"/>
         </w:tc>
       </w:tr>
     </w:tbl>
@@ -2758,7 +2539,7 @@
       <w:r>
         <w:t xml:space="preserve"> </w:t>
       </w:r>
-      <w:hyperlink r:id="rId55">
+      <w:hyperlink r:id="rId51">
         <w:r>
           <w:rPr>
             <w:rStyle w:val="Hyperlink"/>
@@ -2772,7 +2553,7 @@
       <w:r>
         <w:t xml:space="preserve"> </w:t>
       </w:r>
-      <w:hyperlink r:id="rId56">
+      <w:hyperlink r:id="rId52">
         <w:r>
           <w:rPr>
             <w:rStyle w:val="Hyperlink"/>
@@ -2797,7 +2578,7 @@
       <w:r>
         <w:t xml:space="preserve"> </w:t>
       </w:r>
-      <w:hyperlink r:id="rId57">
+      <w:hyperlink r:id="rId53">
         <w:r>
           <w:rPr>
             <w:rStyle w:val="Hyperlink"/>
@@ -2809,8 +2590,8 @@
         <w:t xml:space="preserve">, more than a century. He wasn’t naive. He was reaching for the best tool of his moment to solve a problem no tool of his era could actually solve.</w:t>
       </w:r>
     </w:p>
-    <w:bookmarkEnd w:id="58"/>
-    <w:bookmarkStart w:id="78" w:name="bonus-reproducing-langrens-1644-graph"/>
+    <w:bookmarkEnd w:id="54"/>
+    <w:bookmarkStart w:id="74" w:name="bonus-reproducing-langrens-1644-graph"/>
     <w:p>
       <w:pPr>
         <w:pStyle w:val="Heading2"/>
@@ -2835,7 +2616,7 @@
       <w:r>
         <w:t xml:space="preserve"> </w:t>
       </w:r>
-      <w:hyperlink r:id="rId59">
+      <w:hyperlink r:id="rId55">
         <w:r>
           <w:rPr>
             <w:rStyle w:val="Hyperlink"/>
@@ -3056,7 +2837,7 @@
       <w:r>
         <w:t xml:space="preserve"> </w:t>
       </w:r>
-      <w:hyperlink r:id="rId60">
+      <w:hyperlink r:id="rId56">
         <w:r>
           <w:rPr>
             <w:rStyle w:val="Hyperlink"/>
@@ -3073,7 +2854,7 @@
       <w:r>
         <w:t xml:space="preserve"> </w:t>
       </w:r>
-      <w:hyperlink r:id="rId61">
+      <w:hyperlink r:id="rId57">
         <w:r>
           <w:rPr>
             <w:rStyle w:val="Hyperlink"/>
@@ -3093,7 +2874,7 @@
       <w:r>
         <w:t xml:space="preserve"> </w:t>
       </w:r>
-      <w:hyperlink r:id="rId62">
+      <w:hyperlink r:id="rId58">
         <w:r>
           <w:rPr>
             <w:rStyle w:val="VerbatimChar"/>
@@ -3118,7 +2899,7 @@
       <w:tr>
         <w:tc>
           <w:tcPr/>
-          <w:bookmarkStart w:id="66" w:name="fig-overlay"/>
+          <w:bookmarkStart w:id="62" w:name="fig-overlay"/>
           <w:p>
             <w:pPr>
               <w:pStyle w:val="Compact"/>
@@ -3129,18 +2910,18 @@
                 <wp:inline>
                   <wp:extent cx="4620126" cy="914400"/>
                   <wp:effectExtent b="0" l="0" r="0" t="0"/>
-                  <wp:docPr descr="" title="" id="64" name="Picture"/>
+                  <wp:docPr descr="" title="" id="60" name="Picture"/>
                   <a:graphic>
                     <a:graphicData uri="http://schemas.openxmlformats.org/drawingml/2006/picture">
                       <pic:pic>
                         <pic:nvPicPr>
-                          <pic:cNvPr descr="vanLangren-Secret_files/figure-docx/fig-overlay-1.png" id="65" name="Picture"/>
+                          <pic:cNvPr descr="vanLangren-Secret_files/figure-docx/fig-overlay-1.png" id="61" name="Picture"/>
                           <pic:cNvPicPr>
                             <a:picLocks noChangeArrowheads="1" noChangeAspect="1"/>
                           </pic:cNvPicPr>
                         </pic:nvPicPr>
                         <pic:blipFill>
-                          <a:blip r:embed="rId63"/>
+                          <a:blip r:embed="rId59"/>
                           <a:stretch>
                             <a:fillRect/>
                           </a:stretch>
@@ -3180,7 +2961,7 @@
               <w:t xml:space="preserve">Figure 6: van Langren’s 1644 estimates, rebuilt layer by layer as an overlay on a modern map.</w:t>
             </w:r>
           </w:p>
-          <w:bookmarkEnd w:id="66"/>
+          <w:bookmarkEnd w:id="62"/>
         </w:tc>
       </w:tr>
     </w:tbl>
@@ -3204,7 +2985,7 @@
         <w:t xml:space="preserve">someone (him) deserved a reward for having a better one.</w:t>
       </w:r>
     </w:p>
-    <w:bookmarkStart w:id="77" w:name="i-did-that-better-by-hand"/>
+    <w:bookmarkStart w:id="73" w:name="i-did-that-better-by-hand"/>
     <w:p>
       <w:pPr>
         <w:pStyle w:val="Heading3"/>
@@ -3339,7 +3120,7 @@
       <w:tr>
         <w:tc>
           <w:tcPr/>
-          <w:bookmarkStart w:id="70" w:name="fig-1644-original"/>
+          <w:bookmarkStart w:id="66" w:name="fig-1644-original"/>
           <w:p>
             <w:pPr>
               <w:pStyle w:val="Compact"/>
@@ -3350,18 +3131,18 @@
                 <wp:inline>
                   <wp:extent cx="5334000" cy="1349828"/>
                   <wp:effectExtent b="0" l="0" r="0" t="0"/>
-                  <wp:docPr descr="" title="" id="68" name="Picture"/>
+                  <wp:docPr descr="" title="" id="64" name="Picture"/>
                   <a:graphic>
                     <a:graphicData uri="http://schemas.openxmlformats.org/drawingml/2006/picture">
                       <pic:pic>
                         <pic:nvPicPr>
-                          <pic:cNvPr descr="images/Langren1644.jpg" id="69" name="Picture"/>
+                          <pic:cNvPr descr="images/Langren1644.jpg" id="65" name="Picture"/>
                           <pic:cNvPicPr>
                             <a:picLocks noChangeArrowheads="1" noChangeAspect="1"/>
                           </pic:cNvPicPr>
                         </pic:nvPicPr>
                         <pic:blipFill>
-                          <a:blip r:embed="rId67"/>
+                          <a:blip r:embed="rId63"/>
                           <a:stretch>
                             <a:fillRect/>
                           </a:stretch>
@@ -3401,7 +3182,7 @@
               <w:t xml:space="preserve">Figure 7: Van Langren’s original 1644 graph</w:t>
             </w:r>
           </w:p>
-          <w:bookmarkEnd w:id="70"/>
+          <w:bookmarkEnd w:id="66"/>
         </w:tc>
       </w:tr>
     </w:tbl>
@@ -3432,7 +3213,7 @@
       <w:pPr>
         <w:numPr>
           <w:ilvl w:val="0"/>
-          <w:numId w:val="1002"/>
+          <w:numId w:val="1001"/>
         </w:numPr>
       </w:pPr>
       <w:r>
@@ -3515,7 +3296,7 @@
       <w:pPr>
         <w:numPr>
           <w:ilvl w:val="0"/>
-          <w:numId w:val="1002"/>
+          <w:numId w:val="1001"/>
         </w:numPr>
       </w:pPr>
       <w:r>
@@ -3656,7 +3437,7 @@
       <w:pPr>
         <w:numPr>
           <w:ilvl w:val="0"/>
-          <w:numId w:val="1002"/>
+          <w:numId w:val="1001"/>
         </w:numPr>
       </w:pPr>
       <w:r>
@@ -3740,7 +3521,7 @@
       <w:r>
         <w:t xml:space="preserve"> </w:t>
       </w:r>
-      <w:hyperlink r:id="rId71">
+      <w:hyperlink r:id="rId67">
         <w:r>
           <w:rPr>
             <w:rStyle w:val="VerbatimChar"/>
@@ -3776,7 +3557,7 @@
       <w:tr>
         <w:tc>
           <w:tcPr/>
-          <w:bookmarkStart w:id="75" w:name="fig-reconstruction"/>
+          <w:bookmarkStart w:id="71" w:name="fig-reconstruction"/>
           <w:p>
             <w:pPr>
               <w:pStyle w:val="Compact"/>
@@ -3787,18 +3568,18 @@
                 <wp:inline>
                   <wp:extent cx="5334000" cy="1143000"/>
                   <wp:effectExtent b="0" l="0" r="0" t="0"/>
-                  <wp:docPr descr="" title="" id="73" name="Picture"/>
+                  <wp:docPr descr="" title="" id="69" name="Picture"/>
                   <a:graphic>
                     <a:graphicData uri="http://schemas.openxmlformats.org/drawingml/2006/picture">
                       <pic:pic>
                         <pic:nvPicPr>
-                          <pic:cNvPr descr="vanLangren-Secret_files/figure-docx/fig-reconstruction-1.png" id="74" name="Picture"/>
+                          <pic:cNvPr descr="vanLangren-Secret_files/figure-docx/fig-reconstruction-1.png" id="70" name="Picture"/>
                           <pic:cNvPicPr>
                             <a:picLocks noChangeArrowheads="1" noChangeAspect="1"/>
                           </pic:cNvPicPr>
                         </pic:nvPicPr>
                         <pic:blipFill>
-                          <a:blip r:embed="rId72"/>
+                          <a:blip r:embed="rId68"/>
                           <a:stretch>
                             <a:fillRect/>
                           </a:stretch>
@@ -3838,7 +3619,7 @@
               <w:t xml:space="preserve">Figure 8: A ggplot2 reconstruction of van Langren’s 1644 graph.</w:t>
             </w:r>
           </w:p>
-          <w:bookmarkEnd w:id="75"/>
+          <w:bookmarkEnd w:id="71"/>
         </w:tc>
       </w:tr>
     </w:tbl>
@@ -3897,7 +3678,7 @@
       <w:r>
         <w:t xml:space="preserve"> </w:t>
       </w:r>
-      <w:hyperlink r:id="rId76">
+      <w:hyperlink r:id="rId72">
         <w:r>
           <w:rPr>
             <w:rStyle w:val="Hyperlink"/>
@@ -3941,9 +3722,9 @@
         <w:t xml:space="preserve">true answer of 16°31’.</w:t>
       </w:r>
     </w:p>
-    <w:bookmarkEnd w:id="77"/>
-    <w:bookmarkEnd w:id="78"/>
-    <w:bookmarkStart w:id="85" w:name="every-cipher-tells-a-story"/>
+    <w:bookmarkEnd w:id="73"/>
+    <w:bookmarkEnd w:id="74"/>
+    <w:bookmarkStart w:id="81" w:name="every-cipher-tells-a-story"/>
     <w:p>
       <w:pPr>
         <w:pStyle w:val="Heading2"/>
@@ -4051,8 +3832,8 @@
         <w:t xml:space="preserve">The shock of finding our interpretation wrong is replaced, in the end, by a feeling of satisfaction in being able to right the ship of history.</w:t>
       </w:r>
     </w:p>
-    <w:bookmarkStart w:id="84" w:name="refs"/>
-    <w:bookmarkStart w:id="79" w:name="ref-Friendly:2006:hbook"/>
+    <w:bookmarkStart w:id="80" w:name="refs"/>
+    <w:bookmarkStart w:id="75" w:name="ref-Friendly:2006:hbook"/>
     <w:p>
       <w:pPr>
         <w:pStyle w:val="Bibliography"/>
@@ -4086,8 +3867,8 @@
         <w:t xml:space="preserve">, edited by C. Chen, Wolfgang Härdle, and Antony Unwin, III. Springer-Verlag.</w:t>
       </w:r>
     </w:p>
-    <w:bookmarkEnd w:id="79"/>
-    <w:bookmarkStart w:id="81" w:name="ref-FriendlyChevaliers:2020"/>
+    <w:bookmarkEnd w:id="75"/>
+    <w:bookmarkStart w:id="77" w:name="ref-FriendlyChevaliers:2020"/>
     <w:p>
       <w:pPr>
         <w:pStyle w:val="Bibliography"/>
@@ -4114,7 +3895,7 @@
       <w:r>
         <w:t xml:space="preserve"> </w:t>
       </w:r>
-      <w:hyperlink r:id="rId80">
+      <w:hyperlink r:id="rId76">
         <w:r>
           <w:rPr>
             <w:rStyle w:val="Hyperlink"/>
@@ -4126,8 +3907,8 @@
         <w:t xml:space="preserve">.</w:t>
       </w:r>
     </w:p>
-    <w:bookmarkEnd w:id="81"/>
-    <w:bookmarkStart w:id="83" w:name="ref-Friendly:2010:langren"/>
+    <w:bookmarkEnd w:id="77"/>
+    <w:bookmarkStart w:id="79" w:name="ref-Friendly:2010:langren"/>
     <w:p>
       <w:pPr>
         <w:pStyle w:val="Bibliography"/>
@@ -4199,7 +3980,7 @@
       <w:r>
         <w:t xml:space="preserve"> </w:t>
       </w:r>
-      <w:hyperlink r:id="rId82">
+      <w:hyperlink r:id="rId78">
         <w:r>
           <w:rPr>
             <w:rStyle w:val="Hyperlink"/>
@@ -4211,9 +3992,9 @@
         <w:t xml:space="preserve">.</w:t>
       </w:r>
     </w:p>
-    <w:bookmarkEnd w:id="83"/>
-    <w:bookmarkEnd w:id="84"/>
-    <w:bookmarkEnd w:id="85"/>
+    <w:bookmarkEnd w:id="79"/>
+    <w:bookmarkEnd w:id="80"/>
+    <w:bookmarkEnd w:id="81"/>
     <w:sectPr/>
   </w:body>
 </w:document>
@@ -4239,7 +4020,7 @@
       </w:r>
     </w:p>
   </w:footnote>
-  <w:footnote w:id="15">
+  <w:footnote w:id="14">
     <w:p>
       <w:pPr>
         <w:pStyle w:val="FootnoteText"/>
@@ -4254,7 +4035,7 @@
         <w:t xml:space="preserve"> </w:t>
       </w:r>
       <w:r>
-        <w:t xml:space="preserve">The astronomers in van Langren’s graph estimated longitude by several methods, all theoretically sound but practically limited:</w:t>
+        <w:t xml:space="preserve">The astronomers’ methods were theoretically sound but practically limited: timing</w:t>
       </w:r>
       <w:r>
         <w:t xml:space="preserve"> </w:t>
@@ -4270,7 +4051,7 @@
         <w:t xml:space="preserve"> </w:t>
       </w:r>
       <w:r>
-        <w:t xml:space="preserve">(both observers record local time when the moon enters or exits Earth’s shadow — simultaneous everywhere, so the time difference gives the longitude difference, but eclipses are rare);</w:t>
+        <w:t xml:space="preserve">or</w:t>
       </w:r>
       <w:r>
         <w:t xml:space="preserve"> </w:t>
@@ -4280,13 +4061,13 @@
           <w:b/>
           <w:bCs/>
         </w:rPr>
-        <w:t xml:space="preserve">lunar distances</w:t>
-      </w:r>
-      <w:r>
-        <w:t xml:space="preserve"> </w:t>
-      </w:r>
-      <w:r>
-        <w:t xml:space="preserve">(measuring the angle between the moon and a reference star, since the moon moves ~0.5° per hour against the stars — proposed by Regiomontanus in the 1470s, but requiring accurate lunar tables that didn’t yet exist); and</w:t>
+        <w:t xml:space="preserve">occultations</w:t>
+      </w:r>
+      <w:r>
+        <w:t xml:space="preserve"> </w:t>
+      </w:r>
+      <w:r>
+        <w:t xml:space="preserve">(the moon passing in front of a star) from two places—both rare events—or measuring</w:t>
       </w:r>
       <w:r>
         <w:t xml:space="preserve"> </w:t>
@@ -4296,17 +4077,14 @@
           <w:b/>
           <w:bCs/>
         </w:rPr>
-        <w:t xml:space="preserve">occultations</w:t>
-      </w:r>
-      <w:r>
-        <w:t xml:space="preserve"> </w:t>
-      </w:r>
-      <w:r>
-        <w:t xml:space="preserve">(the moon passing in front of a star — sharp-edged and predictable, but again rare). Some estimates were less astronomical still, built up from travellers’ accumulated records of distances and directions. Tycho Brahe’s estimate, made with the finest pre-telescopic instruments of the age, was the best of the lot — and still badly wrong. That was the point.</w:t>
+        <w:t xml:space="preserve">lunar distances</w:t>
+      </w:r>
+      <w:r>
+        <w:t xml:space="preserve">, the moon’s angle to a reference star, which required lunar tables that didn’t yet exist. Some estimates came simply from travellers’ records. Even Tycho Brahe’s, made with the finest pre-telescopic instruments of the age, was badly wrong. That was the point.</w:t>
       </w:r>
     </w:p>
   </w:footnote>
-  <w:footnote w:id="34">
+  <w:footnote w:id="31">
     <w:p>
       <w:pPr>
         <w:pStyle w:val="FootnoteText"/>
@@ -4321,13 +4099,13 @@
         <w:t xml:space="preserve"> </w:t>
       </w:r>
       <w:r>
-        <w:t xml:space="preserve">The Zodiac Killer is one of the infamous unsolved mysteries in American criminal history.</w:t>
-      </w:r>
-      <w:r>
-        <w:t xml:space="preserve"> </w:t>
-      </w:r>
-      <w:r>
-        <w:t xml:space="preserve">In the San Francisco Bay area in the 1968–1969s, this unknown murder killed at least five people.</w:t>
+        <w:t xml:space="preserve">The Zodiac Killer is one of the most infamous unsolved mysteries in American criminal history.</w:t>
+      </w:r>
+      <w:r>
+        <w:t xml:space="preserve"> </w:t>
+      </w:r>
+      <w:r>
+        <w:t xml:space="preserve">In the San Francisco Bay Area in 1968–1969, this unknown murderer killed at least five people.</w:t>
       </w:r>
       <w:r>
         <w:t xml:space="preserve"> </w:t>
@@ -4339,82 +4117,54 @@
         <w:t xml:space="preserve"> </w:t>
       </w:r>
       <w:r>
-        <w:t xml:space="preserve">describing his acts. Van Eycke’s solution was hailed as a break-through in amateur cryptographic circles.</w:t>
+        <w:t xml:space="preserve">describing his acts. Van Eycke’s solution was hailed as a breakthrough in amateur cryptographic circles.</w:t>
+      </w:r>
+    </w:p>
+  </w:footnote>
+  <w:footnote w:id="35">
+    <w:p>
+      <w:pPr>
+        <w:pStyle w:val="FootnoteText"/>
+      </w:pPr>
+      <w:r>
+        <w:rPr>
+          <w:rStyle w:val="FootnoteReference"/>
+        </w:rPr>
+        <w:footnoteRef/>
+      </w:r>
+      <w:r>
+        <w:t xml:space="preserve"> </w:t>
+      </w:r>
+      <w:r>
+        <w:t xml:space="preserve">Letter-trigram statistics measure the frequency of overlapping three-letter sequences in a language (e.g.,</w:t>
+      </w:r>
+      <w:r>
+        <w:t xml:space="preserve"> </w:t>
+      </w:r>
+      <w:r>
+        <w:t xml:space="preserve">“the,”</w:t>
+      </w:r>
+      <w:r>
+        <w:t xml:space="preserve"> </w:t>
+      </w:r>
+      <w:r>
+        <w:t xml:space="preserve">“and”</w:t>
+      </w:r>
+      <w:r>
+        <w:t xml:space="preserve">). Analysts use them as a</w:t>
+      </w:r>
+      <w:r>
+        <w:t xml:space="preserve"> </w:t>
+      </w:r>
+      <w:r>
+        <w:t xml:space="preserve">“fitness score”</w:t>
+      </w:r>
+      <w:r>
+        <w:t xml:space="preserve">: the closer a proposed decryption comes to the trigram frequencies of a real language, the more likely it is correct.</w:t>
       </w:r>
     </w:p>
   </w:footnote>
   <w:footnote w:id="36">
-    <w:p>
-      <w:pPr>
-        <w:pStyle w:val="FootnoteText"/>
-      </w:pPr>
-      <w:r>
-        <w:rPr>
-          <w:rStyle w:val="FootnoteReference"/>
-        </w:rPr>
-        <w:footnoteRef/>
-      </w:r>
-      <w:r>
-        <w:t xml:space="preserve"> </w:t>
-      </w:r>
-      <w:r>
-        <w:t xml:space="preserve">In cryptography, letter-trigram statistics involve measuring the frequency of overlapping three-letter sequences in a language (e.g.,</w:t>
-      </w:r>
-      <w:r>
-        <w:t xml:space="preserve"> </w:t>
-      </w:r>
-      <w:r>
-        <w:t xml:space="preserve">“the,”</w:t>
-      </w:r>
-      <w:r>
-        <w:t xml:space="preserve"> </w:t>
-      </w:r>
-      <w:r>
-        <w:t xml:space="preserve">“and”</w:t>
-      </w:r>
-      <w:r>
-        <w:t xml:space="preserve">). Analysts use these patterns as a</w:t>
-      </w:r>
-      <w:r>
-        <w:t xml:space="preserve"> </w:t>
-      </w:r>
-      <w:r>
-        <w:t xml:space="preserve">“fitness score”</w:t>
-      </w:r>
-      <w:r>
-        <w:t xml:space="preserve"> </w:t>
-      </w:r>
-      <w:r>
-        <w:t xml:space="preserve">to evaluate text coherence. If a proposed decryption matches the statistical probability of real-language trigrams, the plaintext is considered a valid decoding. A useful introduction to historical cryptography is</w:t>
-      </w:r>
-      <w:r>
-        <w:t xml:space="preserve"> </w:t>
-      </w:r>
-      <w:r>
-        <w:t xml:space="preserve">Nigel Smart’s</w:t>
-      </w:r>
-      <w:r>
-        <w:t xml:space="preserve"> </w:t>
-      </w:r>
-      <w:hyperlink r:id="rId37">
-        <w:r>
-          <w:rPr>
-            <w:rStyle w:val="Hyperlink"/>
-            <w:i/>
-            <w:iCs/>
-          </w:rPr>
-          <w:t xml:space="preserve">Cryptography: An Introduction</w:t>
-        </w:r>
-        <w:r>
-          <w:rPr>
-            <w:rStyle w:val="Hyperlink"/>
-          </w:rPr>
-          <w:t xml:space="preserve">, Ch 3</w:t>
-        </w:r>
-      </w:hyperlink>
-    </w:p>
-  </w:footnote>
-  <w:footnote w:id="40">
     <w:p>
       <w:pPr>
         <w:pStyle w:val="FootnoteText"/>
@@ -4684,9 +4434,6 @@
     <w:abstractNumId w:val="990"/>
   </w:num>
   <w:num w:numId="1001">
-    <w:abstractNumId w:val="991"/>
-  </w:num>
-  <w:num w:numId="1002">
     <w:abstractNumId w:val="991"/>
   </w:num>
 </w:numbering>

</xml_diff>

<commit_message>
Shorten Bonus overlay part; footnote pointing to repo and blog post
- Replace overlay text, chunks and figure with a short paragraph naming
  the three numbered layers and pointing to Fig. 2
- Script mentions as R/<file>.R repo paths
- Footnote at first mention of R code: GitHub repo + original blog post
- Drop dangling sentence fragment in Bonus intro

Co-Authored-By: Claude Opus 5.5 <noreply@anthropic.com>
</commit_message>
<xml_diff>
--- a/vanLangren-Secret.docx
+++ b/vanLangren-Secret.docx
@@ -1287,7 +1287,7 @@
       </w:r>
     </w:p>
     <w:bookmarkEnd w:id="28"/>
-    <w:bookmarkStart w:id="41" w:name="the-cipher-falls"/>
+    <w:bookmarkStart w:id="44" w:name="the-cipher-falls"/>
     <w:p>
       <w:pPr>
         <w:pStyle w:val="Heading2"/>
@@ -1983,7 +1983,7 @@
       </w:r>
     </w:p>
     <w:bookmarkEnd w:id="38"/>
-    <w:bookmarkStart w:id="40" w:name="step-4-undo-the-digit-substitution"/>
+    <w:bookmarkStart w:id="43" w:name="step-4-undo-the-digit-substitution"/>
     <w:p>
       <w:pPr>
         <w:pStyle w:val="Heading3"/>
@@ -2237,7 +2237,7 @@
         <w:pStyle w:val="BodyText"/>
       </w:pPr>
       <w:r>
-        <w:t xml:space="preserve">The full R code reproducing all four steps is on GitHub:</w:t>
+        <w:t xml:space="preserve">The full R code reproducing all four steps is in</w:t>
       </w:r>
       <w:r>
         <w:t xml:space="preserve"> </w:t>
@@ -2247,16 +2247,22 @@
           <w:rPr>
             <w:rStyle w:val="VerbatimChar"/>
           </w:rPr>
-          <w:t xml:space="preserve">decode-cipher.R</w:t>
+          <w:t xml:space="preserve">R/decode-cipher.R</w:t>
         </w:r>
       </w:hyperlink>
       <w:r>
         <w:t xml:space="preserve">.</w:t>
       </w:r>
-    </w:p>
-    <w:bookmarkEnd w:id="40"/>
-    <w:bookmarkEnd w:id="41"/>
-    <w:bookmarkStart w:id="54" w:name="what-van-langren-was-hiding"/>
+      <w:r>
+        <w:rPr>
+          <w:rStyle w:val="FootnoteReference"/>
+        </w:rPr>
+        <w:footnoteReference w:id="40"/>
+      </w:r>
+    </w:p>
+    <w:bookmarkEnd w:id="43"/>
+    <w:bookmarkEnd w:id="44"/>
+    <w:bookmarkStart w:id="57" w:name="what-van-langren-was-hiding"/>
     <w:p>
       <w:pPr>
         <w:pStyle w:val="Heading2"/>
@@ -2370,7 +2376,7 @@
       <w:tr>
         <w:tc>
           <w:tcPr/>
-          <w:bookmarkStart w:id="45" w:name="fig-waterclock"/>
+          <w:bookmarkStart w:id="48" w:name="fig-waterclock"/>
           <w:p>
             <w:pPr>
               <w:pStyle w:val="Compact"/>
@@ -2381,18 +2387,18 @@
                 <wp:inline>
                   <wp:extent cx="4267200" cy="2726266"/>
                   <wp:effectExtent b="0" l="0" r="0" t="0"/>
-                  <wp:docPr descr="" title="" id="43" name="Picture"/>
+                  <wp:docPr descr="" title="" id="46" name="Picture"/>
                   <a:graphic>
                     <a:graphicData uri="http://schemas.openxmlformats.org/drawingml/2006/picture">
                       <pic:pic>
                         <pic:nvPicPr>
-                          <pic:cNvPr descr="images/vanlangren-waterclock.png" id="44" name="Picture"/>
+                          <pic:cNvPr descr="images/vanlangren-waterclock.png" id="47" name="Picture"/>
                           <pic:cNvPicPr>
                             <a:picLocks noChangeArrowheads="1" noChangeAspect="1"/>
                           </pic:cNvPicPr>
                         </pic:nvPicPr>
                         <pic:blipFill>
-                          <a:blip r:embed="rId42"/>
+                          <a:blip r:embed="rId45"/>
                           <a:stretch>
                             <a:fillRect/>
                           </a:stretch>
@@ -2432,7 +2438,7 @@
               <w:t xml:space="preserve">Figure 4: How van Langren’s water-clock method was meant to determine longitude at sea.</w:t>
             </w:r>
           </w:p>
-          <w:bookmarkEnd w:id="45"/>
+          <w:bookmarkEnd w:id="48"/>
         </w:tc>
       </w:tr>
     </w:tbl>
@@ -2449,7 +2455,7 @@
       <w:tr>
         <w:tc>
           <w:tcPr/>
-          <w:bookmarkStart w:id="50" w:name="fig-harrison"/>
+          <w:bookmarkStart w:id="53" w:name="fig-harrison"/>
           <w:p>
             <w:pPr>
               <w:pStyle w:val="Compact"/>
@@ -2460,18 +2466,18 @@
                 <wp:inline>
                   <wp:extent cx="1270000" cy="1493520"/>
                   <wp:effectExtent b="0" l="0" r="0" t="0"/>
-                  <wp:docPr descr="" title="" id="47" name="Picture"/>
+                  <wp:docPr descr="" title="" id="50" name="Picture"/>
                   <a:graphic>
                     <a:graphicData uri="http://schemas.openxmlformats.org/drawingml/2006/picture">
                       <pic:pic>
                         <pic:nvPicPr>
-                          <pic:cNvPr descr="images/Harrison-H1_low_250.jpg" id="48" name="Picture"/>
+                          <pic:cNvPr descr="images/Harrison-H1_low_250.jpg" id="51" name="Picture"/>
                           <pic:cNvPicPr>
                             <a:picLocks noChangeArrowheads="1" noChangeAspect="1"/>
                           </pic:cNvPicPr>
                         </pic:nvPicPr>
                         <pic:blipFill>
-                          <a:blip r:embed="rId46"/>
+                          <a:blip r:embed="rId49"/>
                           <a:stretch>
                             <a:fillRect/>
                           </a:stretch>
@@ -2513,7 +2519,7 @@
             <w:r>
               <w:t xml:space="preserve"> </w:t>
             </w:r>
-            <w:hyperlink r:id="rId49">
+            <w:hyperlink r:id="rId52">
               <w:r>
                 <w:rPr>
                   <w:rStyle w:val="Hyperlink"/>
@@ -2525,7 +2531,7 @@
               <w:t xml:space="preserve">.</w:t>
             </w:r>
           </w:p>
-          <w:bookmarkEnd w:id="50"/>
+          <w:bookmarkEnd w:id="53"/>
         </w:tc>
       </w:tr>
     </w:tbl>
@@ -2539,7 +2545,7 @@
       <w:r>
         <w:t xml:space="preserve"> </w:t>
       </w:r>
-      <w:hyperlink r:id="rId51">
+      <w:hyperlink r:id="rId54">
         <w:r>
           <w:rPr>
             <w:rStyle w:val="Hyperlink"/>
@@ -2553,7 +2559,7 @@
       <w:r>
         <w:t xml:space="preserve"> </w:t>
       </w:r>
-      <w:hyperlink r:id="rId52">
+      <w:hyperlink r:id="rId55">
         <w:r>
           <w:rPr>
             <w:rStyle w:val="Hyperlink"/>
@@ -2578,7 +2584,7 @@
       <w:r>
         <w:t xml:space="preserve"> </w:t>
       </w:r>
-      <w:hyperlink r:id="rId53">
+      <w:hyperlink r:id="rId56">
         <w:r>
           <w:rPr>
             <w:rStyle w:val="Hyperlink"/>
@@ -2590,8 +2596,8 @@
         <w:t xml:space="preserve">, more than a century. He wasn’t naive. He was reaching for the best tool of his moment to solve a problem no tool of his era could actually solve.</w:t>
       </w:r>
     </w:p>
-    <w:bookmarkEnd w:id="54"/>
-    <w:bookmarkStart w:id="74" w:name="bonus-reproducing-langrens-1644-graph"/>
+    <w:bookmarkEnd w:id="57"/>
+    <w:bookmarkStart w:id="73" w:name="bonus-reproducing-langrens-1644-graph"/>
     <w:p>
       <w:pPr>
         <w:pStyle w:val="Heading2"/>
@@ -2616,7 +2622,7 @@
       <w:r>
         <w:t xml:space="preserve"> </w:t>
       </w:r>
-      <w:hyperlink r:id="rId55">
+      <w:hyperlink r:id="rId58">
         <w:r>
           <w:rPr>
             <w:rStyle w:val="Hyperlink"/>
@@ -2717,7 +2723,7 @@
         <w:t xml:space="preserve"> </w:t>
       </w:r>
       <w:r>
-        <w:t xml:space="preserve">to appreciate the historical ingenuity and sheer brilliance of hand-drawn graphics and reveal design flaws, such as distorted scales. Sometimes, the code you write to reproduce a graph</w:t>
+        <w:t xml:space="preserve">to appreciate the historical ingenuity and sheer brilliance of hand-drawn graphics and reveal design flaws, such as distorted scales.</w:t>
       </w:r>
     </w:p>
     <w:p>
@@ -2787,7 +2793,21 @@
         <w:pStyle w:val="BodyText"/>
       </w:pPr>
       <w:r>
-        <w:t xml:space="preserve">The data behind van Langren’s famous 1D dot plot are in</w:t>
+        <w:t xml:space="preserve">My first goal was to reproduce something like</w:t>
+      </w:r>
+      <w:r>
+        <w:t xml:space="preserve"> </w:t>
+      </w:r>
+      <w:hyperlink w:anchor="fig-1644-overlay">
+        <w:r>
+          <w:rPr>
+            <w:rStyle w:val="Hyperlink"/>
+          </w:rPr>
+          <w:t xml:space="preserve">Figure 2</w:t>
+        </w:r>
+      </w:hyperlink>
+      <w:r>
+        <w:t xml:space="preserve">: van Langren’s estimates overlaid on a modern map. The data are in</w:t>
       </w:r>
       <w:r>
         <w:t xml:space="preserve"> </w:t>
@@ -2799,25 +2819,7 @@
         <w:t xml:space="preserve">HistData::Langren1644</w:t>
       </w:r>
       <w:r>
-        <w:t xml:space="preserve">, which also</w:t>
-      </w:r>
-      <w:r>
-        <w:t xml:space="preserve"> </w:t>
-      </w:r>
-      <w:r>
-        <w:t xml:space="preserve">provides the Google map image used as a backdrop. Rebuilding it is a matter of three</w:t>
-      </w:r>
-      <w:r>
-        <w:t xml:space="preserve"> </w:t>
-      </w:r>
-      <w:r>
-        <w:t xml:space="preserve">layers—the map itself, city markers for Toledo and Rome, and the dot plot on top—each</w:t>
-      </w:r>
-      <w:r>
-        <w:t xml:space="preserve"> </w:t>
-      </w:r>
-      <w:r>
-        <w:t xml:space="preserve">written as its own function, the same trick I use elsewhere in</w:t>
+        <w:t xml:space="preserve">, which also provides the Google map image used as a backdrop. Rebuilding it takes three layers, each written as its own function: (1) the map itself; (2) city markers for Toledo and Rome; and (3) the dot plot on top—the same trick I use elsewhere in</w:t>
       </w:r>
       <w:r>
         <w:t xml:space="preserve"> </w:t>
@@ -2837,7 +2839,7 @@
       <w:r>
         <w:t xml:space="preserve"> </w:t>
       </w:r>
-      <w:hyperlink r:id="rId56">
+      <w:hyperlink r:id="rId59">
         <w:r>
           <w:rPr>
             <w:rStyle w:val="Hyperlink"/>
@@ -2854,7 +2856,7 @@
       <w:r>
         <w:t xml:space="preserve"> </w:t>
       </w:r>
-      <w:hyperlink r:id="rId57">
+      <w:hyperlink r:id="rId60">
         <w:r>
           <w:rPr>
             <w:rStyle w:val="Hyperlink"/>
@@ -2869,21 +2871,132 @@
         <w:t xml:space="preserve"> </w:t>
       </w:r>
       <w:r>
-        <w:t xml:space="preserve">The full script is on GitHub:</w:t>
-      </w:r>
-      <w:r>
-        <w:t xml:space="preserve"> </w:t>
-      </w:r>
-      <w:hyperlink r:id="rId58">
+        <w:t xml:space="preserve">The script is</w:t>
+      </w:r>
+      <w:r>
+        <w:t xml:space="preserve"> </w:t>
+      </w:r>
+      <w:hyperlink r:id="rId61">
         <w:r>
           <w:rPr>
             <w:rStyle w:val="VerbatimChar"/>
           </w:rPr>
-          <w:t xml:space="preserve">reproduce-langren-overlay.R</w:t>
+          <w:t xml:space="preserve">R/reproduce-langren-overlay.R</w:t>
         </w:r>
       </w:hyperlink>
       <w:r>
         <w:t xml:space="preserve">.</w:t>
+      </w:r>
+    </w:p>
+    <w:bookmarkStart w:id="72" w:name="i-did-that-better-by-hand"/>
+    <w:p>
+      <w:pPr>
+        <w:pStyle w:val="Heading3"/>
+      </w:pPr>
+      <w:r>
+        <w:t xml:space="preserve">“I did that better by hand!”</w:t>
+      </w:r>
+    </w:p>
+    <w:p>
+      <w:pPr>
+        <w:pStyle w:val="FirstParagraph"/>
+      </w:pPr>
+      <w:r>
+        <w:t xml:space="preserve">A map overlay answers the</w:t>
+      </w:r>
+      <w:r>
+        <w:t xml:space="preserve"> </w:t>
+      </w:r>
+      <w:r>
+        <w:rPr>
+          <w:i/>
+          <w:iCs/>
+        </w:rPr>
+        <w:t xml:space="preserve">argument</w:t>
+      </w:r>
+      <w:r>
+        <w:t xml:space="preserve"> </w:t>
+      </w:r>
+      <w:r>
+        <w:t xml:space="preserve">well enough. But re-visioning in the deeper</w:t>
+      </w:r>
+      <w:r>
+        <w:t xml:space="preserve"> </w:t>
+      </w:r>
+      <w:r>
+        <w:t xml:space="preserve">sense means trying to reproduce the</w:t>
+      </w:r>
+      <w:r>
+        <w:t xml:space="preserve"> </w:t>
+      </w:r>
+      <w:r>
+        <w:rPr>
+          <w:i/>
+          <w:iCs/>
+        </w:rPr>
+        <w:t xml:space="preserve">artifact</w:t>
+      </w:r>
+      <w:r>
+        <w:t xml:space="preserve">—the spare white strip, the figure-8</w:t>
+      </w:r>
+      <w:r>
+        <w:t xml:space="preserve"> </w:t>
+      </w:r>
+      <w:r>
+        <w:t xml:space="preserve">snowman markers, the italic lettering. Imagine showing van Langren the map overlay;</w:t>
+      </w:r>
+      <w:r>
+        <w:t xml:space="preserve"> </w:t>
+      </w:r>
+      <w:r>
+        <w:t xml:space="preserve">he studies it for a moment and turns up his nose and says:</w:t>
+      </w:r>
+    </w:p>
+    <w:p>
+      <w:pPr>
+        <w:pStyle w:val="BlockText"/>
+      </w:pPr>
+      <w:r>
+        <w:rPr>
+          <w:i/>
+          <w:iCs/>
+        </w:rPr>
+        <w:t xml:space="preserve">“I did that better by hand!”</w:t>
+      </w:r>
+    </w:p>
+    <w:p>
+      <w:pPr>
+        <w:pStyle w:val="FirstParagraph"/>
+      </w:pPr>
+      <w:r>
+        <w:t xml:space="preserve">He has a point. Each of his snowman markers was hand-engraved on a copper plate; each name</w:t>
+      </w:r>
+      <w:r>
+        <w:t xml:space="preserve"> </w:t>
+      </w:r>
+      <w:r>
+        <w:t xml:space="preserve">individually scratched in by the engraver. The uniformity</w:t>
+      </w:r>
+      <w:r>
+        <w:t xml:space="preserve"> </w:t>
+      </w:r>
+      <w:r>
+        <w:rPr>
+          <w:rStyle w:val="VerbatimChar"/>
+        </w:rPr>
+        <w:t xml:space="preserve">ggplot2</w:t>
+      </w:r>
+      <w:r>
+        <w:t xml:space="preserve"> </w:t>
+      </w:r>
+      <w:r>
+        <w:t xml:space="preserve">achieves in milliseconds would have taken hours of skilled</w:t>
+      </w:r>
+      <w:r>
+        <w:t xml:space="preserve"> </w:t>
+      </w:r>
+      <w:r>
+        <w:t xml:space="preserve">labour in 1644. So: how close can we get?</w:t>
       </w:r>
     </w:p>
     <w:tbl>
@@ -2899,228 +3012,7 @@
       <w:tr>
         <w:tc>
           <w:tcPr/>
-          <w:bookmarkStart w:id="62" w:name="fig-overlay"/>
-          <w:p>
-            <w:pPr>
-              <w:pStyle w:val="Compact"/>
-              <w:jc w:val="center"/>
-            </w:pPr>
-            <w:r>
-              <w:drawing>
-                <wp:inline>
-                  <wp:extent cx="4620126" cy="914400"/>
-                  <wp:effectExtent b="0" l="0" r="0" t="0"/>
-                  <wp:docPr descr="" title="" id="60" name="Picture"/>
-                  <a:graphic>
-                    <a:graphicData uri="http://schemas.openxmlformats.org/drawingml/2006/picture">
-                      <pic:pic>
-                        <pic:nvPicPr>
-                          <pic:cNvPr descr="vanLangren-Secret_files/figure-docx/fig-overlay-1.png" id="61" name="Picture"/>
-                          <pic:cNvPicPr>
-                            <a:picLocks noChangeArrowheads="1" noChangeAspect="1"/>
-                          </pic:cNvPicPr>
-                        </pic:nvPicPr>
-                        <pic:blipFill>
-                          <a:blip r:embed="rId59"/>
-                          <a:stretch>
-                            <a:fillRect/>
-                          </a:stretch>
-                        </pic:blipFill>
-                        <pic:spPr bwMode="auto">
-                          <a:xfrm>
-                            <a:off x="0" y="0"/>
-                            <a:ext cx="4620126" cy="914400"/>
-                          </a:xfrm>
-                          <a:prstGeom prst="rect">
-                            <a:avLst/>
-                          </a:prstGeom>
-                          <a:noFill/>
-                          <a:ln w="9525">
-                            <a:noFill/>
-                            <a:headEnd/>
-                            <a:tailEnd/>
-                          </a:ln>
-                        </pic:spPr>
-                      </pic:pic>
-                    </a:graphicData>
-                  </a:graphic>
-                </wp:inline>
-              </w:drawing>
-            </w:r>
-          </w:p>
-          <w:p>
-            <w:pPr>
-              <w:jc w:val="center"/>
-            </w:pPr>
-            <w:pPr>
-              <w:jc w:val="left"/>
-              <w:spacing w:before="200"/>
-              <w:pStyle w:val="ImageCaption"/>
-            </w:pPr>
-            <w:r>
-              <w:t xml:space="preserve">Figure 6: van Langren’s 1644 estimates, rebuilt layer by layer as an overlay on a modern map.</w:t>
-            </w:r>
-          </w:p>
-          <w:bookmarkEnd w:id="62"/>
-        </w:tc>
-      </w:tr>
-    </w:tbl>
-    <w:p>
-      <w:pPr>
-        <w:pStyle w:val="BodyText"/>
-      </w:pPr>
-      <w:r>
-        <w:t xml:space="preserve">Twelve estimates, spanning nearly half the Toledo-to-Rome range—exactly the argument</w:t>
-      </w:r>
-      <w:r>
-        <w:t xml:space="preserve"> </w:t>
-      </w:r>
-      <w:r>
-        <w:t xml:space="preserve">van Langren was making to the King, that previous methods were hopelessly variable, and</w:t>
-      </w:r>
-      <w:r>
-        <w:t xml:space="preserve"> </w:t>
-      </w:r>
-      <w:r>
-        <w:t xml:space="preserve">someone (him) deserved a reward for having a better one.</w:t>
-      </w:r>
-    </w:p>
-    <w:bookmarkStart w:id="73" w:name="i-did-that-better-by-hand"/>
-    <w:p>
-      <w:pPr>
-        <w:pStyle w:val="Heading3"/>
-      </w:pPr>
-      <w:r>
-        <w:t xml:space="preserve">“I did that better by hand!”</w:t>
-      </w:r>
-    </w:p>
-    <w:p>
-      <w:pPr>
-        <w:pStyle w:val="FirstParagraph"/>
-      </w:pPr>
-      <w:hyperlink w:anchor="fig-overlay">
-        <w:r>
-          <w:rPr>
-            <w:rStyle w:val="Hyperlink"/>
-          </w:rPr>
-          <w:t xml:space="preserve">Figure 6</w:t>
-        </w:r>
-      </w:hyperlink>
-      <w:r>
-        <w:t xml:space="preserve"> </w:t>
-      </w:r>
-      <w:r>
-        <w:t xml:space="preserve">answers the</w:t>
-      </w:r>
-      <w:r>
-        <w:t xml:space="preserve"> </w:t>
-      </w:r>
-      <w:r>
-        <w:rPr>
-          <w:i/>
-          <w:iCs/>
-        </w:rPr>
-        <w:t xml:space="preserve">argument</w:t>
-      </w:r>
-      <w:r>
-        <w:t xml:space="preserve"> </w:t>
-      </w:r>
-      <w:r>
-        <w:t xml:space="preserve">well enough. But re-visioning in the deeper</w:t>
-      </w:r>
-      <w:r>
-        <w:t xml:space="preserve"> </w:t>
-      </w:r>
-      <w:r>
-        <w:t xml:space="preserve">sense means trying to reproduce the</w:t>
-      </w:r>
-      <w:r>
-        <w:t xml:space="preserve"> </w:t>
-      </w:r>
-      <w:r>
-        <w:rPr>
-          <w:i/>
-          <w:iCs/>
-        </w:rPr>
-        <w:t xml:space="preserve">artifact</w:t>
-      </w:r>
-      <w:r>
-        <w:t xml:space="preserve">—the spare white strip, the figure-8</w:t>
-      </w:r>
-      <w:r>
-        <w:t xml:space="preserve"> </w:t>
-      </w:r>
-      <w:r>
-        <w:t xml:space="preserve">snowman markers, the italic lettering. Imagine showing van Langren the map overlay;</w:t>
-      </w:r>
-      <w:r>
-        <w:t xml:space="preserve"> </w:t>
-      </w:r>
-      <w:r>
-        <w:t xml:space="preserve">he studies it for a moment and turns up his nose and says:</w:t>
-      </w:r>
-    </w:p>
-    <w:p>
-      <w:pPr>
-        <w:pStyle w:val="BlockText"/>
-      </w:pPr>
-      <w:r>
-        <w:rPr>
-          <w:i/>
-          <w:iCs/>
-        </w:rPr>
-        <w:t xml:space="preserve">“I did that better by hand!”</w:t>
-      </w:r>
-    </w:p>
-    <w:p>
-      <w:pPr>
-        <w:pStyle w:val="FirstParagraph"/>
-      </w:pPr>
-      <w:r>
-        <w:t xml:space="preserve">He has a point. Each of his snowman markers was hand-engraved on a copper plate; each name</w:t>
-      </w:r>
-      <w:r>
-        <w:t xml:space="preserve"> </w:t>
-      </w:r>
-      <w:r>
-        <w:t xml:space="preserve">individually scratched in by the engraver. The uniformity</w:t>
-      </w:r>
-      <w:r>
-        <w:t xml:space="preserve"> </w:t>
-      </w:r>
-      <w:r>
-        <w:rPr>
-          <w:rStyle w:val="VerbatimChar"/>
-        </w:rPr>
-        <w:t xml:space="preserve">ggplot2</w:t>
-      </w:r>
-      <w:r>
-        <w:t xml:space="preserve"> </w:t>
-      </w:r>
-      <w:r>
-        <w:t xml:space="preserve">achieves in milliseconds would have taken hours of skilled</w:t>
-      </w:r>
-      <w:r>
-        <w:t xml:space="preserve"> </w:t>
-      </w:r>
-      <w:r>
-        <w:t xml:space="preserve">labour in 1644. So: how close can we get?</w:t>
-      </w:r>
-    </w:p>
-    <w:tbl>
-      <w:tblPr>
-        <w:tblStyle w:val="Table"/>
-        <w:tblW w:type="pct" w:w="5000"/>
-        <w:tblLayout w:type="fixed"/>
-        <w:tblLook w:firstRow="0" w:lastRow="0" w:firstColumn="0" w:lastColumn="0" w:noHBand="0" w:noVBand="0" w:val="0000"/>
-      </w:tblPr>
-      <w:tblGrid>
-        <w:gridCol w:w="7920"/>
-      </w:tblGrid>
-      <w:tr>
-        <w:tc>
-          <w:tcPr/>
-          <w:bookmarkStart w:id="66" w:name="fig-1644-original"/>
+          <w:bookmarkStart w:id="65" w:name="fig-1644-original"/>
           <w:p>
             <w:pPr>
               <w:pStyle w:val="Compact"/>
@@ -3131,18 +3023,18 @@
                 <wp:inline>
                   <wp:extent cx="5334000" cy="1349828"/>
                   <wp:effectExtent b="0" l="0" r="0" t="0"/>
-                  <wp:docPr descr="" title="" id="64" name="Picture"/>
+                  <wp:docPr descr="" title="" id="63" name="Picture"/>
                   <a:graphic>
                     <a:graphicData uri="http://schemas.openxmlformats.org/drawingml/2006/picture">
                       <pic:pic>
                         <pic:nvPicPr>
-                          <pic:cNvPr descr="images/Langren1644.jpg" id="65" name="Picture"/>
+                          <pic:cNvPr descr="images/Langren1644.jpg" id="64" name="Picture"/>
                           <pic:cNvPicPr>
                             <a:picLocks noChangeArrowheads="1" noChangeAspect="1"/>
                           </pic:cNvPicPr>
                         </pic:nvPicPr>
                         <pic:blipFill>
-                          <a:blip r:embed="rId63"/>
+                          <a:blip r:embed="rId62"/>
                           <a:stretch>
                             <a:fillRect/>
                           </a:stretch>
@@ -3179,10 +3071,10 @@
               <w:pStyle w:val="ImageCaption"/>
             </w:pPr>
             <w:r>
-              <w:t xml:space="preserve">Figure 7: Van Langren’s original 1644 graph</w:t>
+              <w:t xml:space="preserve">Figure 6: Van Langren’s original 1644 graph</w:t>
             </w:r>
           </w:p>
-          <w:bookmarkEnd w:id="66"/>
+          <w:bookmarkEnd w:id="65"/>
         </w:tc>
       </w:tr>
     </w:tbl>
@@ -3516,17 +3408,17 @@
         <w:t xml:space="preserve"> </w:t>
       </w:r>
       <w:r>
-        <w:t xml:space="preserve">complete, runnable code is on GitHub:</w:t>
-      </w:r>
-      <w:r>
-        <w:t xml:space="preserve"> </w:t>
-      </w:r>
-      <w:hyperlink r:id="rId67">
+        <w:t xml:space="preserve">complete, runnable code is in</w:t>
+      </w:r>
+      <w:r>
+        <w:t xml:space="preserve"> </w:t>
+      </w:r>
+      <w:hyperlink r:id="rId66">
         <w:r>
           <w:rPr>
             <w:rStyle w:val="VerbatimChar"/>
           </w:rPr>
-          <w:t xml:space="preserve">reproduce-langren-graph.R</w:t>
+          <w:t xml:space="preserve">R/reproduce-langren-graph.R</w:t>
         </w:r>
       </w:hyperlink>
       <w:r>
@@ -3537,7 +3429,7 @@
           <w:rPr>
             <w:rStyle w:val="Hyperlink"/>
           </w:rPr>
-          <w:t xml:space="preserve">Figure 8</w:t>
+          <w:t xml:space="preserve">Figure 7</w:t>
         </w:r>
       </w:hyperlink>
       <w:r>
@@ -3557,7 +3449,7 @@
       <w:tr>
         <w:tc>
           <w:tcPr/>
-          <w:bookmarkStart w:id="71" w:name="fig-reconstruction"/>
+          <w:bookmarkStart w:id="70" w:name="fig-reconstruction"/>
           <w:p>
             <w:pPr>
               <w:pStyle w:val="Compact"/>
@@ -3568,18 +3460,18 @@
                 <wp:inline>
                   <wp:extent cx="5334000" cy="1143000"/>
                   <wp:effectExtent b="0" l="0" r="0" t="0"/>
-                  <wp:docPr descr="" title="" id="69" name="Picture"/>
+                  <wp:docPr descr="" title="" id="68" name="Picture"/>
                   <a:graphic>
                     <a:graphicData uri="http://schemas.openxmlformats.org/drawingml/2006/picture">
                       <pic:pic>
                         <pic:nvPicPr>
-                          <pic:cNvPr descr="vanLangren-Secret_files/figure-docx/fig-reconstruction-1.png" id="70" name="Picture"/>
+                          <pic:cNvPr descr="vanLangren-Secret_files/figure-docx/fig-reconstruction-1.png" id="69" name="Picture"/>
                           <pic:cNvPicPr>
                             <a:picLocks noChangeArrowheads="1" noChangeAspect="1"/>
                           </pic:cNvPicPr>
                         </pic:nvPicPr>
                         <pic:blipFill>
-                          <a:blip r:embed="rId68"/>
+                          <a:blip r:embed="rId67"/>
                           <a:stretch>
                             <a:fillRect/>
                           </a:stretch>
@@ -3616,10 +3508,10 @@
               <w:pStyle w:val="ImageCaption"/>
             </w:pPr>
             <w:r>
-              <w:t xml:space="preserve">Figure 8: A ggplot2 reconstruction of van Langren’s 1644 graph.</w:t>
+              <w:t xml:space="preserve">Figure 7: A ggplot2 reconstruction of van Langren’s 1644 graph.</w:t>
             </w:r>
           </w:p>
-          <w:bookmarkEnd w:id="71"/>
+          <w:bookmarkEnd w:id="70"/>
         </w:tc>
       </w:tr>
     </w:tbl>
@@ -3678,7 +3570,7 @@
       <w:r>
         <w:t xml:space="preserve"> </w:t>
       </w:r>
-      <w:hyperlink r:id="rId72">
+      <w:hyperlink r:id="rId71">
         <w:r>
           <w:rPr>
             <w:rStyle w:val="Hyperlink"/>
@@ -3722,9 +3614,9 @@
         <w:t xml:space="preserve">true answer of 16°31’.</w:t>
       </w:r>
     </w:p>
+    <w:bookmarkEnd w:id="72"/>
     <w:bookmarkEnd w:id="73"/>
-    <w:bookmarkEnd w:id="74"/>
-    <w:bookmarkStart w:id="81" w:name="every-cipher-tells-a-story"/>
+    <w:bookmarkStart w:id="80" w:name="every-cipher-tells-a-story"/>
     <w:p>
       <w:pPr>
         <w:pStyle w:val="Heading2"/>
@@ -3832,8 +3724,8 @@
         <w:t xml:space="preserve">The shock of finding our interpretation wrong is replaced, in the end, by a feeling of satisfaction in being able to right the ship of history.</w:t>
       </w:r>
     </w:p>
-    <w:bookmarkStart w:id="80" w:name="refs"/>
-    <w:bookmarkStart w:id="75" w:name="ref-Friendly:2006:hbook"/>
+    <w:bookmarkStart w:id="79" w:name="refs"/>
+    <w:bookmarkStart w:id="74" w:name="ref-Friendly:2006:hbook"/>
     <w:p>
       <w:pPr>
         <w:pStyle w:val="Bibliography"/>
@@ -3867,8 +3759,8 @@
         <w:t xml:space="preserve">, edited by C. Chen, Wolfgang Härdle, and Antony Unwin, III. Springer-Verlag.</w:t>
       </w:r>
     </w:p>
-    <w:bookmarkEnd w:id="75"/>
-    <w:bookmarkStart w:id="77" w:name="ref-FriendlyChevaliers:2020"/>
+    <w:bookmarkEnd w:id="74"/>
+    <w:bookmarkStart w:id="76" w:name="ref-FriendlyChevaliers:2020"/>
     <w:p>
       <w:pPr>
         <w:pStyle w:val="Bibliography"/>
@@ -3895,7 +3787,7 @@
       <w:r>
         <w:t xml:space="preserve"> </w:t>
       </w:r>
-      <w:hyperlink r:id="rId76">
+      <w:hyperlink r:id="rId75">
         <w:r>
           <w:rPr>
             <w:rStyle w:val="Hyperlink"/>
@@ -3907,8 +3799,8 @@
         <w:t xml:space="preserve">.</w:t>
       </w:r>
     </w:p>
-    <w:bookmarkEnd w:id="77"/>
-    <w:bookmarkStart w:id="79" w:name="ref-Friendly:2010:langren"/>
+    <w:bookmarkEnd w:id="76"/>
+    <w:bookmarkStart w:id="78" w:name="ref-Friendly:2010:langren"/>
     <w:p>
       <w:pPr>
         <w:pStyle w:val="Bibliography"/>
@@ -3980,7 +3872,7 @@
       <w:r>
         <w:t xml:space="preserve"> </w:t>
       </w:r>
-      <w:hyperlink r:id="rId78">
+      <w:hyperlink r:id="rId77">
         <w:r>
           <w:rPr>
             <w:rStyle w:val="Hyperlink"/>
@@ -3992,9 +3884,9 @@
         <w:t xml:space="preserve">.</w:t>
       </w:r>
     </w:p>
+    <w:bookmarkEnd w:id="78"/>
     <w:bookmarkEnd w:id="79"/>
     <w:bookmarkEnd w:id="80"/>
-    <w:bookmarkEnd w:id="81"/>
     <w:sectPr/>
   </w:body>
 </w:document>
@@ -4243,6 +4135,53 @@
       </w:r>
       <w:r>
         <w:t xml:space="preserve">). In each case the goal was the same: hold the date of discovery in escrow without giving anything away.</w:t>
+      </w:r>
+    </w:p>
+  </w:footnote>
+  <w:footnote w:id="40">
+    <w:p>
+      <w:pPr>
+        <w:pStyle w:val="FootnoteText"/>
+      </w:pPr>
+      <w:r>
+        <w:rPr>
+          <w:rStyle w:val="FootnoteReference"/>
+        </w:rPr>
+        <w:footnoteRef/>
+      </w:r>
+      <w:r>
+        <w:t xml:space="preserve"> </w:t>
+      </w:r>
+      <w:r>
+        <w:t xml:space="preserve">All the R code for this article is in its GitHub repository,</w:t>
+      </w:r>
+      <w:r>
+        <w:t xml:space="preserve"> </w:t>
+      </w:r>
+      <w:hyperlink r:id="rId41">
+        <w:r>
+          <w:rPr>
+            <w:rStyle w:val="Hyperlink"/>
+          </w:rPr>
+          <w:t xml:space="preserve">https://github.com/friendly/vanLangren-Secret</w:t>
+        </w:r>
+      </w:hyperlink>
+      <w:r>
+        <w:t xml:space="preserve">. More detailed descriptions of the R code used in these analyses are in the original blog post,</w:t>
+      </w:r>
+      <w:r>
+        <w:t xml:space="preserve"> </w:t>
+      </w:r>
+      <w:hyperlink r:id="rId42">
+        <w:r>
+          <w:rPr>
+            <w:rStyle w:val="Hyperlink"/>
+          </w:rPr>
+          <w:t xml:space="preserve">https://friendly.github.io/blog/posts/2026-07-van-langren/</w:t>
+        </w:r>
+      </w:hyperlink>
+      <w:r>
+        <w:t xml:space="preserve">.</w:t>
       </w:r>
     </w:p>
   </w:footnote>

</xml_diff>

<commit_message>
Tighten "What van Langren Was Hiding"
- Plaintext presented as a paraphrase, in one block
- Clarify the method as two clocks (home-port water clock vs. stars)
- Cite water-clock and Harrison figures in text
- Compress clepsydra paragraph; add ~68 km per degree at Amsterdam
- Cipher dated to early 1640s; pendulum clock "some fifteen years off"

Co-Authored-By: Claude Opus 5.5 <noreply@anthropic.com>
</commit_message>
<xml_diff>
--- a/vanLangren-Secret.docx
+++ b/vanLangren-Secret.docx
@@ -2276,7 +2276,7 @@
         <w:pStyle w:val="FirstParagraph"/>
       </w:pPr>
       <w:r>
-        <w:t xml:space="preserve">The plaintext, once unwound, turns out to describe not a lunar method at all, but a</w:t>
+        <w:t xml:space="preserve">The plaintext describes not a lunar method at all, but a</w:t>
       </w:r>
       <w:r>
         <w:t xml:space="preserve"> </w:t>
@@ -2289,13 +2289,21 @@
         <w:t xml:space="preserve">24-hour water clock</w:t>
       </w:r>
       <w:r>
-        <w:t xml:space="preserve">.</w:t>
-      </w:r>
-      <w:r>
-        <w:t xml:space="preserve"> </w:t>
-      </w:r>
-      <w:r>
-        <w:t xml:space="preserve">It reads:</w:t>
+        <w:t xml:space="preserve"> </w:t>
+      </w:r>
+      <w:r>
+        <w:t xml:space="preserve">(</w:t>
+      </w:r>
+      <w:hyperlink w:anchor="fig-waterclock">
+        <w:r>
+          <w:rPr>
+            <w:rStyle w:val="Hyperlink"/>
+          </w:rPr>
+          <w:t xml:space="preserve">Figure 4</w:t>
+        </w:r>
+      </w:hyperlink>
+      <w:r>
+        <w:t xml:space="preserve">). In paraphrase:</w:t>
       </w:r>
     </w:p>
     <w:p>
@@ -2303,15 +2311,7 @@
         <w:pStyle w:val="BlockText"/>
       </w:pPr>
       <w:r>
-        <w:t xml:space="preserve">Make two cylindrical copper vessels of equal capacity, each with a conical point at the bottom and a small hole at the center of that point. Fill them with seawater and let them drain. At departure, start the first vessel running while noting which known star sits on the meridian. That vessel will run empty in exactly 24 hours of sidereal time—the interval for a star to return to the same meridian. The moment the first vessel empties, start the second.</w:t>
-      </w:r>
-    </w:p>
-    <w:p>
-      <w:pPr>
-        <w:pStyle w:val="BlockText"/>
-      </w:pPr>
-      <w:r>
-        <w:t xml:space="preserve">Do this daily throughout the voyage. Each time a vessel empties, compare the position of the reference star against the meridian to read off how many degrees of longitude have been traveled from the port of departure. A small cork float, riding on the water inside, marks the level so the moment of emptying can be seen precisely.</w:t>
+        <w:t xml:space="preserve">Make two cylindrical copper vessels of equal capacity, each ending in a cone with a small hole at its point, and fill them with seawater. At departure, start the first draining while noting which known star sits on the meridian; it will run empty in exactly 24 hours of sidereal time, when that star returns to the meridian. Then start the second, and so on, every day of the voyage. Each time a vessel empties, the reference star’s distance from the meridian gives the degrees of longitude traveled from port. A small cork float marks the moment of emptying.</w:t>
       </w:r>
     </w:p>
     <w:p>
@@ -2319,7 +2319,7 @@
         <w:pStyle w:val="FirstParagraph"/>
       </w:pPr>
       <w:r>
-        <w:t xml:space="preserve">It’s a genuinely clever idea—use the fixed 24-hour sidereal rotation of the stars as an external check on a mechanical timer, rather than trying to keep time some other way and then comparing it to solar noon. But it’s built on the oldest timekeeping technology available to him, and that, I think, is exactly why nobody guessed it. Van Langren is remembered—by me among others—for looking</w:t>
+        <w:t xml:space="preserve">It’s a genuinely clever idea: the water clock carries the time of the home port, and the stars supply the local time to compare it with—exactly the two clocks the longitude problem requires. But it is built on the oldest timekeeping technology available to him, and that, I think, is exactly why nobody guessed it. Van Langren is remembered—by me among others—for looking</w:t>
       </w:r>
       <w:r>
         <w:t xml:space="preserve"> </w:t>
@@ -2332,7 +2332,7 @@
         <w:t xml:space="preserve">up</w:t>
       </w:r>
       <w:r>
-        <w:t xml:space="preserve">, at the moon and using those observations for his method.</w:t>
+        <w:t xml:space="preserve">, at the moon.</w:t>
       </w:r>
     </w:p>
     <w:p>
@@ -2353,14 +2353,6 @@
       </w:r>
       <w:r>
         <w:t xml:space="preserve">had him looking at a copper cone and a dripping hole, a technology already two thousand years old when he was born.</w:t>
-      </w:r>
-    </w:p>
-    <w:p>
-      <w:pPr>
-        <w:pStyle w:val="BodyText"/>
-      </w:pPr>
-      <w:r>
-        <w:t xml:space="preserve">Here is a visual depiction of what van Langren was thinking:</w:t>
       </w:r>
     </w:p>
     <w:tbl>
@@ -2554,7 +2546,10 @@
         </w:r>
       </w:hyperlink>
       <w:r>
-        <w:t xml:space="preserve">—the water clock—is one of humanity’s oldest timekeeping instruments, in continuous use from ancient Egypt and China through Greek and Roman antiquity. Its flaw was ancient too: water’s flow rate shifts with temperature, something the Han-dynasty astronomer</w:t>
+        <w:t xml:space="preserve"> </w:t>
+      </w:r>
+      <w:r>
+        <w:t xml:space="preserve">is one of humanity’s oldest timekeeping instruments, and its flaw was ancient too: water’s flow rate shifts with temperature, as the Han-dynasty astronomer</w:t>
       </w:r>
       <w:r>
         <w:t xml:space="preserve"> </w:t>
@@ -2571,7 +2566,7 @@
         <w:t xml:space="preserve"> </w:t>
       </w:r>
       <w:r>
-        <w:t xml:space="preserve">was already writing about two thousand years before van Langren. On dry land that could be managed. At sea it couldn’t—pitching decks and swinging temperatures would have thrown his matched copper cones out of sync within days. The tolerance was brutal besides: four minutes of drift equals one degree of longitude, a margin no clepsydra could hold for a week at sea, let alone a transatlantic crossing.</w:t>
+        <w:t xml:space="preserve">noted two thousand years before van Langren. At sea, pitching decks and swinging temperatures would have thrown his copper cones out of sync within days, and the tolerance was brutal: four minutes of drift is one degree of longitude—about 68 km at the latitude of Amsterdam.</w:t>
       </w:r>
     </w:p>
     <w:p>
@@ -2579,7 +2574,7 @@
         <w:pStyle w:val="BodyText"/>
       </w:pPr>
       <w:r>
-        <w:t xml:space="preserve">Van Langren wrote his cipher in the early 1630s. The pendulum clock—the first timekeeper accurate enough to matter on land—was still more than two decades off; an accurate</w:t>
+        <w:t xml:space="preserve">Van Langren wrote his cipher in the early 1640s. The pendulum clock was still some fifteen years off; an accurate</w:t>
       </w:r>
       <w:r>
         <w:t xml:space="preserve"> </w:t>
@@ -2593,7 +2588,21 @@
         </w:r>
       </w:hyperlink>
       <w:r>
-        <w:t xml:space="preserve">, more than a century. He wasn’t naive. He was reaching for the best tool of his moment to solve a problem no tool of his era could actually solve.</w:t>
+        <w:t xml:space="preserve"> </w:t>
+      </w:r>
+      <w:r>
+        <w:t xml:space="preserve">(</w:t>
+      </w:r>
+      <w:hyperlink w:anchor="fig-harrison">
+        <w:r>
+          <w:rPr>
+            <w:rStyle w:val="Hyperlink"/>
+          </w:rPr>
+          <w:t xml:space="preserve">Figure 5</w:t>
+        </w:r>
+      </w:hyperlink>
+      <w:r>
+        <w:t xml:space="preserve">), more than a century. He was reaching for the best tool of his moment to solve a problem no tool of his era could actually solve.</w:t>
       </w:r>
     </w:p>
     <w:bookmarkEnd w:id="57"/>

</xml_diff>

<commit_message>
Tighten "How I Got Here"; true distance 16°32'
- Fold 1628 graph description into opening paragraph; cite Figs 1 and 3
- Fold 2009-10 codebreaker attempt into "moved on" sentence
- Drop duplicate "204 groups" sentence (covered in Step 1)
- Trim lunar-map paragraph; "never said what the answer was"
- True Toledo-Rome distance 16°32' in text and ggplot2 reconstruction

Co-Authored-By: Claude Opus 5.5 <noreply@anthropic.com>
</commit_message>
<xml_diff>
--- a/vanLangren-Secret.docx
+++ b/vanLangren-Secret.docx
@@ -173,15 +173,18 @@
         <w:t xml:space="preserve"> </w:t>
       </w:r>
       <w:r>
-        <w:t xml:space="preserve">in the 1620s—he had found a letter from early 1628, in old Spanish, containing a small graph. Was I interested? I was indeed! Graduate students at my university were on strike, so I had plenty of time for a new historical hero.</w:t>
-      </w:r>
-    </w:p>
-    <w:p>
-      <w:pPr>
-        <w:pStyle w:val="BodyText"/>
-      </w:pPr>
-      <w:r>
-        <w:t xml:space="preserve">The graph showed seven names on a scale of degrees: a scatter of estimates of the difference in longitude between Toledo and Rome. It looked very much like the famous 1644 diagram in Michael Florent van Langren’s</w:t>
+        <w:t xml:space="preserve">in the 1620s—he had found a letter from early 1628, in old Spanish. Its small graph of seven estimates of the longitude difference between Toledo and Rome (</w:t>
+      </w:r>
+      <w:hyperlink w:anchor="fig-1628-letter">
+        <w:r>
+          <w:rPr>
+            <w:rStyle w:val="Hyperlink"/>
+          </w:rPr>
+          <w:t xml:space="preserve">Figure 1</w:t>
+        </w:r>
+      </w:hyperlink>
+      <w:r>
+        <w:t xml:space="preserve">) looked very much like the famous 1644 diagram in Michael Florent van Langren’s</w:t>
       </w:r>
       <w:r>
         <w:t xml:space="preserve"> </w:t>
@@ -197,7 +200,7 @@
         </w:r>
       </w:hyperlink>
       <w:r>
-        <w:t xml:space="preserve">—except this letter predated that publication by at least sixteen years.</w:t>
+        <w:t xml:space="preserve">—but predated it by at least sixteen years. Was I interested? I was indeed! Graduate students at my university were on strike, so I had plenty of time for a new historical hero.</w:t>
       </w:r>
     </w:p>
     <w:tbl>
@@ -338,7 +341,7 @@
         <w:t xml:space="preserve">first graphical display of quantitative data</w:t>
       </w:r>
       <w:r>
-        <w:t xml:space="preserve">, a 1D dot plot, rather than in the table anyone else at the time would have used. We always ask:</w:t>
+        <w:t xml:space="preserve">, a 1D dot plot, rather than the table anyone else at the time would have used. We always ask:</w:t>
       </w:r>
     </w:p>
     <w:p>
@@ -358,7 +361,7 @@
         <w:pStyle w:val="FirstParagraph"/>
       </w:pPr>
       <w:r>
-        <w:t xml:space="preserve">Our answer was that only a dot plot would let the King</w:t>
+        <w:t xml:space="preserve">Our answer: only a dot plot would let the King</w:t>
       </w:r>
       <w:r>
         <w:t xml:space="preserve"> </w:t>
@@ -374,13 +377,7 @@
         <w:t xml:space="preserve"> </w:t>
       </w:r>
       <w:r>
-        <w:t xml:space="preserve">what van Langren wanted him to see:</w:t>
-      </w:r>
-      <w:r>
-        <w:t xml:space="preserve"> </w:t>
-      </w:r>
-      <w:r>
-        <w:t xml:space="preserve">all previous methods</w:t>
+        <w:t xml:space="preserve">that all previous methods</w:t>
       </w:r>
       <w:r>
         <w:rPr>
@@ -412,13 +409,13 @@
         </w:r>
       </w:hyperlink>
       <w:r>
-        <w:t xml:space="preserve">, the estimates span over 40% of the distance from Toledo to Rome.</w:t>
-      </w:r>
-      <w:r>
-        <w:t xml:space="preserve"> </w:t>
-      </w:r>
-      <w:r>
-        <w:t xml:space="preserve">The pin marks the actual distance,</w:t>
+        <w:t xml:space="preserve">, the estimates span over 40% of the distance from Toledo to Rome;</w:t>
+      </w:r>
+      <w:r>
+        <w:t xml:space="preserve"> </w:t>
+      </w:r>
+      <w:r>
+        <w:t xml:space="preserve">the pin marks the actual distance,</w:t>
       </w:r>
       <w:r>
         <w:t xml:space="preserve"> </w:t>
@@ -442,7 +439,7 @@
         <m:sSup>
           <m:e>
             <m:r>
-              <m:t>30</m:t>
+              <m:t>32</m:t>
             </m:r>
           </m:e>
           <m:sup>
@@ -551,7 +548,7 @@
         <w:pStyle w:val="BodyText"/>
       </w:pPr>
       <w:r>
-        <w:t xml:space="preserve">He never said what the fix was. On page 8 of</w:t>
+        <w:t xml:space="preserve">He never said what the answer was. On page 8 of</w:t>
       </w:r>
       <w:r>
         <w:t xml:space="preserve"> </w:t>
@@ -567,7 +564,18 @@
         <w:t xml:space="preserve"> </w:t>
       </w:r>
       <w:r>
-        <w:t xml:space="preserve">he printed it anyway—but in cipher, promising to reveal the plaintext after suitable compensation. Except for the puzzle, the</w:t>
+        <w:t xml:space="preserve">he printed it anyway—but in cipher (</w:t>
+      </w:r>
+      <w:hyperlink w:anchor="fig-cipher-page">
+        <w:r>
+          <w:rPr>
+            <w:rStyle w:val="Hyperlink"/>
+          </w:rPr>
+          <w:t xml:space="preserve">Figure 3</w:t>
+        </w:r>
+      </w:hyperlink>
+      <w:r>
+        <w:t xml:space="preserve">), promising to reveal the plaintext after suitable compensation. Except for the puzzle, the</w:t>
       </w:r>
       <w:r>
         <w:t xml:space="preserve"> </w:t>
@@ -618,15 +626,10 @@
         </w:r>
       </w:hyperlink>
       <w:r>
-        <w:t xml:space="preserve">, posed a few questions about what kind of cipher it might be, and moved on.</w:t>
-      </w:r>
-    </w:p>
-    <w:p>
-      <w:pPr>
-        <w:pStyle w:val="BodyText"/>
-      </w:pPr>
-      <w:r>
-        <w:t xml:space="preserve">Not quite right away. In 2009 and 2010 I tracked down a handful of codebreakers—a few retired from the CIA, a couple from NASA—who I thought might enjoy a historical puzzle. A few gave it a real try. Van Langren beat them all.</w:t>
+        <w:t xml:space="preserve"> </w:t>
+      </w:r>
+      <w:r>
+        <w:t xml:space="preserve">and moved on—though not before a few retired CIA and NASA codebreakers I tracked down in 2009–10 gave it a real try. Van Langren beat them all.</w:t>
       </w:r>
     </w:p>
     <w:tbl>
@@ -819,7 +822,7 @@
         <w:pStyle w:val="BodyText"/>
       </w:pPr>
       <w:r>
-        <w:t xml:space="preserve">It contains 204 of those space-separated groups, nearly all of them four to eight characters long, no group repeating often enough to be a common word in any language. Take a minute and look at it before reading on—this is exactly what stared back at van Langren’s readers for 376 years.</w:t>
+        <w:t xml:space="preserve">Take a minute and look at it before reading on—this is exactly what stared back at van Langren’s readers for 376 years.</w:t>
       </w:r>
     </w:p>
     <w:p>
@@ -827,7 +830,7 @@
         <w:pStyle w:val="BodyText"/>
       </w:pPr>
       <w:r>
-        <w:t xml:space="preserve">I assumed, as I think most people who have written about van Langren did, that his secret had to do with the achievement he’s actually remembered for:</w:t>
+        <w:t xml:space="preserve">I assumed, as I think most people who have written about van Langren did, that his secret had to do with the achievement he’s remembered for:</w:t>
       </w:r>
       <w:r>
         <w:t xml:space="preserve"> </w:t>
@@ -841,7 +844,7 @@
         </w:r>
       </w:hyperlink>
       <w:r>
-        <w:t xml:space="preserve">, the first comprehensive survey of the moon’s craters and mountains, and the method he built around it—using the sunrise and sunset lines crossing named lunar peaks as a celestial clock, visible wherever the moon was. It was a reasonable guess, and it made a good (his)story. It was also wrong.</w:t>
+        <w:t xml:space="preserve">, and the method he built around it—using the sunrise and sunset lines crossing named lunar peaks as a celestial clock. It was a reasonable guess, and it made a good (his)story. It was also wrong.</w:t>
       </w:r>
     </w:p>
     <w:bookmarkEnd w:id="27"/>
@@ -3620,7 +3623,7 @@
         <w:t xml:space="preserve"> </w:t>
       </w:r>
       <w:r>
-        <w:t xml:space="preserve">true answer of 16°31’.</w:t>
+        <w:t xml:space="preserve">true answer of 16°32’.</w:t>
       </w:r>
     </w:p>
     <w:bookmarkEnd w:id="72"/>

</xml_diff>

<commit_message>
Tighten "The Problem of Longitude"
- Combine the two equations into one display after introducing the
  two clocks
- Merge two-clocks and astronomical-alternative paragraphs
- Replace closing paragraph (which gave away the water clock early)
  with a one-line bridge to The Cipher Falls

Co-Authored-By: Claude Opus 5.5 <noreply@anthropic.com>
</commit_message>
<xml_diff>
--- a/vanLangren-Secret.docx
+++ b/vanLangren-Secret.docx
@@ -878,13 +878,7 @@
         <w:t xml:space="preserve"> </w:t>
       </w:r>
       <w:r>
-        <w:t xml:space="preserve">was</w:t>
-      </w:r>
-      <w:r>
-        <w:t xml:space="preserve"> </w:t>
-      </w:r>
-      <w:r>
-        <w:t xml:space="preserve">so much harder to measure than</w:t>
+        <w:t xml:space="preserve">was so much harder to measure than</w:t>
       </w:r>
       <w:r>
         <w:t xml:space="preserve"> </w:t>
@@ -913,39 +907,7 @@
         <w:t xml:space="preserve">Age of Discovery</w:t>
       </w:r>
       <w:r>
-        <w:t xml:space="preserve"> </w:t>
-      </w:r>
-      <w:r>
-        <w:t xml:space="preserve">of the 16–17</w:t>
-      </w:r>
-      <m:oMath>
-        <m:sSup>
-          <m:e>
-            <m:r>
-              <m:t>​</m:t>
-            </m:r>
-          </m:e>
-          <m:sup>
-            <m:r>
-              <m:t>t</m:t>
-            </m:r>
-            <m:r>
-              <m:t>h</m:t>
-            </m:r>
-          </m:sup>
-        </m:sSup>
-      </m:oMath>
-      <w:r>
-        <w:t xml:space="preserve"> </w:t>
-      </w:r>
-      <w:r>
-        <w:t xml:space="preserve">centuries,</w:t>
-      </w:r>
-      <w:r>
-        <w:t xml:space="preserve"> </w:t>
-      </w:r>
-      <w:r>
-        <w:t xml:space="preserve">when European kings sent ships across the world to find new trading routes, treasure, and lands.</w:t>
+        <w:t xml:space="preserve">, when European kings sent ships across the world to find new trading routes, treasure, and lands.</w:t>
       </w:r>
     </w:p>
     <w:p>
@@ -963,19 +925,7 @@
         <w:t xml:space="preserve"> </w:t>
       </w:r>
       <w:r>
-        <w:t xml:space="preserve">is easy: the elevation of the sun, moon, or stars above the horizon tells</w:t>
-      </w:r>
-      <w:r>
-        <w:t xml:space="preserve"> </w:t>
-      </w:r>
-      <w:r>
-        <w:t xml:space="preserve">you directly how far north or south of the equator you are. Nature provides the reference</w:t>
-      </w:r>
-      <w:r>
-        <w:t xml:space="preserve"> </w:t>
-      </w:r>
-      <w:r>
-        <w:t xml:space="preserve">frame.</w:t>
+        <w:t xml:space="preserve">is easy: the elevation of the sun or a star above the horizon tells you directly how far north or south of the equator you are. Nature provides the reference frame.</w:t>
       </w:r>
     </w:p>
     <w:p>
@@ -993,19 +943,7 @@
         <w:t xml:space="preserve"> </w:t>
       </w:r>
       <w:r>
-        <w:t xml:space="preserve">offers no such anchor. There is no natural zero line, and the distance</w:t>
-      </w:r>
-      <w:r>
-        <w:t xml:space="preserve"> </w:t>
-      </w:r>
-      <w:r>
-        <w:t xml:space="preserve">corresponding to one degree of longitude shrinks from 111 km at the equator to zero at</w:t>
-      </w:r>
-      <w:r>
-        <w:t xml:space="preserve"> </w:t>
-      </w:r>
-      <w:r>
-        <w:t xml:space="preserve">the poles. What</w:t>
+        <w:t xml:space="preserve">offers no such anchor. There is no natural zero line, and a degree of longitude shrinks from 111 km at the equator to zero at the poles. What</w:t>
       </w:r>
       <w:r>
         <w:t xml:space="preserve"> </w:t>
@@ -1021,19 +959,20 @@
         <w:t xml:space="preserve"> </w:t>
       </w:r>
       <w:r>
-        <w:t xml:space="preserve">fixed is the relationship between longitude and time: Earth rotates</w:t>
-      </w:r>
-      <w:r>
-        <w:t xml:space="preserve"> </w:t>
-      </w:r>
-      <w:r>
-        <w:t xml:space="preserve">360° in 24 hours, or 15° per hour, so a difference in longitude translates directly into</w:t>
-      </w:r>
-      <w:r>
-        <w:t xml:space="preserve"> </w:t>
-      </w:r>
-      <w:r>
-        <w:t xml:space="preserve">a difference in local time:</w:t>
+        <w:t xml:space="preserve">fixed is its relationship to time: Earth rotates 15° per hour, so a difference in longitude is a difference in local time. The solution therefore requires</w:t>
+      </w:r>
+      <w:r>
+        <w:t xml:space="preserve"> </w:t>
+      </w:r>
+      <w:r>
+        <w:rPr>
+          <w:b/>
+          <w:bCs/>
+        </w:rPr>
+        <w:t xml:space="preserve">two clocks</w:t>
+      </w:r>
+      <w:r>
+        <w:t xml:space="preserve">: one keeping local time, reset each day at solar noon, and one keeping the time at a reference location, set before departure and never touched again:</w:t>
       </w:r>
     </w:p>
     <w:p>
@@ -1092,69 +1031,32 @@
             </m:rPr>
             <m:t>time</m:t>
           </m:r>
-        </m:oMath>
-      </m:oMathPara>
-    </w:p>
-    <w:p>
-      <w:pPr>
-        <w:pStyle w:val="FirstParagraph"/>
-      </w:pPr>
-      <w:r>
-        <w:t xml:space="preserve">This means the general solution requires</w:t>
-      </w:r>
-      <w:r>
-        <w:t xml:space="preserve"> </w:t>
-      </w:r>
-      <w:r>
-        <w:rPr>
-          <w:b/>
-          <w:bCs/>
-        </w:rPr>
-        <w:t xml:space="preserve">two clocks</w:t>
-      </w:r>
-      <w:r>
-        <w:t xml:space="preserve">: one tracking local time (reset</w:t>
-      </w:r>
-      <w:r>
-        <w:t xml:space="preserve"> </w:t>
-      </w:r>
-      <w:r>
-        <w:t xml:space="preserve">each day by observing solar noon), the other keeping the time at a reference location set</w:t>
-      </w:r>
-      <w:r>
-        <w:t xml:space="preserve"> </w:t>
-      </w:r>
-      <w:r>
-        <w:t xml:space="preserve">before departure and never touched again:</w:t>
-      </w:r>
-    </w:p>
-    <w:p>
-      <w:pPr>
-        <w:pStyle w:val="BodyText"/>
-      </w:pPr>
-      <m:oMathPara>
-        <m:oMathParaPr>
-          <m:jc m:val="center"/>
-        </m:oMathParaPr>
-        <m:oMath>
           <m:r>
             <m:rPr>
               <m:sty m:val="p"/>
             </m:rPr>
-            <m:t>Δ</m:t>
+            <m:t>=</m:t>
           </m:r>
           <m:r>
-            <m:rPr>
-              <m:nor/>
-              <m:sty m:val="p"/>
-            </m:rPr>
-            <m:t>time</m:t>
+            <m:t>15</m:t>
           </m:r>
           <m:r>
             <m:rPr>
               <m:sty m:val="p"/>
             </m:rPr>
-            <m:t>=</m:t>
+            <m:t>°</m:t>
+          </m:r>
+          <m:r>
+            <m:rPr>
+              <m:sty m:val="p"/>
+            </m:rPr>
+            <m:t>×</m:t>
+          </m:r>
+          <m:r>
+            <m:rPr>
+              <m:sty m:val="p"/>
+            </m:rPr>
+            <m:t>(</m:t>
           </m:r>
           <m:sSub>
             <m:e>
@@ -1202,6 +1104,12 @@
               </m:r>
             </m:sub>
           </m:sSub>
+          <m:r>
+            <m:rPr>
+              <m:sty m:val="p"/>
+            </m:rPr>
+            <m:t>)</m:t>
+          </m:r>
         </m:oMath>
       </m:oMathPara>
     </w:p>
@@ -1210,13 +1118,7 @@
         <w:pStyle w:val="FirstParagraph"/>
       </w:pPr>
       <w:r>
-        <w:t xml:space="preserve">The difficulty was that no mechanical clock of the era was accurate enough to serve as</w:t>
-      </w:r>
-      <w:r>
-        <w:t xml:space="preserve"> </w:t>
-      </w:r>
-      <w:r>
-        <w:t xml:space="preserve">the</w:t>
+        <w:t xml:space="preserve">No mechanical clock of the era could keep that reference time aboard a ship for weeks. The alternative was</w:t>
       </w:r>
       <w:r>
         <w:t xml:space="preserve"> </w:t>
@@ -1226,41 +1128,10 @@
           <w:i/>
           <w:iCs/>
         </w:rPr>
-        <w:t xml:space="preserve">reference</w:t>
-      </w:r>
-      <w:r>
-        <w:t xml:space="preserve"> </w:t>
-      </w:r>
-      <w:r>
-        <w:t xml:space="preserve">clock aboard a ship for weeks. The alternative—an</w:t>
-      </w:r>
-      <w:r>
-        <w:t xml:space="preserve"> </w:t>
-      </w:r>
-      <w:r>
-        <w:rPr>
-          <w:i/>
-          <w:iCs/>
-        </w:rPr>
         <w:t xml:space="preserve">astronomical</w:t>
       </w:r>
       <w:r>
-        <w:t xml:space="preserve"> </w:t>
-      </w:r>
-      <w:r>
-        <w:t xml:space="preserve">solution—was to use a predictable celestial event (a lunar eclipse, an occultation of</w:t>
-      </w:r>
-      <w:r>
-        <w:t xml:space="preserve"> </w:t>
-      </w:r>
-      <w:r>
-        <w:t xml:space="preserve">a star by the moon, the moons of Jupiter) as a surrogate reference clock: time the event</w:t>
-      </w:r>
-      <w:r>
-        <w:t xml:space="preserve"> </w:t>
-      </w:r>
-      <w:r>
-        <w:t xml:space="preserve">locally, look up when it was predicted to occur at the reference meridian, subtract.</w:t>
+        <w:t xml:space="preserve">: use a predictable celestial event—a lunar eclipse, an occultation, the moons of Jupiter—as a surrogate reference clock, timing it locally and comparing with the time predicted at home.</w:t>
       </w:r>
     </w:p>
     <w:p>
@@ -1268,25 +1139,7 @@
         <w:pStyle w:val="BodyText"/>
       </w:pPr>
       <w:r>
-        <w:t xml:space="preserve">Van Langren had spent years perfecting one such method, using (as we thought) the</w:t>
-      </w:r>
-      <w:r>
-        <w:t xml:space="preserve"> </w:t>
-      </w:r>
-      <w:r>
-        <w:t xml:space="preserve">positions of sunrise and sunset lines crossing named peaks on the lunar surface—which</w:t>
-      </w:r>
-      <w:r>
-        <w:t xml:space="preserve"> </w:t>
-      </w:r>
-      <w:r>
-        <w:t xml:space="preserve">is why his cipher was so unexpected. What he had chosen to hide was neither the lunar</w:t>
-      </w:r>
-      <w:r>
-        <w:t xml:space="preserve"> </w:t>
-      </w:r>
-      <w:r>
-        <w:t xml:space="preserve">method nor a mechanical clock. It was a water clock.</w:t>
+        <w:t xml:space="preserve">That was the kind of answer everyone, including me, expected van Langren’s cipher to hold.</w:t>
       </w:r>
     </w:p>
     <w:bookmarkEnd w:id="28"/>

</xml_diff>

<commit_message>
Trim The Cipher Falls footnotes and opening; add wordcount.py
- Merge the two opening paragraphs and "solved it in a week"
- Zodiac footnote to one sentence; shorten Galileo/Hooke footnote
- wordcount.py: count the rendered .docx by section and category
  (body, headings, pull quotes, footnotes, captions, tables, display
  blocks, math, references)
</commit_message>
<xml_diff>
--- a/vanLangren-Secret.docx
+++ b/vanLangren-Secret.docx
@@ -1157,15 +1157,7 @@
         <w:pStyle w:val="FirstParagraph"/>
       </w:pPr>
       <w:r>
-        <w:t xml:space="preserve">Eleven years after our paper—long enough that I had filed the cryptogram away as a loose end nobody would ever tie off—I learned that it had been solved. Not by a historian of science, but by a Belgian warehouse worker and amateur cryptographer who loved a good puzzle.</w:t>
-      </w:r>
-    </w:p>
-    <w:p>
-      <w:pPr>
-        <w:pStyle w:val="BodyText"/>
-      </w:pPr>
-      <w:r>
-        <w:t xml:space="preserve">The cipher had been kept alive by other amateurs: the cryptology blogger Klaus Schmeh flagged it in 2015 as a neglected historical puzzle, and the mathematician</w:t>
+        <w:t xml:space="preserve">Eleven years after our paper—long enough that I had filed the cryptogram away as a loose end nobody would ever tie off—I learned that it had been solved. Not by a historian of science, but by a Belgian warehouse worker and amateur cryptographer. Other amateurs had kept it alive: the cryptology blogger Klaus Schmeh flagged it in 2015, and the mathematician</w:t>
       </w:r>
       <w:r>
         <w:t xml:space="preserve"> </w:t>
@@ -1182,7 +1174,7 @@
         <w:t xml:space="preserve"> </w:t>
       </w:r>
       <w:r>
-        <w:t xml:space="preserve">spent years shopping it around online forums, without success. Then, in December 2020, a trio of codebreakers—David Oranchak, Sam Blake, and Jarl Van Eycke—cracked the</w:t>
+        <w:t xml:space="preserve">spent years shopping it around online forums. Then, in December 2020, Jarl Van Eycke, with David Oranchak and Sam Blake, cracked the</w:t>
       </w:r>
       <w:r>
         <w:t xml:space="preserve"> </w:t>
@@ -1192,7 +1184,7 @@
           <w:rPr>
             <w:rStyle w:val="Hyperlink"/>
           </w:rPr>
-          <w:t xml:space="preserve">Zodiac Killer’s notorious Z340 cipher</w:t>
+          <w:t xml:space="preserve">Zodiac Killer’s Z340 cipher</w:t>
         </w:r>
       </w:hyperlink>
       <w:r>
@@ -1208,7 +1200,7 @@
         <w:t xml:space="preserve"> </w:t>
       </w:r>
       <w:r>
-        <w:t xml:space="preserve">unsolved for 51 years. Huylebrouck read the news, tracked down Van Eycke, and handed him the</w:t>
+        <w:t xml:space="preserve">unsolved for 51 years. Huylebrouck tracked down Van Eycke and handed him the</w:t>
       </w:r>
       <w:r>
         <w:t xml:space="preserve"> </w:t>
@@ -1221,15 +1213,7 @@
         <w:t xml:space="preserve">van Langren Code</w:t>
       </w:r>
       <w:r>
-        <w:t xml:space="preserve">.</w:t>
-      </w:r>
-    </w:p>
-    <w:p>
-      <w:pPr>
-        <w:pStyle w:val="BodyText"/>
-      </w:pPr>
-      <w:r>
-        <w:t xml:space="preserve">Van Eycke solved it in about a week!</w:t>
+        <w:t xml:space="preserve">. He solved it in about a week!</w:t>
       </w:r>
     </w:p>
     <w:p>
@@ -3856,25 +3840,7 @@
         <w:t xml:space="preserve"> </w:t>
       </w:r>
       <w:r>
-        <w:t xml:space="preserve">The Zodiac Killer is one of the most infamous unsolved mysteries in American criminal history.</w:t>
-      </w:r>
-      <w:r>
-        <w:t xml:space="preserve"> </w:t>
-      </w:r>
-      <w:r>
-        <w:t xml:space="preserve">In the San Francisco Bay Area in 1968–1969, this unknown murderer killed at least five people.</w:t>
-      </w:r>
-      <w:r>
-        <w:t xml:space="preserve"> </w:t>
-      </w:r>
-      <w:r>
-        <w:t xml:space="preserve">Seeking public attention, he sent cryptic ciphers to newspapers and taunted police with letters</w:t>
-      </w:r>
-      <w:r>
-        <w:t xml:space="preserve"> </w:t>
-      </w:r>
-      <w:r>
-        <w:t xml:space="preserve">describing his acts. Van Eycke’s solution was hailed as a breakthrough in amateur cryptographic circles.</w:t>
+        <w:t xml:space="preserve">The Zodiac Killer murdered at least five people in the San Francisco Bay Area in 1968–1969, taunting police with ciphers mailed to newspapers.</w:t>
       </w:r>
     </w:p>
   </w:footnote>
@@ -3936,32 +3902,20 @@
         <w:t xml:space="preserve"> </w:t>
       </w:r>
       <w:r>
-        <w:t xml:space="preserve">The practice of hiding a priority claim in a cipher was not unique to van Langren. Galileo registered his 1610 observation of Saturn’s peculiar shape as a 37-letter Latin anagram (</w:t>
+        <w:t xml:space="preserve">Hiding a priority claim in a cipher was not unique to van Langren. Galileo registered his 1610 observation of Saturn’s odd shape (the rings) as a Latin anagram,</w:t>
+      </w:r>
+      <w:r>
+        <w:t xml:space="preserve"> </w:t>
       </w:r>
       <w:r>
         <w:rPr>
           <w:i/>
           <w:iCs/>
         </w:rPr>
-        <w:t xml:space="preserve">Altissimum planetam tergeminum observavi</w:t>
-      </w:r>
-      <w:r>
-        <w:t xml:space="preserve"> </w:t>
-      </w:r>
-      <w:r>
-        <w:t xml:space="preserve">—</w:t>
-      </w:r>
-      <w:r>
-        <w:t xml:space="preserve"> </w:t>
-      </w:r>
-      <w:r>
         <w:t xml:space="preserve">“I have observed the highest planet three-formed”</w:t>
       </w:r>
       <w:r>
-        <w:t xml:space="preserve"> </w:t>
-      </w:r>
-      <w:r>
-        <w:t xml:space="preserve">— what he had actually seen were the rings). Robert Hooke published his law of elasticity as the anagram</w:t>
+        <w:t xml:space="preserve">; Robert Hooke published his law of elasticity in 1676 as</w:t>
       </w:r>
       <w:r>
         <w:t xml:space="preserve"> </w:t>
@@ -3974,10 +3928,7 @@
         <w:t xml:space="preserve">ceiiinosssttu</w:t>
       </w:r>
       <w:r>
-        <w:t xml:space="preserve"> </w:t>
-      </w:r>
-      <w:r>
-        <w:t xml:space="preserve">in 1676, decoding it two years later as</w:t>
+        <w:t xml:space="preserve">, later decoded as</w:t>
       </w:r>
       <w:r>
         <w:t xml:space="preserve"> </w:t>
@@ -3990,16 +3941,7 @@
         <w:t xml:space="preserve">ut tensio, sic vis</w:t>
       </w:r>
       <w:r>
-        <w:t xml:space="preserve"> </w:t>
-      </w:r>
-      <w:r>
-        <w:t xml:space="preserve">(</w:t>
-      </w:r>
-      <w:r>
-        <w:t xml:space="preserve">“as the extension, so the force”</w:t>
-      </w:r>
-      <w:r>
-        <w:t xml:space="preserve">). In each case the goal was the same: hold the date of discovery in escrow without giving anything away.</w:t>
+        <w:t xml:space="preserve">. Each held the date of discovery in escrow without giving anything away.</w:t>
       </w:r>
     </w:p>
   </w:footnote>

</xml_diff>

<commit_message>
Replace 1644 graph with Newberry Library scan; add figure source credits
- Fig. 6 now uses images/Langren1644-Newberry-bw.png (Newberry Library,
  Ayer folio QB225 .L36 1644) in place of the Tufte photograph
- Captions of figures needing permission or attribution end with
  "_Source_: ..." (1628 letter, map overlay, Harrison H1, 1644 graph)
</commit_message>
<xml_diff>
--- a/vanLangren-Secret.docx
+++ b/vanLangren-Secret.docx
@@ -277,6 +277,19 @@
             <w:r>
               <w:t xml:space="preserve">Figure 1: The graph from the undated 1628 letter: seven authorities’ estimates of the longitude difference between Toledo and Rome, plotted against a scale of degrees.</w:t>
             </w:r>
+            <w:r>
+              <w:t xml:space="preserve"> </w:t>
+            </w:r>
+            <w:r>
+              <w:rPr>
+                <w:i/>
+                <w:iCs/>
+              </w:rPr>
+              <w:t xml:space="preserve">Source</w:t>
+            </w:r>
+            <w:r>
+              <w:t xml:space="preserve">: private family archive, Spain, courtesy of Joaquín Ibáñez Ulargui.</w:t>
+            </w:r>
           </w:p>
           <w:bookmarkEnd w:id="13"/>
         </w:tc>
@@ -528,7 +541,29 @@
               <w:pStyle w:val="ImageCaption"/>
             </w:pPr>
             <w:r>
-              <w:t xml:space="preserve">Figure 2: van Langren’s 1644 graph showing 12 estimates of the longitude distance from Toledo to Rome by eminent astronomers, overlaid on a modern map</w:t>
+              <w:t xml:space="preserve">Figure 2: van Langren’s 1644 graph showing 12 estimates of the longitude distance from Toledo to Rome by eminent astronomers, overlaid on a modern map.</w:t>
+            </w:r>
+            <w:r>
+              <w:t xml:space="preserve"> </w:t>
+            </w:r>
+            <w:r>
+              <w:rPr>
+                <w:i/>
+                <w:iCs/>
+              </w:rPr>
+              <w:t xml:space="preserve">Source</w:t>
+            </w:r>
+            <w:r>
+              <w:t xml:space="preserve">:</w:t>
+            </w:r>
+            <w:r>
+              <w:t xml:space="preserve"> </w:t>
+            </w:r>
+            <w:r>
+              <w:t xml:space="preserve">Friendly et al. (2010)</w:t>
+            </w:r>
+            <w:r>
+              <w:t xml:space="preserve">.</w:t>
             </w:r>
           </w:p>
           <w:bookmarkEnd w:id="18"/>
@@ -2346,7 +2381,20 @@
               <w:pStyle w:val="ImageCaption"/>
             </w:pPr>
             <w:r>
-              <w:t xml:space="preserve">Figure 5: Harrison’s H1 marine chronometer (1735). By Phantom Photographer,</w:t>
+              <w:t xml:space="preserve">Figure 5: Harrison’s H1 marine chronometer (1735).</w:t>
+            </w:r>
+            <w:r>
+              <w:t xml:space="preserve"> </w:t>
+            </w:r>
+            <w:r>
+              <w:rPr>
+                <w:i/>
+                <w:iCs/>
+              </w:rPr>
+              <w:t xml:space="preserve">Source</w:t>
+            </w:r>
+            <w:r>
+              <w:t xml:space="preserve">: Phantom Photographer, Wikimedia Commons,</w:t>
             </w:r>
             <w:r>
               <w:t xml:space="preserve"> </w:t>
@@ -2870,14 +2918,14 @@
             <w:r>
               <w:drawing>
                 <wp:inline>
-                  <wp:extent cx="5334000" cy="1349828"/>
+                  <wp:extent cx="5334000" cy="1333500"/>
                   <wp:effectExtent b="0" l="0" r="0" t="0"/>
                   <wp:docPr descr="" title="" id="63" name="Picture"/>
                   <a:graphic>
                     <a:graphicData uri="http://schemas.openxmlformats.org/drawingml/2006/picture">
                       <pic:pic>
                         <pic:nvPicPr>
-                          <pic:cNvPr descr="images/Langren1644.jpg" id="64" name="Picture"/>
+                          <pic:cNvPr descr="images/Langren1644-Newberry-bw.png" id="64" name="Picture"/>
                           <pic:cNvPicPr>
                             <a:picLocks noChangeArrowheads="1" noChangeAspect="1"/>
                           </pic:cNvPicPr>
@@ -2891,7 +2939,7 @@
                         <pic:spPr bwMode="auto">
                           <a:xfrm>
                             <a:off x="0" y="0"/>
-                            <a:ext cx="5334000" cy="1349828"/>
+                            <a:ext cx="5334000" cy="1333500"/>
                           </a:xfrm>
                           <a:prstGeom prst="rect">
                             <a:avLst/>
@@ -2920,7 +2968,33 @@
               <w:pStyle w:val="ImageCaption"/>
             </w:pPr>
             <w:r>
-              <w:t xml:space="preserve">Figure 6: Van Langren’s original 1644 graph</w:t>
+              <w:t xml:space="preserve">Figure 6: Van Langren’s original 1644 graph, from</w:t>
+            </w:r>
+            <w:r>
+              <w:t xml:space="preserve"> </w:t>
+            </w:r>
+            <w:r>
+              <w:rPr>
+                <w:i/>
+                <w:iCs/>
+              </w:rPr>
+              <w:t xml:space="preserve">La Verdadera Longitud por Mar y Tierra</w:t>
+            </w:r>
+            <w:r>
+              <w:t xml:space="preserve">, p. [2].</w:t>
+            </w:r>
+            <w:r>
+              <w:t xml:space="preserve"> </w:t>
+            </w:r>
+            <w:r>
+              <w:rPr>
+                <w:i/>
+                <w:iCs/>
+              </w:rPr>
+              <w:t xml:space="preserve">Source</w:t>
+            </w:r>
+            <w:r>
+              <w:t xml:space="preserve">: Courtesy of The Newberry Library, Chicago. Ayer folio QB225 .L36 1644.</w:t>
             </w:r>
           </w:p>
           <w:bookmarkEnd w:id="65"/>

</xml_diff>

<commit_message>
Bonus: tighten "understanding through reproduction" paragraphs
- Tighten the last sentence of the "attempt to reproduce" paragraph
- Merge the two dot-plot paragraphs, keeping "a column of numbers,
  however sorted, tells you nothing at a glance about their spread"
</commit_message>
<xml_diff>
--- a/vanLangren-Secret.docx
+++ b/vanLangren-Secret.docx
@@ -288,7 +288,7 @@
               <w:t xml:space="preserve">Source</w:t>
             </w:r>
             <w:r>
-              <w:t xml:space="preserve">: private family archive, Spain, courtesy of Joaquín Ibáñez Ulargui.</w:t>
+              <w:t xml:space="preserve">: courtesy of Joaquín Ibáñez Ulargui, family archive</w:t>
             </w:r>
           </w:p>
           <w:bookmarkEnd w:id="13"/>
@@ -2608,19 +2608,19 @@
         <w:t xml:space="preserve"> </w:t>
       </w:r>
       <w:r>
-        <w:t xml:space="preserve">Those choices, and the difficulty of getting them right, reveal the intellectual and</w:t>
-      </w:r>
-      <w:r>
-        <w:t xml:space="preserve"> </w:t>
-      </w:r>
-      <w:r>
-        <w:t xml:space="preserve">graphical constraints of the time. The method can reveal hidden insights, help</w:t>
-      </w:r>
-      <w:r>
-        <w:t xml:space="preserve"> </w:t>
-      </w:r>
-      <w:r>
-        <w:t xml:space="preserve">to appreciate the historical ingenuity and sheer brilliance of hand-drawn graphics and reveal design flaws, such as distorted scales.</w:t>
+        <w:t xml:space="preserve">Those choices, and the difficulty of getting them right, reveal the constraints of the time—and</w:t>
+      </w:r>
+      <w:r>
+        <w:t xml:space="preserve"> </w:t>
+      </w:r>
+      <w:r>
+        <w:t xml:space="preserve">can expose hidden insights, design flaws such as distorted scales, and the sheer ingenuity of</w:t>
+      </w:r>
+      <w:r>
+        <w:t xml:space="preserve"> </w:t>
+      </w:r>
+      <w:r>
+        <w:t xml:space="preserve">hand-drawn graphics.</w:t>
       </w:r>
     </w:p>
     <w:p>
@@ -2640,27 +2640,25 @@
         <w:t xml:space="preserve"> </w:t>
       </w:r>
       <w:r>
-        <w:t xml:space="preserve">almost immediately why a table of twelve longitude values would not have made his point: a</w:t>
-      </w:r>
-      <w:r>
-        <w:t xml:space="preserve"> </w:t>
-      </w:r>
-      <w:r>
-        <w:t xml:space="preserve">column of numbers, however sorted, tells you nothing at a glance about their spread.</w:t>
-      </w:r>
-    </w:p>
-    <w:p>
-      <w:pPr>
-        <w:pStyle w:val="BodyText"/>
-      </w:pPr>
-      <w:r>
-        <w:t xml:space="preserve">Only when you place them on a common scale does the argument become visible—the estimates</w:t>
-      </w:r>
-      <w:r>
-        <w:t xml:space="preserve"> </w:t>
-      </w:r>
-      <w:r>
-        <w:t xml:space="preserve">are scattered across nearly the entire plausible range, and</w:t>
+        <w:t xml:space="preserve">almost immediately why a table of twelve longitude values would not have made his point:</w:t>
+      </w:r>
+      <w:r>
+        <w:t xml:space="preserve"> </w:t>
+      </w:r>
+      <w:r>
+        <w:t xml:space="preserve">a column of numbers, however sorted, tells you nothing at a glance about their spread.</w:t>
+      </w:r>
+      <w:r>
+        <w:t xml:space="preserve"> </w:t>
+      </w:r>
+      <w:r>
+        <w:t xml:space="preserve">Only on a common scale does it become visible that the estimates are scattered across nearly</w:t>
+      </w:r>
+      <w:r>
+        <w:t xml:space="preserve"> </w:t>
+      </w:r>
+      <w:r>
+        <w:t xml:space="preserve">the entire plausible range, and</w:t>
       </w:r>
       <w:r>
         <w:t xml:space="preserve"> </w:t>
@@ -2676,13 +2674,7 @@
         <w:t xml:space="preserve"> </w:t>
       </w:r>
       <w:r>
-        <w:t xml:space="preserve">is precisely van Langren’s case to</w:t>
-      </w:r>
-      <w:r>
-        <w:t xml:space="preserve"> </w:t>
-      </w:r>
-      <w:r>
-        <w:t xml:space="preserve">the King.</w:t>
+        <w:t xml:space="preserve">is precisely his case to the King.</w:t>
       </w:r>
     </w:p>
     <w:p>

</xml_diff>

<commit_message>
Add References heading; revise Fig. 1 source credit
- '## References' with a #refs div so the bibliography sits under it
  (before the HTML-only word-count appendix)
- Fig. 1 credit: courtesy of Joaquín Ibáñez Ulargui, family archive
</commit_message>
<xml_diff>
--- a/vanLangren-Secret.docx
+++ b/vanLangren-Secret.docx
@@ -3531,7 +3531,7 @@
     </w:p>
     <w:bookmarkEnd w:id="72"/>
     <w:bookmarkEnd w:id="73"/>
-    <w:bookmarkStart w:id="80" w:name="every-cipher-tells-a-story"/>
+    <w:bookmarkStart w:id="74" w:name="every-cipher-tells-a-story"/>
     <w:p>
       <w:pPr>
         <w:pStyle w:val="Heading2"/>
@@ -3639,8 +3639,18 @@
         <w:t xml:space="preserve">The shock of finding our interpretation wrong is replaced, in the end, by a feeling of satisfaction in being able to right the ship of history.</w:t>
       </w:r>
     </w:p>
-    <w:bookmarkStart w:id="79" w:name="refs"/>
-    <w:bookmarkStart w:id="74" w:name="ref-Friendly:2006:hbook"/>
+    <w:bookmarkEnd w:id="74"/>
+    <w:bookmarkStart w:id="81" w:name="references"/>
+    <w:p>
+      <w:pPr>
+        <w:pStyle w:val="Heading2"/>
+      </w:pPr>
+      <w:r>
+        <w:t xml:space="preserve">References</w:t>
+      </w:r>
+    </w:p>
+    <w:bookmarkStart w:id="80" w:name="refs"/>
+    <w:bookmarkStart w:id="75" w:name="ref-Friendly:2006:hbook"/>
     <w:p>
       <w:pPr>
         <w:pStyle w:val="Bibliography"/>
@@ -3674,8 +3684,8 @@
         <w:t xml:space="preserve">, edited by C. Chen, Wolfgang Härdle, and Antony Unwin, III. Springer-Verlag.</w:t>
       </w:r>
     </w:p>
-    <w:bookmarkEnd w:id="74"/>
-    <w:bookmarkStart w:id="76" w:name="ref-FriendlyChevaliers:2020"/>
+    <w:bookmarkEnd w:id="75"/>
+    <w:bookmarkStart w:id="77" w:name="ref-FriendlyChevaliers:2020"/>
     <w:p>
       <w:pPr>
         <w:pStyle w:val="Bibliography"/>
@@ -3702,7 +3712,7 @@
       <w:r>
         <w:t xml:space="preserve"> </w:t>
       </w:r>
-      <w:hyperlink r:id="rId75">
+      <w:hyperlink r:id="rId76">
         <w:r>
           <w:rPr>
             <w:rStyle w:val="Hyperlink"/>
@@ -3714,8 +3724,8 @@
         <w:t xml:space="preserve">.</w:t>
       </w:r>
     </w:p>
-    <w:bookmarkEnd w:id="76"/>
-    <w:bookmarkStart w:id="78" w:name="ref-Friendly:2010:langren"/>
+    <w:bookmarkEnd w:id="77"/>
+    <w:bookmarkStart w:id="79" w:name="ref-Friendly:2010:langren"/>
     <w:p>
       <w:pPr>
         <w:pStyle w:val="Bibliography"/>
@@ -3787,7 +3797,7 @@
       <w:r>
         <w:t xml:space="preserve"> </w:t>
       </w:r>
-      <w:hyperlink r:id="rId77">
+      <w:hyperlink r:id="rId78">
         <w:r>
           <w:rPr>
             <w:rStyle w:val="Hyperlink"/>
@@ -3799,9 +3809,9 @@
         <w:t xml:space="preserve">.</w:t>
       </w:r>
     </w:p>
-    <w:bookmarkEnd w:id="78"/>
     <w:bookmarkEnd w:id="79"/>
     <w:bookmarkEnd w:id="80"/>
+    <w:bookmarkEnd w:id="81"/>
     <w:sectPr/>
   </w:body>
 </w:document>

</xml_diff>

<commit_message>
Bonus: tighten overlay paragraph and ggplot2 bullets; fix Fig. 7 text size
- Overlay paragraph: drop coding detail; keep Snow and Minard as
  "the same approach I've used to re-vision..."
- Technique bullets shortened, each keeping its design reason
- Fig. 7: showtext dpi was hard-coded at 96, so text was twice as large
  in the .docx (HTML renders at 2x for retina). Use the chunk's dpi,
  halve text sizes, render at 300 dpi for print
- R/reproduce-langren-graph.R: same fix; saves a 300-dpi PNG; true
  distance 16°32'
</commit_message>
<xml_diff>
--- a/vanLangren-Secret.docx
+++ b/vanLangren-Secret.docx
@@ -2708,22 +2708,7 @@
         <w:t xml:space="preserve">HistData::Langren1644</w:t>
       </w:r>
       <w:r>
-        <w:t xml:space="preserve">, which also provides the Google map image used as a backdrop. Rebuilding it takes three layers, each written as its own function: (1) the map itself; (2) city markers for Toledo and Rome; and (3) the dot plot on top—the same trick I use elsewhere in</w:t>
-      </w:r>
-      <w:r>
-        <w:t xml:space="preserve"> </w:t>
-      </w:r>
-      <w:r>
-        <w:rPr>
-          <w:rStyle w:val="VerbatimChar"/>
-        </w:rPr>
-        <w:t xml:space="preserve">HistData</w:t>
-      </w:r>
-      <w:r>
-        <w:t xml:space="preserve"> </w:t>
-      </w:r>
-      <w:r>
-        <w:t xml:space="preserve">to re-vision</w:t>
+        <w:t xml:space="preserve">, which also provides the map image; rebuilding it takes three layers: (1) the map itself; (2) city markers for Toledo and Rome; and (3) the dot plot on top—the same approach I’ve used to re-vision</w:t>
       </w:r>
       <w:r>
         <w:t xml:space="preserve"> </w:t>
@@ -2733,7 +2718,7 @@
           <w:rPr>
             <w:rStyle w:val="Hyperlink"/>
           </w:rPr>
-          <w:t xml:space="preserve">John Snow’s Cholera dot plot</w:t>
+          <w:t xml:space="preserve">John Snow’s cholera map</w:t>
         </w:r>
       </w:hyperlink>
       <w:r>
@@ -2750,7 +2735,7 @@
           <w:rPr>
             <w:rStyle w:val="Hyperlink"/>
           </w:rPr>
-          <w:t xml:space="preserve">Minard’s March on Moscow graphic</w:t>
+          <w:t xml:space="preserve">Minard’s March on Moscow</w:t>
         </w:r>
       </w:hyperlink>
       <w:r>
@@ -3031,22 +3016,7 @@
         <w:t xml:space="preserve">Period font</w:t>
       </w:r>
       <w:r>
-        <w:t xml:space="preserve">: the</w:t>
-      </w:r>
-      <w:r>
-        <w:t xml:space="preserve"> </w:t>
-      </w:r>
-      <w:r>
-        <w:rPr>
-          <w:rStyle w:val="VerbatimChar"/>
-        </w:rPr>
-        <w:t xml:space="preserve">showtext</w:t>
-      </w:r>
-      <w:r>
-        <w:t xml:space="preserve"> </w:t>
-      </w:r>
-      <w:r>
-        <w:t xml:space="preserve">package loads</w:t>
+        <w:t xml:space="preserve">:</w:t>
       </w:r>
       <w:r>
         <w:t xml:space="preserve"> </w:t>
@@ -3059,22 +3029,25 @@
         <w:t xml:space="preserve">IM Fell English</w:t>
       </w:r>
       <w:r>
-        <w:t xml:space="preserve"> </w:t>
-      </w:r>
-      <w:r>
-        <w:t xml:space="preserve">from Google Fonts,</w:t>
-      </w:r>
-      <w:r>
-        <w:t xml:space="preserve"> </w:t>
-      </w:r>
-      <w:r>
-        <w:t xml:space="preserve">a typeface digitised from the Fell collection donated to Oxford University Press in</w:t>
-      </w:r>
-      <w:r>
-        <w:t xml:space="preserve"> </w:t>
-      </w:r>
-      <w:r>
-        <w:t xml:space="preserve">1686—forty-two years after</w:t>
+        <w:t xml:space="preserve">, loaded from Google Fonts with</w:t>
+      </w:r>
+      <w:r>
+        <w:t xml:space="preserve"> </w:t>
+      </w:r>
+      <w:r>
+        <w:rPr>
+          <w:rStyle w:val="VerbatimChar"/>
+        </w:rPr>
+        <w:t xml:space="preserve">showtext</w:t>
+      </w:r>
+      <w:r>
+        <w:t xml:space="preserve">—digitised</w:t>
+      </w:r>
+      <w:r>
+        <w:t xml:space="preserve"> </w:t>
+      </w:r>
+      <w:r>
+        <w:t xml:space="preserve">from type given to Oxford University Press in 1686, forty-two years after</w:t>
       </w:r>
       <w:r>
         <w:t xml:space="preserve"> </w:t>
@@ -3087,16 +3060,13 @@
         <w:t xml:space="preserve">La Verdadera</w:t>
       </w:r>
       <w:r>
-        <w:t xml:space="preserve"> </w:t>
-      </w:r>
-      <w:r>
-        <w:t xml:space="preserve">was printed, but as close in spirit as</w:t>
-      </w:r>
-      <w:r>
-        <w:t xml:space="preserve"> </w:t>
-      </w:r>
-      <w:r>
-        <w:t xml:space="preserve">a free font gets.</w:t>
+        <w:t xml:space="preserve">,</w:t>
+      </w:r>
+      <w:r>
+        <w:t xml:space="preserve"> </w:t>
+      </w:r>
+      <w:r>
+        <w:t xml:space="preserve">but as close in spirit as a free font gets.</w:t>
       </w:r>
     </w:p>
     <w:p>
@@ -3111,52 +3081,10 @@
           <w:b/>
           <w:bCs/>
         </w:rPr>
-        <w:t xml:space="preserve">Arbitrary geometry via</w:t>
-      </w:r>
-      <w:r>
-        <w:rPr>
-          <w:b/>
-          <w:bCs/>
-        </w:rPr>
-        <w:t xml:space="preserve"> </w:t>
-      </w:r>
-      <w:r>
-        <w:rPr>
-          <w:rStyle w:val="VerbatimChar"/>
-          <w:b/>
-          <w:bCs/>
-        </w:rPr>
-        <w:t xml:space="preserve">annotate()</w:t>
-      </w:r>
-      <w:r>
-        <w:t xml:space="preserve">: the axis line, minor tick marks, and major</w:t>
-      </w:r>
-      <w:r>
-        <w:t xml:space="preserve"> </w:t>
-      </w:r>
-      <w:r>
-        <w:t xml:space="preserve">ticks are plain</w:t>
-      </w:r>
-      <w:r>
-        <w:t xml:space="preserve"> </w:t>
-      </w:r>
-      <w:r>
-        <w:rPr>
-          <w:rStyle w:val="VerbatimChar"/>
-        </w:rPr>
-        <w:t xml:space="preserve">"segment"</w:t>
-      </w:r>
-      <w:r>
-        <w:t xml:space="preserve"> </w:t>
-      </w:r>
-      <w:r>
-        <w:t xml:space="preserve">annotations rather than the usual ggplot2 axis machinery,</w:t>
-      </w:r>
-      <w:r>
-        <w:t xml:space="preserve"> </w:t>
-      </w:r>
-      <w:r>
-        <w:t xml:space="preserve">which gives exact control over length and position. Fixed text labels—</w:t>
+        <w:t xml:space="preserve">Geometry by hand</w:t>
+      </w:r>
+      <w:r>
+        <w:t xml:space="preserve">: the axis, ticks, and fixed labels (</w:t>
       </w:r>
       <w:r>
         <w:rPr>
@@ -3192,7 +3120,7 @@
         <w:t xml:space="preserve">Grados de la Longitud.</w:t>
       </w:r>
       <w:r>
-        <w:t xml:space="preserve">—are placed the same way, with</w:t>
+        <w:t xml:space="preserve">) are drawn one by one with</w:t>
       </w:r>
       <w:r>
         <w:t xml:space="preserve"> </w:t>
@@ -3201,43 +3129,25 @@
         <w:rPr>
           <w:rStyle w:val="VerbatimChar"/>
         </w:rPr>
-        <w:t xml:space="preserve">hjust</w:t>
-      </w:r>
-      <w:r>
-        <w:t xml:space="preserve">,</w:t>
-      </w:r>
-      <w:r>
-        <w:t xml:space="preserve"> </w:t>
-      </w:r>
-      <w:r>
-        <w:rPr>
-          <w:rStyle w:val="VerbatimChar"/>
-        </w:rPr>
-        <w:t xml:space="preserve">vjust</w:t>
-      </w:r>
-      <w:r>
-        <w:t xml:space="preserve">,</w:t>
-      </w:r>
-      <w:r>
-        <w:t xml:space="preserve"> </w:t>
-      </w:r>
-      <w:r>
-        <w:t xml:space="preserve">and</w:t>
-      </w:r>
-      <w:r>
-        <w:t xml:space="preserve"> </w:t>
-      </w:r>
-      <w:r>
-        <w:rPr>
-          <w:rStyle w:val="VerbatimChar"/>
-        </w:rPr>
-        <w:t xml:space="preserve">angle</w:t>
-      </w:r>
-      <w:r>
-        <w:t xml:space="preserve"> </w:t>
-      </w:r>
-      <w:r>
-        <w:t xml:space="preserve">set individually.</w:t>
+        <w:t xml:space="preserve">annotate()</w:t>
+      </w:r>
+      <w:r>
+        <w:t xml:space="preserve"> </w:t>
+      </w:r>
+      <w:r>
+        <w:t xml:space="preserve">rather than ggplot2’s</w:t>
+      </w:r>
+      <w:r>
+        <w:t xml:space="preserve"> </w:t>
+      </w:r>
+      <w:r>
+        <w:t xml:space="preserve">axis machinery, giving exact control over each length, position, and angle—much as</w:t>
+      </w:r>
+      <w:r>
+        <w:t xml:space="preserve"> </w:t>
+      </w:r>
+      <w:r>
+        <w:t xml:space="preserve">the engraver had.</w:t>
       </w:r>
     </w:p>
     <w:p>
@@ -3255,13 +3165,7 @@
         <w:t xml:space="preserve">Snowman markers</w:t>
       </w:r>
       <w:r>
-        <w:t xml:space="preserve">: van Langren’s figure-8 data symbols are approximated by two</w:t>
-      </w:r>
-      <w:r>
-        <w:t xml:space="preserve"> </w:t>
-      </w:r>
-      <w:r>
-        <w:t xml:space="preserve">stacked</w:t>
+        <w:t xml:space="preserve">: each of van Langren’s figure-8 symbols is two stacked</w:t>
       </w:r>
       <w:r>
         <w:t xml:space="preserve"> </w:t>
@@ -3276,13 +3180,7 @@
         <w:t xml:space="preserve"> </w:t>
       </w:r>
       <w:r>
-        <w:t xml:space="preserve">calls, one per astronomer—a filled body circle sitting on</w:t>
-      </w:r>
-      <w:r>
-        <w:t xml:space="preserve"> </w:t>
-      </w:r>
-      <w:r>
-        <w:t xml:space="preserve">the axis and a smaller hollow head circle above it.</w:t>
+        <w:t xml:space="preserve">circles, a filled body on the axis and a smaller hollow head above it;</w:t>
       </w:r>
       <w:r>
         <w:t xml:space="preserve"> </w:t>
@@ -3291,25 +3189,13 @@
         <w:rPr>
           <w:rStyle w:val="VerbatimChar"/>
         </w:rPr>
-        <w:t xml:space="preserve">coord_fixed(ratio = 1)</w:t>
-      </w:r>
-      <w:r>
-        <w:t xml:space="preserve"> </w:t>
-      </w:r>
-      <w:r>
-        <w:t xml:space="preserve">locks</w:t>
-      </w:r>
-      <w:r>
-        <w:t xml:space="preserve"> </w:t>
-      </w:r>
-      <w:r>
-        <w:t xml:space="preserve">the x and y scales to the same physical size so the circles stay round and the</w:t>
-      </w:r>
-      <w:r>
-        <w:t xml:space="preserve"> </w:t>
-      </w:r>
-      <w:r>
-        <w:t xml:space="preserve">overall strip proportions match the original’s roughly 5:1 width-to-height ratio.</w:t>
+        <w:t xml:space="preserve">coord_fixed()</w:t>
+      </w:r>
+      <w:r>
+        <w:t xml:space="preserve"> </w:t>
+      </w:r>
+      <w:r>
+        <w:t xml:space="preserve">keeps them round and the strip in the original’s roughly 5:1 proportions.</w:t>
       </w:r>
     </w:p>
     <w:p>

</xml_diff>

<commit_message>
Bonus closing and Scherer rejoinder; Fig. 3 from Newberry copy
- Bonus step 6: tighten closing; "more than twelve degrees" (estimates
  span 12.4 degrees)
- Add short rejoinder on Cedric Scherer's 2021 ggplot2 version, with his
  figure (fig-scherer), credited
- Fig. 3 (page-8 cipher) now from the Newberry Library copy, with credit;
  full-page scan added
- "We always ask" -> "I always ask"
</commit_message>
<xml_diff>
--- a/vanLangren-Secret.docx
+++ b/vanLangren-Secret.docx
@@ -354,7 +354,7 @@
         <w:t xml:space="preserve">first graphical display of quantitative data</w:t>
       </w:r>
       <w:r>
-        <w:t xml:space="preserve">, a 1D dot plot, rather than the table anyone else at the time would have used. We always ask:</w:t>
+        <w:t xml:space="preserve">, a 1D dot plot, rather than the table anyone else at the time would have used. I always ask:</w:t>
       </w:r>
     </w:p>
     <w:p>
@@ -689,14 +689,14 @@
             <w:r>
               <w:drawing>
                 <wp:inline>
-                  <wp:extent cx="4267200" cy="2120302"/>
+                  <wp:extent cx="4267200" cy="1992923"/>
                   <wp:effectExtent b="0" l="0" r="0" t="0"/>
                   <wp:docPr descr="" title="" id="22" name="Picture"/>
                   <a:graphic>
                     <a:graphicData uri="http://schemas.openxmlformats.org/drawingml/2006/picture">
                       <pic:pic>
                         <pic:nvPicPr>
-                          <pic:cNvPr descr="images/verdadera-cipher.jpg" id="23" name="Picture"/>
+                          <pic:cNvPr descr="images/verdadera-cipher-Newberry-bw.png" id="23" name="Picture"/>
                           <pic:cNvPicPr>
                             <a:picLocks noChangeArrowheads="1" noChangeAspect="1"/>
                           </pic:cNvPicPr>
@@ -710,7 +710,7 @@
                         <pic:spPr bwMode="auto">
                           <a:xfrm>
                             <a:off x="0" y="0"/>
-                            <a:ext cx="4267200" cy="2120302"/>
+                            <a:ext cx="4267200" cy="1992923"/>
                           </a:xfrm>
                           <a:prstGeom prst="rect">
                             <a:avLst/>
@@ -756,6 +756,19 @@
             </w:r>
             <w:r>
               <w:t xml:space="preserve">(1644): the printed cipher, exactly as van Langren’s readers first saw it.</w:t>
+            </w:r>
+            <w:r>
+              <w:t xml:space="preserve"> </w:t>
+            </w:r>
+            <w:r>
+              <w:rPr>
+                <w:i/>
+                <w:iCs/>
+              </w:rPr>
+              <w:t xml:space="preserve">Source</w:t>
+            </w:r>
+            <w:r>
+              <w:t xml:space="preserve">: Courtesy of The Newberry Library, Chicago. Ayer folio QB225 .L36 1644.</w:t>
             </w:r>
           </w:p>
           <w:bookmarkEnd w:id="24"/>
@@ -2494,7 +2507,7 @@
       </w:r>
     </w:p>
     <w:bookmarkEnd w:id="57"/>
-    <w:bookmarkStart w:id="73" w:name="bonus-reproducing-langrens-1644-graph"/>
+    <w:bookmarkStart w:id="78" w:name="bonus-reproducing-langrens-1644-graph"/>
     <w:p>
       <w:pPr>
         <w:pStyle w:val="Heading2"/>
@@ -2762,7 +2775,7 @@
         <w:t xml:space="preserve">.</w:t>
       </w:r>
     </w:p>
-    <w:bookmarkStart w:id="72" w:name="i-did-that-better-by-hand"/>
+    <w:bookmarkStart w:id="77" w:name="i-did-that-better-by-hand"/>
     <w:p>
       <w:pPr>
         <w:pStyle w:val="Heading3"/>
@@ -3333,7 +3346,7 @@
         <w:t xml:space="preserve"> </w:t>
       </w:r>
       <w:r>
-        <w:t xml:space="preserve">circles. Moreover, if I showed him the</w:t>
+        <w:t xml:space="preserve">circles. Shown the</w:t>
       </w:r>
       <w:r>
         <w:t xml:space="preserve"> </w:t>
@@ -3348,25 +3361,25 @@
         <w:t xml:space="preserve"> </w:t>
       </w:r>
       <w:r>
-        <w:t xml:space="preserve">code, he might say,</w:t>
-      </w:r>
-      <w:r>
-        <w:t xml:space="preserve"> </w:t>
-      </w:r>
-      <w:r>
-        <w:t xml:space="preserve">“What a lot</w:t>
-      </w:r>
-      <w:r>
-        <w:t xml:space="preserve"> </w:t>
-      </w:r>
-      <w:r>
-        <w:t xml:space="preserve">of trouble to do what I did lovingly by hand.”</w:t>
-      </w:r>
-      <w:r>
-        <w:t xml:space="preserve"> </w:t>
-      </w:r>
-      <w:r>
-        <w:t xml:space="preserve">He’s got a point: the 80/20 rule (or</w:t>
+        <w:t xml:space="preserve">code, he might add,</w:t>
+      </w:r>
+      <w:r>
+        <w:t xml:space="preserve"> </w:t>
+      </w:r>
+      <w:r>
+        <w:t xml:space="preserve">“What a lot of trouble to do what I</w:t>
+      </w:r>
+      <w:r>
+        <w:t xml:space="preserve"> </w:t>
+      </w:r>
+      <w:r>
+        <w:t xml:space="preserve">did lovingly by hand.”</w:t>
+      </w:r>
+      <w:r>
+        <w:t xml:space="preserve"> </w:t>
+      </w:r>
+      <w:r>
+        <w:t xml:space="preserve">And he’d be right: the 80/20 rule (or</w:t>
       </w:r>
       <w:r>
         <w:t xml:space="preserve"> </w:t>
@@ -3380,19 +3393,13 @@
         </w:r>
       </w:hyperlink>
       <w:r>
-        <w:t xml:space="preserve">) for data graphics says</w:t>
-      </w:r>
-      <w:r>
-        <w:t xml:space="preserve"> </w:t>
-      </w:r>
-      <w:r>
-        <w:t xml:space="preserve">that you can achieve 80% of your graphic design with 20% of the work, but</w:t>
-      </w:r>
-      <w:r>
-        <w:t xml:space="preserve"> </w:t>
-      </w:r>
-      <w:r>
-        <w:t xml:space="preserve">it takes the remaining 80% of work to perfect it.</w:t>
+        <w:t xml:space="preserve">) of data graphics says</w:t>
+      </w:r>
+      <w:r>
+        <w:t xml:space="preserve"> </w:t>
+      </w:r>
+      <w:r>
+        <w:t xml:space="preserve">that 20% of the work gets you 80% of the way; perfecting it takes the other 80%.</w:t>
       </w:r>
     </w:p>
     <w:p>
@@ -3400,13 +3407,13 @@
         <w:pStyle w:val="BodyText"/>
       </w:pPr>
       <w:r>
-        <w:t xml:space="preserve">Nevertheless the argument the graph was built to make comes through regardless: twelve</w:t>
-      </w:r>
-      <w:r>
-        <w:t xml:space="preserve"> </w:t>
-      </w:r>
-      <w:r>
-        <w:t xml:space="preserve">authorities, strung across more than fifteen degrees, and not one of them close to the</w:t>
+        <w:t xml:space="preserve">The argument the graph was built to make comes through regardless: twelve</w:t>
+      </w:r>
+      <w:r>
+        <w:t xml:space="preserve"> </w:t>
+      </w:r>
+      <w:r>
+        <w:t xml:space="preserve">authorities, strung across more than twelve degrees, and not one of them close to the</w:t>
       </w:r>
       <w:r>
         <w:t xml:space="preserve"> </w:t>
@@ -3415,9 +3422,179 @@
         <w:t xml:space="preserve">true answer of 16°32’.</w:t>
       </w:r>
     </w:p>
-    <w:bookmarkEnd w:id="72"/>
-    <w:bookmarkEnd w:id="73"/>
-    <w:bookmarkStart w:id="74" w:name="every-cipher-tells-a-story"/>
+    <w:p>
+      <w:pPr>
+        <w:pStyle w:val="BodyText"/>
+      </w:pPr>
+      <w:r>
+        <w:t xml:space="preserve">Some do go the remaining 80%. For the #30DayChartChallenge in 2021, Cédric Scherer took</w:t>
+      </w:r>
+      <w:r>
+        <w:t xml:space="preserve"> </w:t>
+      </w:r>
+      <w:r>
+        <w:t xml:space="preserve">up the Dutchman’s challenge (</w:t>
+      </w:r>
+      <w:hyperlink w:anchor="fig-scherer">
+        <w:r>
+          <w:rPr>
+            <w:rStyle w:val="Hyperlink"/>
+          </w:rPr>
+          <w:t xml:space="preserve">Figure 8</w:t>
+        </w:r>
+      </w:hyperlink>
+      <w:r>
+        <w:t xml:space="preserve">), with period-style typefaces, snowmen assembled</w:t>
+      </w:r>
+      <w:r>
+        <w:t xml:space="preserve"> </w:t>
+      </w:r>
+      <w:r>
+        <w:t xml:space="preserve">from four stacked symbols, and every marker and label placed by hand—down to the</w:t>
+      </w:r>
+      <w:r>
+        <w:t xml:space="preserve"> </w:t>
+      </w:r>
+      <w:r>
+        <w:t xml:space="preserve">engraver’s long s in</w:t>
+      </w:r>
+      <w:r>
+        <w:t xml:space="preserve"> </w:t>
+      </w:r>
+      <w:r>
+        <w:t xml:space="preserve">“Ianfonius.”</w:t>
+      </w:r>
+      <w:r>
+        <w:t xml:space="preserve"> </w:t>
+      </w:r>
+      <w:r>
+        <w:t xml:space="preserve">Van Langren might even approve.</w:t>
+      </w:r>
+    </w:p>
+    <w:tbl>
+      <w:tblPr>
+        <w:tblStyle w:val="Table"/>
+        <w:tblW w:type="pct" w:w="5000"/>
+        <w:tblLayout w:type="fixed"/>
+        <w:tblLook w:firstRow="0" w:lastRow="0" w:firstColumn="0" w:lastColumn="0" w:noHBand="0" w:noVBand="0" w:val="0000"/>
+      </w:tblPr>
+      <w:tblGrid>
+        <w:gridCol w:w="7920"/>
+      </w:tblGrid>
+      <w:tr>
+        <w:tc>
+          <w:tcPr/>
+          <w:bookmarkStart w:id="76" w:name="fig-scherer"/>
+          <w:p>
+            <w:pPr>
+              <w:pStyle w:val="Compact"/>
+              <w:jc w:val="center"/>
+            </w:pPr>
+            <w:r>
+              <w:drawing>
+                <wp:inline>
+                  <wp:extent cx="5334000" cy="1394113"/>
+                  <wp:effectExtent b="0" l="0" r="0" t="0"/>
+                  <wp:docPr descr="" title="" id="73" name="Picture"/>
+                  <a:graphic>
+                    <a:graphicData uri="http://schemas.openxmlformats.org/drawingml/2006/picture">
+                      <pic:pic>
+                        <pic:nvPicPr>
+                          <pic:cNvPr descr="images/03_historical.png" id="74" name="Picture"/>
+                          <pic:cNvPicPr>
+                            <a:picLocks noChangeArrowheads="1" noChangeAspect="1"/>
+                          </pic:cNvPicPr>
+                        </pic:nvPicPr>
+                        <pic:blipFill>
+                          <a:blip r:embed="rId72"/>
+                          <a:stretch>
+                            <a:fillRect/>
+                          </a:stretch>
+                        </pic:blipFill>
+                        <pic:spPr bwMode="auto">
+                          <a:xfrm>
+                            <a:off x="0" y="0"/>
+                            <a:ext cx="5334000" cy="1394113"/>
+                          </a:xfrm>
+                          <a:prstGeom prst="rect">
+                            <a:avLst/>
+                          </a:prstGeom>
+                          <a:noFill/>
+                          <a:ln w="9525">
+                            <a:noFill/>
+                            <a:headEnd/>
+                            <a:tailEnd/>
+                          </a:ln>
+                        </pic:spPr>
+                      </pic:pic>
+                    </a:graphicData>
+                  </a:graphic>
+                </wp:inline>
+              </w:drawing>
+            </w:r>
+          </w:p>
+          <w:p>
+            <w:pPr>
+              <w:jc w:val="center"/>
+            </w:pPr>
+            <w:pPr>
+              <w:jc w:val="left"/>
+              <w:spacing w:before="200"/>
+              <w:pStyle w:val="ImageCaption"/>
+            </w:pPr>
+            <w:r>
+              <w:t xml:space="preserve">Figure 8: Cédric Scherer’s</w:t>
+            </w:r>
+            <w:r>
+              <w:t xml:space="preserve"> </w:t>
+            </w:r>
+            <w:r>
+              <w:rPr>
+                <w:rStyle w:val="VerbatimChar"/>
+              </w:rPr>
+              <w:t xml:space="preserve">ggplot2</w:t>
+            </w:r>
+            <w:r>
+              <w:t xml:space="preserve"> </w:t>
+            </w:r>
+            <w:r>
+              <w:t xml:space="preserve">version of van Langren’s graph, #30DayChartChallenge 2021, Day 3: Historical.</w:t>
+            </w:r>
+            <w:r>
+              <w:t xml:space="preserve"> </w:t>
+            </w:r>
+            <w:r>
+              <w:rPr>
+                <w:i/>
+                <w:iCs/>
+              </w:rPr>
+              <w:t xml:space="preserve">Source</w:t>
+            </w:r>
+            <w:r>
+              <w:t xml:space="preserve">: Cédric Scherer,</w:t>
+            </w:r>
+            <w:r>
+              <w:t xml:space="preserve"> </w:t>
+            </w:r>
+            <w:hyperlink r:id="rId75">
+              <w:r>
+                <w:rPr>
+                  <w:rStyle w:val="Hyperlink"/>
+                </w:rPr>
+                <w:t xml:space="preserve">github.com/z3tt/30DayChartChallenge2021</w:t>
+              </w:r>
+            </w:hyperlink>
+            <w:r>
+              <w:t xml:space="preserve">.</w:t>
+            </w:r>
+          </w:p>
+          <w:bookmarkEnd w:id="76"/>
+        </w:tc>
+      </w:tr>
+    </w:tbl>
+    <w:bookmarkEnd w:id="77"/>
+    <w:bookmarkEnd w:id="78"/>
+    <w:bookmarkStart w:id="79" w:name="every-cipher-tells-a-story"/>
     <w:p>
       <w:pPr>
         <w:pStyle w:val="Heading2"/>
@@ -3525,8 +3702,8 @@
         <w:t xml:space="preserve">The shock of finding our interpretation wrong is replaced, in the end, by a feeling of satisfaction in being able to right the ship of history.</w:t>
       </w:r>
     </w:p>
-    <w:bookmarkEnd w:id="74"/>
-    <w:bookmarkStart w:id="81" w:name="references"/>
+    <w:bookmarkEnd w:id="79"/>
+    <w:bookmarkStart w:id="86" w:name="references"/>
     <w:p>
       <w:pPr>
         <w:pStyle w:val="Heading2"/>
@@ -3535,8 +3712,8 @@
         <w:t xml:space="preserve">References</w:t>
       </w:r>
     </w:p>
-    <w:bookmarkStart w:id="80" w:name="refs"/>
-    <w:bookmarkStart w:id="75" w:name="ref-Friendly:2006:hbook"/>
+    <w:bookmarkStart w:id="85" w:name="refs"/>
+    <w:bookmarkStart w:id="80" w:name="ref-Friendly:2006:hbook"/>
     <w:p>
       <w:pPr>
         <w:pStyle w:val="Bibliography"/>
@@ -3570,8 +3747,8 @@
         <w:t xml:space="preserve">, edited by C. Chen, Wolfgang Härdle, and Antony Unwin, III. Springer-Verlag.</w:t>
       </w:r>
     </w:p>
-    <w:bookmarkEnd w:id="75"/>
-    <w:bookmarkStart w:id="77" w:name="ref-FriendlyChevaliers:2020"/>
+    <w:bookmarkEnd w:id="80"/>
+    <w:bookmarkStart w:id="82" w:name="ref-FriendlyChevaliers:2020"/>
     <w:p>
       <w:pPr>
         <w:pStyle w:val="Bibliography"/>
@@ -3598,7 +3775,7 @@
       <w:r>
         <w:t xml:space="preserve"> </w:t>
       </w:r>
-      <w:hyperlink r:id="rId76">
+      <w:hyperlink r:id="rId81">
         <w:r>
           <w:rPr>
             <w:rStyle w:val="Hyperlink"/>
@@ -3610,8 +3787,8 @@
         <w:t xml:space="preserve">.</w:t>
       </w:r>
     </w:p>
-    <w:bookmarkEnd w:id="77"/>
-    <w:bookmarkStart w:id="79" w:name="ref-Friendly:2010:langren"/>
+    <w:bookmarkEnd w:id="82"/>
+    <w:bookmarkStart w:id="84" w:name="ref-Friendly:2010:langren"/>
     <w:p>
       <w:pPr>
         <w:pStyle w:val="Bibliography"/>
@@ -3683,7 +3860,7 @@
       <w:r>
         <w:t xml:space="preserve"> </w:t>
       </w:r>
-      <w:hyperlink r:id="rId78">
+      <w:hyperlink r:id="rId83">
         <w:r>
           <w:rPr>
             <w:rStyle w:val="Hyperlink"/>
@@ -3695,9 +3872,9 @@
         <w:t xml:space="preserve">.</w:t>
       </w:r>
     </w:p>
-    <w:bookmarkEnd w:id="79"/>
-    <w:bookmarkEnd w:id="80"/>
-    <w:bookmarkEnd w:id="81"/>
+    <w:bookmarkEnd w:id="84"/>
+    <w:bookmarkEnd w:id="85"/>
+    <w:bookmarkEnd w:id="86"/>
     <w:sectPr/>
   </w:body>
 </w:document>

</xml_diff>

<commit_message>
Numbered reference list: convert source links to citations
- IEEE numbered style (ieee.csl); 11 references, from 2
- New entries: La Verdadera (1644), 1645 moon map, 2010 supplementary
  materials, Z340 paper, Schmeh (2021), Royal Museums Greenwich,
  HistData, Scherer (2021)
- Background-only links (Wikipedia etc.) removed; R script and
  transcription links kept (repo footnote covers them in print)
- Fig. 6 caption: p. 2
</commit_message>
<xml_diff>
--- a/vanLangren-Secret.docx
+++ b/vanLangren-Secret.docx
@@ -71,16 +71,7 @@
         <w:t xml:space="preserve"> </w:t>
       </w:r>
       <w:r>
-        <w:t xml:space="preserve">(</w:t>
-      </w:r>
-      <w:r>
-        <w:t xml:space="preserve">Friendly and les Chevaliers</w:t>
-      </w:r>
-      <w:r>
-        <w:t xml:space="preserve"> </w:t>
-      </w:r>
-      <w:r>
-        <w:t xml:space="preserve">2020)</w:t>
+        <w:t xml:space="preserve">[1]</w:t>
       </w:r>
       <w:r>
         <w:t xml:space="preserve">.</w:t>
@@ -143,7 +134,7 @@
         <w:t xml:space="preserve">This is one such tale.</w:t>
       </w:r>
     </w:p>
-    <w:bookmarkStart w:id="27" w:name="how-i-got-here"/>
+    <w:bookmarkStart w:id="23" w:name="how-i-got-here"/>
     <w:p>
       <w:pPr>
         <w:pStyle w:val="Heading2"/>
@@ -189,16 +180,19 @@
       <w:r>
         <w:t xml:space="preserve"> </w:t>
       </w:r>
-      <w:hyperlink r:id="rId9">
-        <w:r>
-          <w:rPr>
-            <w:rStyle w:val="Hyperlink"/>
-            <w:i/>
-            <w:iCs/>
-          </w:rPr>
-          <w:t xml:space="preserve">La Verdadera Longitud por Mar y Tierra</w:t>
-        </w:r>
-      </w:hyperlink>
+      <w:r>
+        <w:rPr>
+          <w:i/>
+          <w:iCs/>
+        </w:rPr>
+        <w:t xml:space="preserve">La Verdadera Longitud por Mar y Tierra</w:t>
+      </w:r>
+      <w:r>
+        <w:t xml:space="preserve"> </w:t>
+      </w:r>
+      <w:r>
+        <w:t xml:space="preserve">[2]</w:t>
+      </w:r>
       <w:r>
         <w:t xml:space="preserve">—but predated it by at least sixteen years. Was I interested? I was indeed! Graduate students at my university were on strike, so I had plenty of time for a new historical hero.</w:t>
       </w:r>
@@ -216,7 +210,7 @@
       <w:tr>
         <w:tc>
           <w:tcPr/>
-          <w:bookmarkStart w:id="13" w:name="fig-1628-letter"/>
+          <w:bookmarkStart w:id="12" w:name="fig-1628-letter"/>
           <w:p>
             <w:pPr>
               <w:pStyle w:val="Compact"/>
@@ -227,18 +221,18 @@
                 <wp:inline>
                   <wp:extent cx="5334000" cy="1656129"/>
                   <wp:effectExtent b="0" l="0" r="0" t="0"/>
-                  <wp:docPr descr="" title="" id="11" name="Picture"/>
+                  <wp:docPr descr="" title="" id="10" name="Picture"/>
                   <a:graphic>
                     <a:graphicData uri="http://schemas.openxmlformats.org/drawingml/2006/picture">
                       <pic:pic>
                         <pic:nvPicPr>
-                          <pic:cNvPr descr="images/vanLangren1628-graph.jpg" id="12" name="Picture"/>
+                          <pic:cNvPr descr="images/vanLangren1628-graph.jpg" id="11" name="Picture"/>
                           <pic:cNvPicPr>
                             <a:picLocks noChangeArrowheads="1" noChangeAspect="1"/>
                           </pic:cNvPicPr>
                         </pic:nvPicPr>
                         <pic:blipFill>
-                          <a:blip r:embed="rId10"/>
+                          <a:blip r:embed="rId9"/>
                           <a:stretch>
                             <a:fillRect/>
                           </a:stretch>
@@ -291,7 +285,7 @@
               <w:t xml:space="preserve">: courtesy of Joaquín Ibáñez Ulargui, family archive</w:t>
             </w:r>
           </w:p>
-          <w:bookmarkEnd w:id="13"/>
+          <w:bookmarkEnd w:id="12"/>
         </w:tc>
       </w:tr>
     </w:tbl>
@@ -316,7 +310,7 @@
         <w:t xml:space="preserve"> </w:t>
       </w:r>
       <w:r>
-        <w:t xml:space="preserve">(Friendly et al. 2010)</w:t>
+        <w:t xml:space="preserve">[3]</w:t>
       </w:r>
       <w:r>
         <w:t xml:space="preserve">.</w:t>
@@ -396,7 +390,7 @@
         <w:rPr>
           <w:rStyle w:val="FootnoteReference"/>
         </w:rPr>
-        <w:footnoteReference w:id="14"/>
+        <w:footnoteReference w:id="13"/>
       </w:r>
       <w:r>
         <w:t xml:space="preserve"> </w:t>
@@ -482,7 +476,7 @@
       <w:tr>
         <w:tc>
           <w:tcPr/>
-          <w:bookmarkStart w:id="18" w:name="fig-1644-overlay"/>
+          <w:bookmarkStart w:id="17" w:name="fig-1644-overlay"/>
           <w:p>
             <w:pPr>
               <w:pStyle w:val="Compact"/>
@@ -493,18 +487,18 @@
                 <wp:inline>
                   <wp:extent cx="5334000" cy="1067954"/>
                   <wp:effectExtent b="0" l="0" r="0" t="0"/>
-                  <wp:docPr descr="" title="" id="16" name="Picture"/>
+                  <wp:docPr descr="" title="" id="15" name="Picture"/>
                   <a:graphic>
                     <a:graphicData uri="http://schemas.openxmlformats.org/drawingml/2006/picture">
                       <pic:pic>
                         <pic:nvPicPr>
-                          <pic:cNvPr descr="images/Langren1644-overlay.jpg" id="17" name="Picture"/>
+                          <pic:cNvPr descr="images/Langren1644-overlay.jpg" id="16" name="Picture"/>
                           <pic:cNvPicPr>
                             <a:picLocks noChangeArrowheads="1" noChangeAspect="1"/>
                           </pic:cNvPicPr>
                         </pic:nvPicPr>
                         <pic:blipFill>
-                          <a:blip r:embed="rId15"/>
+                          <a:blip r:embed="rId14"/>
                           <a:stretch>
                             <a:fillRect/>
                           </a:stretch>
@@ -560,13 +554,13 @@
               <w:t xml:space="preserve"> </w:t>
             </w:r>
             <w:r>
-              <w:t xml:space="preserve">Friendly et al. (2010)</w:t>
+              <w:t xml:space="preserve">[3]</w:t>
             </w:r>
             <w:r>
               <w:t xml:space="preserve">.</w:t>
             </w:r>
           </w:p>
-          <w:bookmarkEnd w:id="18"/>
+          <w:bookmarkEnd w:id="17"/>
         </w:tc>
       </w:tr>
     </w:tbl>
@@ -610,33 +604,18 @@
         </w:r>
       </w:hyperlink>
       <w:r>
-        <w:t xml:space="preserve">), promising to reveal the plaintext after suitable compensation. Except for the puzzle, the</w:t>
-      </w:r>
-      <w:r>
-        <w:t xml:space="preserve"> </w:t>
-      </w:r>
-      <w:hyperlink r:id="rId19">
-        <w:r>
-          <w:rPr>
-            <w:rStyle w:val="Hyperlink"/>
-          </w:rPr>
-          <w:t xml:space="preserve">text of</w:t>
-        </w:r>
-        <w:r>
-          <w:rPr>
-            <w:rStyle w:val="Hyperlink"/>
-          </w:rPr>
-          <w:t xml:space="preserve"> </w:t>
-        </w:r>
-        <w:r>
-          <w:rPr>
-            <w:rStyle w:val="Hyperlink"/>
-            <w:i/>
-            <w:iCs/>
-          </w:rPr>
-          <w:t xml:space="preserve">La Verdadera</w:t>
-        </w:r>
-      </w:hyperlink>
+        <w:t xml:space="preserve">), promising to reveal the plaintext after suitable compensation. Except for the puzzle, the text of</w:t>
+      </w:r>
+      <w:r>
+        <w:t xml:space="preserve"> </w:t>
+      </w:r>
+      <w:r>
+        <w:rPr>
+          <w:i/>
+          <w:iCs/>
+        </w:rPr>
+        <w:t xml:space="preserve">La Verdadera</w:t>
+      </w:r>
       <w:r>
         <w:t xml:space="preserve"> </w:t>
       </w:r>
@@ -647,19 +626,14 @@
         <w:t xml:space="preserve"> </w:t>
       </w:r>
       <w:r>
-        <w:t xml:space="preserve">We reproduced the ciphertext in</w:t>
-      </w:r>
-      <w:r>
-        <w:t xml:space="preserve"> </w:t>
-      </w:r>
-      <w:hyperlink r:id="rId20">
-        <w:r>
-          <w:rPr>
-            <w:rStyle w:val="Hyperlink"/>
-          </w:rPr>
-          <w:t xml:space="preserve">our supplementary materials</w:t>
-        </w:r>
-      </w:hyperlink>
+        <w:t xml:space="preserve">We reproduced the ciphertext in our supplementary materials</w:t>
+      </w:r>
+      <w:r>
+        <w:t xml:space="preserve"> </w:t>
+      </w:r>
+      <w:r>
+        <w:t xml:space="preserve">[4]</w:t>
+      </w:r>
       <w:r>
         <w:t xml:space="preserve"> </w:t>
       </w:r>
@@ -680,7 +654,7 @@
       <w:tr>
         <w:tc>
           <w:tcPr/>
-          <w:bookmarkStart w:id="24" w:name="fig-cipher-page"/>
+          <w:bookmarkStart w:id="21" w:name="fig-cipher-page"/>
           <w:p>
             <w:pPr>
               <w:pStyle w:val="Compact"/>
@@ -691,18 +665,18 @@
                 <wp:inline>
                   <wp:extent cx="4267200" cy="1992923"/>
                   <wp:effectExtent b="0" l="0" r="0" t="0"/>
-                  <wp:docPr descr="" title="" id="22" name="Picture"/>
+                  <wp:docPr descr="" title="" id="19" name="Picture"/>
                   <a:graphic>
                     <a:graphicData uri="http://schemas.openxmlformats.org/drawingml/2006/picture">
                       <pic:pic>
                         <pic:nvPicPr>
-                          <pic:cNvPr descr="images/verdadera-cipher-Newberry-bw.png" id="23" name="Picture"/>
+                          <pic:cNvPr descr="images/verdadera-cipher-Newberry-bw.png" id="20" name="Picture"/>
                           <pic:cNvPicPr>
                             <a:picLocks noChangeArrowheads="1" noChangeAspect="1"/>
                           </pic:cNvPicPr>
                         </pic:nvPicPr>
                         <pic:blipFill>
-                          <a:blip r:embed="rId21"/>
+                          <a:blip r:embed="rId18"/>
                           <a:stretch>
                             <a:fillRect/>
                           </a:stretch>
@@ -771,7 +745,7 @@
               <w:t xml:space="preserve">: Courtesy of The Newberry Library, Chicago. Ayer folio QB225 .L36 1644.</w:t>
             </w:r>
           </w:p>
-          <w:bookmarkEnd w:id="24"/>
+          <w:bookmarkEnd w:id="21"/>
         </w:tc>
       </w:tr>
     </w:tbl>
@@ -785,7 +759,7 @@
       <w:r>
         <w:t xml:space="preserve"> </w:t>
       </w:r>
-      <w:hyperlink r:id="rId25">
+      <w:hyperlink r:id="rId22">
         <w:r>
           <w:rPr>
             <w:rStyle w:val="Hyperlink"/>
@@ -878,25 +852,20 @@
         <w:pStyle w:val="BodyText"/>
       </w:pPr>
       <w:r>
-        <w:t xml:space="preserve">I assumed, as I think most people who have written about van Langren did, that his secret had to do with the achievement he’s remembered for:</w:t>
-      </w:r>
-      <w:r>
-        <w:t xml:space="preserve"> </w:t>
-      </w:r>
-      <w:hyperlink r:id="rId26">
-        <w:r>
-          <w:rPr>
-            <w:rStyle w:val="Hyperlink"/>
-          </w:rPr>
-          <w:t xml:space="preserve">his 1645 lunar map</w:t>
-        </w:r>
-      </w:hyperlink>
+        <w:t xml:space="preserve">I assumed, as I think most people who have written about van Langren did, that his secret had to do with the achievement he’s remembered for: his 1645 lunar map</w:t>
+      </w:r>
+      <w:r>
+        <w:t xml:space="preserve"> </w:t>
+      </w:r>
+      <w:r>
+        <w:t xml:space="preserve">[5]</w:t>
+      </w:r>
       <w:r>
         <w:t xml:space="preserve">, and the method he built around it—using the sunrise and sunset lines crossing named lunar peaks as a celestial clock. It was a reasonable guess, and it made a good (his)story. It was also wrong.</w:t>
       </w:r>
     </w:p>
-    <w:bookmarkEnd w:id="27"/>
-    <w:bookmarkStart w:id="28" w:name="the-problem-of-longitude"/>
+    <w:bookmarkEnd w:id="23"/>
+    <w:bookmarkStart w:id="24" w:name="the-problem-of-longitude"/>
     <w:p>
       <w:pPr>
         <w:pStyle w:val="Heading2"/>
@@ -1190,8 +1159,8 @@
         <w:t xml:space="preserve">That was the kind of answer everyone, including me, expected van Langren’s cipher to hold.</w:t>
       </w:r>
     </w:p>
-    <w:bookmarkEnd w:id="28"/>
-    <w:bookmarkStart w:id="44" w:name="the-cipher-falls"/>
+    <w:bookmarkEnd w:id="24"/>
+    <w:bookmarkStart w:id="36" w:name="the-cipher-falls"/>
     <w:p>
       <w:pPr>
         <w:pStyle w:val="Heading2"/>
@@ -1205,36 +1174,14 @@
         <w:pStyle w:val="FirstParagraph"/>
       </w:pPr>
       <w:r>
-        <w:t xml:space="preserve">Eleven years after our paper—long enough that I had filed the cryptogram away as a loose end nobody would ever tie off—I learned that it had been solved. Not by a historian of science, but by a Belgian warehouse worker and amateur cryptographer. Other amateurs had kept it alive: the cryptology blogger Klaus Schmeh flagged it in 2015, and the mathematician</w:t>
-      </w:r>
-      <w:r>
-        <w:t xml:space="preserve"> </w:t>
-      </w:r>
-      <w:hyperlink r:id="rId29">
-        <w:r>
-          <w:rPr>
-            <w:rStyle w:val="Hyperlink"/>
-          </w:rPr>
-          <w:t xml:space="preserve">Dirk Huylebrouck</w:t>
-        </w:r>
-      </w:hyperlink>
-      <w:r>
-        <w:t xml:space="preserve"> </w:t>
-      </w:r>
-      <w:r>
-        <w:t xml:space="preserve">spent years shopping it around online forums. Then, in December 2020, Jarl Van Eycke, with David Oranchak and Sam Blake, cracked the</w:t>
-      </w:r>
-      <w:r>
-        <w:t xml:space="preserve"> </w:t>
-      </w:r>
-      <w:hyperlink r:id="rId30">
-        <w:r>
-          <w:rPr>
-            <w:rStyle w:val="Hyperlink"/>
-          </w:rPr>
-          <w:t xml:space="preserve">Zodiac Killer’s Z340 cipher</w:t>
-        </w:r>
-      </w:hyperlink>
+        <w:t xml:space="preserve">Eleven years after our paper—long enough that I had filed the cryptogram away as a loose end nobody would ever tie off—I learned that it had been solved. Not by a historian of science, but by a Belgian warehouse worker and amateur cryptographer. Other amateurs had kept it alive: the cryptology blogger Klaus Schmeh flagged it in 2015, and the mathematician Dirk Huylebrouck spent years shopping it around online forums. Then, in December 2020, Jarl Van Eycke, with David Oranchak and Sam Blake, cracked the Zodiac Killer’s Z340 cipher</w:t>
+      </w:r>
+      <w:r>
+        <w:t xml:space="preserve"> </w:t>
+      </w:r>
+      <w:r>
+        <w:t xml:space="preserve">[6]</w:t>
+      </w:r>
       <w:r>
         <w:t xml:space="preserve">,</w:t>
       </w:r>
@@ -1242,7 +1189,7 @@
         <w:rPr>
           <w:rStyle w:val="FootnoteReference"/>
         </w:rPr>
-        <w:footnoteReference w:id="31"/>
+        <w:footnoteReference w:id="25"/>
       </w:r>
       <w:r>
         <w:t xml:space="preserve"> </w:t>
@@ -1269,19 +1216,14 @@
         <w:pStyle w:val="BodyText"/>
       </w:pPr>
       <w:r>
-        <w:t xml:space="preserve">Van Eycke never published his own account of the break; what follows retraces his steps as</w:t>
-      </w:r>
-      <w:r>
-        <w:t xml:space="preserve"> </w:t>
-      </w:r>
-      <w:hyperlink r:id="rId32">
-        <w:r>
-          <w:rPr>
-            <w:rStyle w:val="Hyperlink"/>
-          </w:rPr>
-          <w:t xml:space="preserve">Klaus Schmeh reported them</w:t>
-        </w:r>
-      </w:hyperlink>
+        <w:t xml:space="preserve">Van Eycke never published his own account of the break; what follows retraces his steps as Klaus Schmeh reported them</w:t>
+      </w:r>
+      <w:r>
+        <w:t xml:space="preserve"> </w:t>
+      </w:r>
+      <w:r>
+        <w:t xml:space="preserve">[7]</w:t>
+      </w:r>
       <w:r>
         <w:t xml:space="preserve"> </w:t>
       </w:r>
@@ -1289,7 +1231,7 @@
         <w:t xml:space="preserve">from Van Eycke’s email, applied to the ciphertext from our 2010 supplementary materials. It’s a small master class in breaking a cipher with no known key and no certainty about what kind of cipher it even is.</w:t>
       </w:r>
     </w:p>
-    <w:bookmarkStart w:id="33" w:name="step-1-the-words-are-a-decoy"/>
+    <w:bookmarkStart w:id="26" w:name="step-1-the-words-are-a-decoy"/>
     <w:p>
       <w:pPr>
         <w:pStyle w:val="Heading3"/>
@@ -1796,8 +1738,8 @@
         </w:tc>
       </w:tr>
     </w:tbl>
-    <w:bookmarkEnd w:id="33"/>
-    <w:bookmarkStart w:id="37" w:name="step-2-strip-spaces-and-decoy-capitals"/>
+    <w:bookmarkEnd w:id="26"/>
+    <w:bookmarkStart w:id="29" w:name="step-2-strip-spaces-and-decoy-capitals"/>
     <w:p>
       <w:pPr>
         <w:pStyle w:val="Heading3"/>
@@ -1811,27 +1753,13 @@
         <w:pStyle w:val="FirstParagraph"/>
       </w:pPr>
       <w:r>
-        <w:t xml:space="preserve">With the spaces gone, Van Eycke first tested for</w:t>
-      </w:r>
-      <w:r>
-        <w:t xml:space="preserve"> </w:t>
-      </w:r>
-      <w:hyperlink r:id="rId34">
-        <w:r>
-          <w:rPr>
-            <w:rStyle w:val="Hyperlink"/>
-          </w:rPr>
-          <w:t xml:space="preserve">periodic transposition</w:t>
-        </w:r>
-      </w:hyperlink>
-      <w:r>
-        <w:t xml:space="preserve">—letters simply reordered rather than substituted. Nothing. He then tried removing different classes of symbols to see what improved the letter-trigram statistics.</w:t>
+        <w:t xml:space="preserve">With the spaces gone, Van Eycke first tested for periodic transposition—letters simply reordered rather than substituted. Nothing. He then tried removing different classes of symbols to see what improved the letter-trigram statistics.</w:t>
       </w:r>
       <w:r>
         <w:rPr>
           <w:rStyle w:val="FootnoteReference"/>
         </w:rPr>
-        <w:footnoteReference w:id="35"/>
+        <w:footnoteReference w:id="27"/>
       </w:r>
       <w:r>
         <w:t xml:space="preserve"> </w:t>
@@ -1843,7 +1771,7 @@
         <w:rPr>
           <w:rStyle w:val="FootnoteReference"/>
         </w:rPr>
-        <w:footnoteReference w:id="36"/>
+        <w:footnoteReference w:id="28"/>
       </w:r>
       <w:r>
         <w:t xml:space="preserve"> </w:t>
@@ -1852,8 +1780,8 @@
         <w:t xml:space="preserve">Deleting them leaves a single unbroken run of 987 lowercase letters, long-s (ſ) characters, and digits.</w:t>
       </w:r>
     </w:p>
-    <w:bookmarkEnd w:id="37"/>
-    <w:bookmarkStart w:id="38" w:name="Xf4252676e6dfa0fda2e27468b9cdc9528dee206"/>
+    <w:bookmarkEnd w:id="29"/>
+    <w:bookmarkStart w:id="30" w:name="Xf4252676e6dfa0fda2e27468b9cdc9528dee206"/>
     <w:p>
       <w:pPr>
         <w:pStyle w:val="Heading3"/>
@@ -1870,8 +1798,8 @@
         <w:t xml:space="preserve">Reading the run at different intervals, Van Eycke found that taking every third character—positions 1, 4, 7, …—suddenly produced fragments of real words. The plaintext had been split across three interleaved streams.</w:t>
       </w:r>
     </w:p>
-    <w:bookmarkEnd w:id="38"/>
-    <w:bookmarkStart w:id="43" w:name="step-4-undo-the-digit-substitution"/>
+    <w:bookmarkEnd w:id="30"/>
+    <w:bookmarkStart w:id="35" w:name="step-4-undo-the-digit-substitution"/>
     <w:p>
       <w:pPr>
         <w:pStyle w:val="Heading3"/>
@@ -2130,7 +2058,7 @@
       <w:r>
         <w:t xml:space="preserve"> </w:t>
       </w:r>
-      <w:hyperlink r:id="rId39">
+      <w:hyperlink r:id="rId31">
         <w:r>
           <w:rPr>
             <w:rStyle w:val="VerbatimChar"/>
@@ -2145,12 +2073,12 @@
         <w:rPr>
           <w:rStyle w:val="FootnoteReference"/>
         </w:rPr>
-        <w:footnoteReference w:id="40"/>
-      </w:r>
-    </w:p>
-    <w:bookmarkEnd w:id="43"/>
-    <w:bookmarkEnd w:id="44"/>
-    <w:bookmarkStart w:id="57" w:name="what-van-langren-was-hiding"/>
+        <w:footnoteReference w:id="32"/>
+      </w:r>
+    </w:p>
+    <w:bookmarkEnd w:id="35"/>
+    <w:bookmarkEnd w:id="36"/>
+    <w:bookmarkStart w:id="46" w:name="what-van-langren-was-hiding"/>
     <w:p>
       <w:pPr>
         <w:pStyle w:val="Heading2"/>
@@ -2256,7 +2184,7 @@
       <w:tr>
         <w:tc>
           <w:tcPr/>
-          <w:bookmarkStart w:id="48" w:name="fig-waterclock"/>
+          <w:bookmarkStart w:id="40" w:name="fig-waterclock"/>
           <w:p>
             <w:pPr>
               <w:pStyle w:val="Compact"/>
@@ -2267,18 +2195,18 @@
                 <wp:inline>
                   <wp:extent cx="4267200" cy="2726266"/>
                   <wp:effectExtent b="0" l="0" r="0" t="0"/>
-                  <wp:docPr descr="" title="" id="46" name="Picture"/>
+                  <wp:docPr descr="" title="" id="38" name="Picture"/>
                   <a:graphic>
                     <a:graphicData uri="http://schemas.openxmlformats.org/drawingml/2006/picture">
                       <pic:pic>
                         <pic:nvPicPr>
-                          <pic:cNvPr descr="images/vanlangren-waterclock.png" id="47" name="Picture"/>
+                          <pic:cNvPr descr="images/vanlangren-waterclock.png" id="39" name="Picture"/>
                           <pic:cNvPicPr>
                             <a:picLocks noChangeArrowheads="1" noChangeAspect="1"/>
                           </pic:cNvPicPr>
                         </pic:nvPicPr>
                         <pic:blipFill>
-                          <a:blip r:embed="rId45"/>
+                          <a:blip r:embed="rId37"/>
                           <a:stretch>
                             <a:fillRect/>
                           </a:stretch>
@@ -2318,7 +2246,7 @@
               <w:t xml:space="preserve">Figure 4: How van Langren’s water-clock method was meant to determine longitude at sea.</w:t>
             </w:r>
           </w:p>
-          <w:bookmarkEnd w:id="48"/>
+          <w:bookmarkEnd w:id="40"/>
         </w:tc>
       </w:tr>
     </w:tbl>
@@ -2335,7 +2263,7 @@
       <w:tr>
         <w:tc>
           <w:tcPr/>
-          <w:bookmarkStart w:id="53" w:name="fig-harrison"/>
+          <w:bookmarkStart w:id="45" w:name="fig-harrison"/>
           <w:p>
             <w:pPr>
               <w:pStyle w:val="Compact"/>
@@ -2346,18 +2274,18 @@
                 <wp:inline>
                   <wp:extent cx="1270000" cy="1493520"/>
                   <wp:effectExtent b="0" l="0" r="0" t="0"/>
-                  <wp:docPr descr="" title="" id="50" name="Picture"/>
+                  <wp:docPr descr="" title="" id="42" name="Picture"/>
                   <a:graphic>
                     <a:graphicData uri="http://schemas.openxmlformats.org/drawingml/2006/picture">
                       <pic:pic>
                         <pic:nvPicPr>
-                          <pic:cNvPr descr="images/Harrison-H1_low_250.jpg" id="51" name="Picture"/>
+                          <pic:cNvPr descr="images/Harrison-H1_low_250.jpg" id="43" name="Picture"/>
                           <pic:cNvPicPr>
                             <a:picLocks noChangeArrowheads="1" noChangeAspect="1"/>
                           </pic:cNvPicPr>
                         </pic:nvPicPr>
                         <pic:blipFill>
-                          <a:blip r:embed="rId49"/>
+                          <a:blip r:embed="rId41"/>
                           <a:stretch>
                             <a:fillRect/>
                           </a:stretch>
@@ -2412,7 +2340,7 @@
             <w:r>
               <w:t xml:space="preserve"> </w:t>
             </w:r>
-            <w:hyperlink r:id="rId52">
+            <w:hyperlink r:id="rId44">
               <w:r>
                 <w:rPr>
                   <w:rStyle w:val="Hyperlink"/>
@@ -2424,7 +2352,7 @@
               <w:t xml:space="preserve">.</w:t>
             </w:r>
           </w:p>
-          <w:bookmarkEnd w:id="53"/>
+          <w:bookmarkEnd w:id="45"/>
         </w:tc>
       </w:tr>
     </w:tbl>
@@ -2433,41 +2361,7 @@
         <w:pStyle w:val="BodyText"/>
       </w:pPr>
       <w:r>
-        <w:t xml:space="preserve">The</w:t>
-      </w:r>
-      <w:r>
-        <w:t xml:space="preserve"> </w:t>
-      </w:r>
-      <w:hyperlink r:id="rId54">
-        <w:r>
-          <w:rPr>
-            <w:rStyle w:val="Hyperlink"/>
-          </w:rPr>
-          <w:t xml:space="preserve">clepsydra</w:t>
-        </w:r>
-      </w:hyperlink>
-      <w:r>
-        <w:t xml:space="preserve"> </w:t>
-      </w:r>
-      <w:r>
-        <w:t xml:space="preserve">is one of humanity’s oldest timekeeping instruments, and its flaw was ancient too: water’s flow rate shifts with temperature, as the Han-dynasty astronomer</w:t>
-      </w:r>
-      <w:r>
-        <w:t xml:space="preserve"> </w:t>
-      </w:r>
-      <w:hyperlink r:id="rId55">
-        <w:r>
-          <w:rPr>
-            <w:rStyle w:val="Hyperlink"/>
-          </w:rPr>
-          <w:t xml:space="preserve">Huan Tan</w:t>
-        </w:r>
-      </w:hyperlink>
-      <w:r>
-        <w:t xml:space="preserve"> </w:t>
-      </w:r>
-      <w:r>
-        <w:t xml:space="preserve">noted two thousand years before van Langren. At sea, pitching decks and swinging temperatures would have thrown his copper cones out of sync within days, and the tolerance was brutal: four minutes of drift is one degree of longitude—about 68 km at the latitude of Amsterdam.</w:t>
+        <w:t xml:space="preserve">The clepsydra is one of humanity’s oldest timekeeping instruments, and its flaw was ancient too: water’s flow rate shifts with temperature, as the Han-dynasty astronomer Huan Tan noted two thousand years before van Langren. At sea, pitching decks and swinging temperatures would have thrown his copper cones out of sync within days, and the tolerance was brutal: four minutes of drift is one degree of longitude—about 68 km at the latitude of Amsterdam.</w:t>
       </w:r>
     </w:p>
     <w:p>
@@ -2475,24 +2369,7 @@
         <w:pStyle w:val="BodyText"/>
       </w:pPr>
       <w:r>
-        <w:t xml:space="preserve">Van Langren wrote his cipher in the early 1640s. The pendulum clock was still some fifteen years off; an accurate</w:t>
-      </w:r>
-      <w:r>
-        <w:t xml:space="preserve"> </w:t>
-      </w:r>
-      <w:hyperlink r:id="rId56">
-        <w:r>
-          <w:rPr>
-            <w:rStyle w:val="Hyperlink"/>
-          </w:rPr>
-          <w:t xml:space="preserve">marine chronometer</w:t>
-        </w:r>
-      </w:hyperlink>
-      <w:r>
-        <w:t xml:space="preserve"> </w:t>
-      </w:r>
-      <w:r>
-        <w:t xml:space="preserve">(</w:t>
+        <w:t xml:space="preserve">Van Langren wrote his cipher in the early 1640s. The pendulum clock was still some fifteen years off; an accurate marine chronometer (</w:t>
       </w:r>
       <w:hyperlink w:anchor="fig-harrison">
         <w:r>
@@ -2503,11 +2380,20 @@
         </w:r>
       </w:hyperlink>
       <w:r>
-        <w:t xml:space="preserve">), more than a century. He was reaching for the best tool of his moment to solve a problem no tool of his era could actually solve.</w:t>
-      </w:r>
-    </w:p>
-    <w:bookmarkEnd w:id="57"/>
-    <w:bookmarkStart w:id="78" w:name="bonus-reproducing-langrens-1644-graph"/>
+        <w:t xml:space="preserve">)</w:t>
+      </w:r>
+      <w:r>
+        <w:t xml:space="preserve"> </w:t>
+      </w:r>
+      <w:r>
+        <w:t xml:space="preserve">[8]</w:t>
+      </w:r>
+      <w:r>
+        <w:t xml:space="preserve">, more than a century. He was reaching for the best tool of his moment to solve a problem no tool of his era could actually solve.</w:t>
+      </w:r>
+    </w:p>
+    <w:bookmarkEnd w:id="46"/>
+    <w:bookmarkStart w:id="62" w:name="bonus-reproducing-langrens-1644-graph"/>
     <w:p>
       <w:pPr>
         <w:pStyle w:val="Heading2"/>
@@ -2532,19 +2418,14 @@
       <w:r>
         <w:t xml:space="preserve"> </w:t>
       </w:r>
-      <w:hyperlink r:id="rId58">
-        <w:r>
-          <w:rPr>
-            <w:rStyle w:val="Hyperlink"/>
-          </w:rPr>
-          <w:t xml:space="preserve">“A Brief History of Data Visualization”</w:t>
-        </w:r>
-      </w:hyperlink>
-      <w:r>
-        <w:t xml:space="preserve"> </w:t>
-      </w:r>
-      <w:r>
-        <w:t xml:space="preserve">(Friendly 2007)</w:t>
+      <w:r>
+        <w:t xml:space="preserve">“A Brief History of Data Visualization”</w:t>
+      </w:r>
+      <w:r>
+        <w:t xml:space="preserve"> </w:t>
+      </w:r>
+      <w:r>
+        <w:t xml:space="preserve">[9]</w:t>
       </w:r>
       <w:r>
         <w:t xml:space="preserve"> </w:t>
@@ -2726,31 +2607,21 @@
       <w:r>
         <w:t xml:space="preserve"> </w:t>
       </w:r>
-      <w:hyperlink r:id="rId59">
-        <w:r>
-          <w:rPr>
-            <w:rStyle w:val="Hyperlink"/>
-          </w:rPr>
-          <w:t xml:space="preserve">John Snow’s cholera map</w:t>
-        </w:r>
-      </w:hyperlink>
-      <w:r>
-        <w:t xml:space="preserve"> </w:t>
-      </w:r>
-      <w:r>
-        <w:t xml:space="preserve">and</w:t>
-      </w:r>
-      <w:r>
-        <w:t xml:space="preserve"> </w:t>
-      </w:r>
-      <w:hyperlink r:id="rId60">
-        <w:r>
-          <w:rPr>
-            <w:rStyle w:val="Hyperlink"/>
-          </w:rPr>
-          <w:t xml:space="preserve">Minard’s March on Moscow</w:t>
-        </w:r>
-      </w:hyperlink>
+      <w:r>
+        <w:t xml:space="preserve">John Snow’s cholera map</w:t>
+      </w:r>
+      <w:r>
+        <w:t xml:space="preserve"> </w:t>
+      </w:r>
+      <w:r>
+        <w:t xml:space="preserve">and Minard’s March on Moscow</w:t>
+      </w:r>
+      <w:r>
+        <w:t xml:space="preserve"> </w:t>
+      </w:r>
+      <w:r>
+        <w:t xml:space="preserve">[10]</w:t>
+      </w:r>
       <w:r>
         <w:t xml:space="preserve">.</w:t>
       </w:r>
@@ -2763,7 +2634,7 @@
       <w:r>
         <w:t xml:space="preserve"> </w:t>
       </w:r>
-      <w:hyperlink r:id="rId61">
+      <w:hyperlink r:id="rId47">
         <w:r>
           <w:rPr>
             <w:rStyle w:val="VerbatimChar"/>
@@ -2775,7 +2646,7 @@
         <w:t xml:space="preserve">.</w:t>
       </w:r>
     </w:p>
-    <w:bookmarkStart w:id="77" w:name="i-did-that-better-by-hand"/>
+    <w:bookmarkStart w:id="61" w:name="i-did-that-better-by-hand"/>
     <w:p>
       <w:pPr>
         <w:pStyle w:val="Heading3"/>
@@ -2899,7 +2770,7 @@
       <w:tr>
         <w:tc>
           <w:tcPr/>
-          <w:bookmarkStart w:id="65" w:name="fig-1644-original"/>
+          <w:bookmarkStart w:id="51" w:name="fig-1644-original"/>
           <w:p>
             <w:pPr>
               <w:pStyle w:val="Compact"/>
@@ -2910,18 +2781,18 @@
                 <wp:inline>
                   <wp:extent cx="5334000" cy="1333500"/>
                   <wp:effectExtent b="0" l="0" r="0" t="0"/>
-                  <wp:docPr descr="" title="" id="63" name="Picture"/>
+                  <wp:docPr descr="" title="" id="49" name="Picture"/>
                   <a:graphic>
                     <a:graphicData uri="http://schemas.openxmlformats.org/drawingml/2006/picture">
                       <pic:pic>
                         <pic:nvPicPr>
-                          <pic:cNvPr descr="images/Langren1644-Newberry-bw.png" id="64" name="Picture"/>
+                          <pic:cNvPr descr="images/Langren1644-Newberry-bw.png" id="50" name="Picture"/>
                           <pic:cNvPicPr>
                             <a:picLocks noChangeArrowheads="1" noChangeAspect="1"/>
                           </pic:cNvPicPr>
                         </pic:nvPicPr>
                         <pic:blipFill>
-                          <a:blip r:embed="rId62"/>
+                          <a:blip r:embed="rId48"/>
                           <a:stretch>
                             <a:fillRect/>
                           </a:stretch>
@@ -2971,7 +2842,7 @@
               <w:t xml:space="preserve">La Verdadera Longitud por Mar y Tierra</w:t>
             </w:r>
             <w:r>
-              <w:t xml:space="preserve">, p. [2].</w:t>
+              <w:t xml:space="preserve">, p. 2.</w:t>
             </w:r>
             <w:r>
               <w:t xml:space="preserve"> </w:t>
@@ -2987,7 +2858,7 @@
               <w:t xml:space="preserve">: Courtesy of The Newberry Library, Chicago. Ayer folio QB225 .L36 1644.</w:t>
             </w:r>
           </w:p>
-          <w:bookmarkEnd w:id="65"/>
+          <w:bookmarkEnd w:id="51"/>
         </w:tc>
       </w:tr>
     </w:tbl>
@@ -3227,7 +3098,7 @@
       <w:r>
         <w:t xml:space="preserve"> </w:t>
       </w:r>
-      <w:hyperlink r:id="rId66">
+      <w:hyperlink r:id="rId52">
         <w:r>
           <w:rPr>
             <w:rStyle w:val="VerbatimChar"/>
@@ -3263,7 +3134,7 @@
       <w:tr>
         <w:tc>
           <w:tcPr/>
-          <w:bookmarkStart w:id="70" w:name="fig-reconstruction"/>
+          <w:bookmarkStart w:id="56" w:name="fig-reconstruction"/>
           <w:p>
             <w:pPr>
               <w:pStyle w:val="Compact"/>
@@ -3274,18 +3145,18 @@
                 <wp:inline>
                   <wp:extent cx="5334000" cy="1143000"/>
                   <wp:effectExtent b="0" l="0" r="0" t="0"/>
-                  <wp:docPr descr="" title="" id="68" name="Picture"/>
+                  <wp:docPr descr="" title="" id="54" name="Picture"/>
                   <a:graphic>
                     <a:graphicData uri="http://schemas.openxmlformats.org/drawingml/2006/picture">
                       <pic:pic>
                         <pic:nvPicPr>
-                          <pic:cNvPr descr="vanLangren-Secret_files/figure-docx/fig-reconstruction-1.png" id="69" name="Picture"/>
+                          <pic:cNvPr descr="vanLangren-Secret_files/figure-docx/fig-reconstruction-1.png" id="55" name="Picture"/>
                           <pic:cNvPicPr>
                             <a:picLocks noChangeArrowheads="1" noChangeAspect="1"/>
                           </pic:cNvPicPr>
                         </pic:nvPicPr>
                         <pic:blipFill>
-                          <a:blip r:embed="rId67"/>
+                          <a:blip r:embed="rId53"/>
                           <a:stretch>
                             <a:fillRect/>
                           </a:stretch>
@@ -3325,7 +3196,7 @@
               <w:t xml:space="preserve">Figure 7: A ggplot2 reconstruction of van Langren’s 1644 graph.</w:t>
             </w:r>
           </w:p>
-          <w:bookmarkEnd w:id="70"/>
+          <w:bookmarkEnd w:id="56"/>
         </w:tc>
       </w:tr>
     </w:tbl>
@@ -3384,16 +3255,8 @@
       <w:r>
         <w:t xml:space="preserve"> </w:t>
       </w:r>
-      <w:hyperlink r:id="rId71">
-        <w:r>
-          <w:rPr>
-            <w:rStyle w:val="Hyperlink"/>
-          </w:rPr>
-          <w:t xml:space="preserve">Pareto Principle</w:t>
-        </w:r>
-      </w:hyperlink>
-      <w:r>
-        <w:t xml:space="preserve">) of data graphics says</w:t>
+      <w:r>
+        <w:t xml:space="preserve">Pareto Principle) of data graphics says</w:t>
       </w:r>
       <w:r>
         <w:t xml:space="preserve"> </w:t>
@@ -3484,7 +3347,7 @@
       <w:tr>
         <w:tc>
           <w:tcPr/>
-          <w:bookmarkStart w:id="76" w:name="fig-scherer"/>
+          <w:bookmarkStart w:id="60" w:name="fig-scherer"/>
           <w:p>
             <w:pPr>
               <w:pStyle w:val="Compact"/>
@@ -3495,18 +3358,18 @@
                 <wp:inline>
                   <wp:extent cx="5334000" cy="1394113"/>
                   <wp:effectExtent b="0" l="0" r="0" t="0"/>
-                  <wp:docPr descr="" title="" id="73" name="Picture"/>
+                  <wp:docPr descr="" title="" id="58" name="Picture"/>
                   <a:graphic>
                     <a:graphicData uri="http://schemas.openxmlformats.org/drawingml/2006/picture">
                       <pic:pic>
                         <pic:nvPicPr>
-                          <pic:cNvPr descr="images/03_historical.png" id="74" name="Picture"/>
+                          <pic:cNvPr descr="images/03_historical.png" id="59" name="Picture"/>
                           <pic:cNvPicPr>
                             <a:picLocks noChangeArrowheads="1" noChangeAspect="1"/>
                           </pic:cNvPicPr>
                         </pic:nvPicPr>
                         <pic:blipFill>
-                          <a:blip r:embed="rId72"/>
+                          <a:blip r:embed="rId57"/>
                           <a:stretch>
                             <a:fillRect/>
                           </a:stretch>
@@ -3571,30 +3434,25 @@
               <w:t xml:space="preserve">Source</w:t>
             </w:r>
             <w:r>
-              <w:t xml:space="preserve">: Cédric Scherer,</w:t>
+              <w:t xml:space="preserve">: Cédric Scherer</w:t>
             </w:r>
             <w:r>
               <w:t xml:space="preserve"> </w:t>
             </w:r>
-            <w:hyperlink r:id="rId75">
-              <w:r>
-                <w:rPr>
-                  <w:rStyle w:val="Hyperlink"/>
-                </w:rPr>
-                <w:t xml:space="preserve">github.com/z3tt/30DayChartChallenge2021</w:t>
-              </w:r>
-            </w:hyperlink>
+            <w:r>
+              <w:t xml:space="preserve">[11]</w:t>
+            </w:r>
             <w:r>
               <w:t xml:space="preserve">.</w:t>
             </w:r>
           </w:p>
-          <w:bookmarkEnd w:id="76"/>
+          <w:bookmarkEnd w:id="60"/>
         </w:tc>
       </w:tr>
     </w:tbl>
-    <w:bookmarkEnd w:id="77"/>
-    <w:bookmarkEnd w:id="78"/>
-    <w:bookmarkStart w:id="79" w:name="every-cipher-tells-a-story"/>
+    <w:bookmarkEnd w:id="61"/>
+    <w:bookmarkEnd w:id="62"/>
+    <w:bookmarkStart w:id="63" w:name="every-cipher-tells-a-story"/>
     <w:p>
       <w:pPr>
         <w:pStyle w:val="Heading2"/>
@@ -3702,8 +3560,8 @@
         <w:t xml:space="preserve">The shock of finding our interpretation wrong is replaced, in the end, by a feeling of satisfaction in being able to right the ship of history.</w:t>
       </w:r>
     </w:p>
-    <w:bookmarkEnd w:id="79"/>
-    <w:bookmarkStart w:id="86" w:name="references"/>
+    <w:bookmarkEnd w:id="63"/>
+    <w:bookmarkStart w:id="85" w:name="references"/>
     <w:p>
       <w:pPr>
         <w:pStyle w:val="Heading2"/>
@@ -3712,70 +3570,43 @@
         <w:t xml:space="preserve">References</w:t>
       </w:r>
     </w:p>
-    <w:bookmarkStart w:id="85" w:name="refs"/>
-    <w:bookmarkStart w:id="80" w:name="ref-Friendly:2006:hbook"/>
+    <w:bookmarkStart w:id="84" w:name="refs"/>
+    <w:bookmarkStart w:id="65" w:name="ref-FriendlyChevaliers:2020"/>
     <w:p>
       <w:pPr>
         <w:pStyle w:val="Bibliography"/>
       </w:pPr>
       <w:r>
-        <w:t xml:space="preserve">Friendly, Michael. 2007.</w:t>
-      </w:r>
-      <w:r>
-        <w:t xml:space="preserve"> </w:t>
-      </w:r>
-      <w:r>
-        <w:t xml:space="preserve">“A Brief History of Data Visualization.”</w:t>
-      </w:r>
-      <w:r>
-        <w:t xml:space="preserve"> </w:t>
-      </w:r>
-      <w:r>
-        <w:t xml:space="preserve">Chap. 1 in</w:t>
-      </w:r>
-      <w:r>
-        <w:t xml:space="preserve"> </w:t>
-      </w:r>
-      <w:r>
-        <w:rPr>
-          <w:i/>
-          <w:iCs/>
-        </w:rPr>
-        <w:t xml:space="preserve">Handbook of Computational Statistics: Data Visualization</w:t>
-      </w:r>
-      <w:r>
-        <w:t xml:space="preserve">, edited by C. Chen, Wolfgang Härdle, and Antony Unwin, III. Springer-Verlag.</w:t>
-      </w:r>
-    </w:p>
-    <w:bookmarkEnd w:id="80"/>
-    <w:bookmarkStart w:id="82" w:name="ref-FriendlyChevaliers:2020"/>
-    <w:p>
-      <w:pPr>
-        <w:pStyle w:val="Bibliography"/>
-      </w:pPr>
-      <w:r>
-        <w:t xml:space="preserve">Friendly, Michael, and les Chevaliers</w:t>
-      </w:r>
-      <w:r>
-        <w:t xml:space="preserve">. 2020.</w:t>
-      </w:r>
-      <w:r>
-        <w:t xml:space="preserve"> </w:t>
-      </w:r>
-      <w:r>
-        <w:rPr>
-          <w:i/>
-          <w:iCs/>
-        </w:rPr>
-        <w:t xml:space="preserve">Raiders of the Lost Tombs: The Search for Some Heroes of the History of Data Visualization</w:t>
-      </w:r>
-      <w:r>
-        <w:t xml:space="preserve">. Online.</w:t>
-      </w:r>
-      <w:r>
-        <w:t xml:space="preserve"> </w:t>
-      </w:r>
-      <w:hyperlink r:id="rId81">
+        <w:t xml:space="preserve">[1]</w:t>
+      </w:r>
+      <w:r>
+        <w:t xml:space="preserve"> </w:t>
+      </w:r>
+      <w:r>
+        <w:t xml:space="preserve">	</w:t>
+      </w:r>
+      <w:r>
+        <w:t xml:space="preserve">M. Friendly and les Chevaliers</w:t>
+      </w:r>
+      <w:r>
+        <w:t xml:space="preserve">,</w:t>
+      </w:r>
+      <w:r>
+        <w:t xml:space="preserve"> </w:t>
+      </w:r>
+      <w:r>
+        <w:t xml:space="preserve">“Raiders of the lost tombs: The search for some heroes of the history of data visualization.”</w:t>
+      </w:r>
+      <w:r>
+        <w:t xml:space="preserve"> </w:t>
+      </w:r>
+      <w:r>
+        <w:t xml:space="preserve">Online, 2020. Available:</w:t>
+      </w:r>
+      <w:r>
+        <w:t xml:space="preserve"> </w:t>
+      </w:r>
+      <w:hyperlink r:id="rId64">
         <w:r>
           <w:rPr>
             <w:rStyle w:val="Hyperlink"/>
@@ -3783,63 +3614,24 @@
           <w:t xml:space="preserve">https://medium.com/nightingale/raiders-of-the-lost-tombs-the-search-for-some-heroes-of-the-history-of-data-visualization-c4a4b4690d24</w:t>
         </w:r>
       </w:hyperlink>
-      <w:r>
-        <w:t xml:space="preserve">.</w:t>
-      </w:r>
-    </w:p>
-    <w:bookmarkEnd w:id="82"/>
-    <w:bookmarkStart w:id="84" w:name="ref-Friendly:2010:langren"/>
+    </w:p>
+    <w:bookmarkEnd w:id="65"/>
+    <w:bookmarkStart w:id="66" w:name="ref-Langren:1644"/>
     <w:p>
       <w:pPr>
         <w:pStyle w:val="Bibliography"/>
       </w:pPr>
       <w:r>
-        <w:t xml:space="preserve">Friendly, Michael, Pedro Valero-Mora, and Joaquín Ibáñez Ulargui. 2010.</w:t>
-      </w:r>
-      <w:r>
-        <w:t xml:space="preserve"> </w:t>
-      </w:r>
-      <w:r>
-        <w:t xml:space="preserve">“The First (Known) Statistical Graph:</w:t>
-      </w:r>
-      <w:r>
-        <w:t xml:space="preserve"> </w:t>
-      </w:r>
-      <w:r>
-        <w:t xml:space="preserve">M</w:t>
-      </w:r>
-      <w:r>
-        <w:t xml:space="preserve">ichael</w:t>
-      </w:r>
-      <w:r>
-        <w:t xml:space="preserve"> </w:t>
-      </w:r>
-      <w:r>
-        <w:t xml:space="preserve">F</w:t>
-      </w:r>
-      <w:r>
-        <w:t xml:space="preserve">lorent van</w:t>
-      </w:r>
-      <w:r>
-        <w:t xml:space="preserve"> </w:t>
-      </w:r>
-      <w:r>
-        <w:t xml:space="preserve">L</w:t>
-      </w:r>
-      <w:r>
-        <w:t xml:space="preserve">angren and the</w:t>
-      </w:r>
-      <w:r>
-        <w:t xml:space="preserve"> </w:t>
-      </w:r>
-      <w:r>
-        <w:t xml:space="preserve">‘Secret’</w:t>
-      </w:r>
-      <w:r>
-        <w:t xml:space="preserve"> </w:t>
-      </w:r>
-      <w:r>
-        <w:t xml:space="preserve">of Longitude.”</w:t>
+        <w:t xml:space="preserve">[2]</w:t>
+      </w:r>
+      <w:r>
+        <w:t xml:space="preserve"> </w:t>
+      </w:r>
+      <w:r>
+        <w:t xml:space="preserve">	</w:t>
+      </w:r>
+      <w:r>
+        <w:t xml:space="preserve">M. F. van Langren,</w:t>
       </w:r>
       <w:r>
         <w:t xml:space="preserve"> </w:t>
@@ -3849,32 +3641,509 @@
           <w:i/>
           <w:iCs/>
         </w:rPr>
+        <w:t xml:space="preserve">La Verdadera Longitud por Mar y Tierra</w:t>
+      </w:r>
+      <w:r>
+        <w:t xml:space="preserve">. Antwerp: (n.p.), 1644.</w:t>
+      </w:r>
+    </w:p>
+    <w:bookmarkEnd w:id="66"/>
+    <w:bookmarkStart w:id="68" w:name="ref-Friendly:2010:langren"/>
+    <w:p>
+      <w:pPr>
+        <w:pStyle w:val="Bibliography"/>
+      </w:pPr>
+      <w:r>
+        <w:t xml:space="preserve">[3]</w:t>
+      </w:r>
+      <w:r>
+        <w:t xml:space="preserve"> </w:t>
+      </w:r>
+      <w:r>
+        <w:t xml:space="preserve">	</w:t>
+      </w:r>
+      <w:r>
+        <w:t xml:space="preserve">M. Friendly, P. Valero-Mora, and J. Ibáñez Ulargui,</w:t>
+      </w:r>
+      <w:r>
+        <w:t xml:space="preserve"> </w:t>
+      </w:r>
+      <w:r>
+        <w:t xml:space="preserve">“The first (known) statistical graph:</w:t>
+      </w:r>
+      <w:r>
+        <w:t xml:space="preserve"> </w:t>
+      </w:r>
+      <w:r>
+        <w:t xml:space="preserve">M</w:t>
+      </w:r>
+      <w:r>
+        <w:t xml:space="preserve">ichael</w:t>
+      </w:r>
+      <w:r>
+        <w:t xml:space="preserve"> </w:t>
+      </w:r>
+      <w:r>
+        <w:t xml:space="preserve">F</w:t>
+      </w:r>
+      <w:r>
+        <w:t xml:space="preserve">lorent van</w:t>
+      </w:r>
+      <w:r>
+        <w:t xml:space="preserve"> </w:t>
+      </w:r>
+      <w:r>
+        <w:t xml:space="preserve">L</w:t>
+      </w:r>
+      <w:r>
+        <w:t xml:space="preserve">angren and the</w:t>
+      </w:r>
+      <w:r>
+        <w:t xml:space="preserve"> </w:t>
+      </w:r>
+      <w:r>
+        <w:t xml:space="preserve">‘secret’</w:t>
+      </w:r>
+      <w:r>
+        <w:t xml:space="preserve"> </w:t>
+      </w:r>
+      <w:r>
+        <w:t xml:space="preserve">of longitude,”</w:t>
+      </w:r>
+      <w:r>
+        <w:t xml:space="preserve"> </w:t>
+      </w:r>
+      <w:r>
+        <w:rPr>
+          <w:i/>
+          <w:iCs/>
+        </w:rPr>
         <w:t xml:space="preserve">The American Statistician</w:t>
       </w:r>
       <w:r>
-        <w:t xml:space="preserve"> </w:t>
-      </w:r>
-      <w:r>
-        <w:t xml:space="preserve">64 (2): 174–84.</w:t>
-      </w:r>
-      <w:r>
-        <w:t xml:space="preserve"> </w:t>
-      </w:r>
-      <w:hyperlink r:id="rId83">
+        <w:t xml:space="preserve">, vol. 64, no. 2, pp. 174–184, 2010, doi:</w:t>
+      </w:r>
+      <w:r>
+        <w:t xml:space="preserve"> </w:t>
+      </w:r>
+      <w:hyperlink r:id="rId67">
         <w:r>
           <w:rPr>
             <w:rStyle w:val="Hyperlink"/>
           </w:rPr>
-          <w:t xml:space="preserve">https://doi.org/10.1198/tast.2010.09154</w:t>
+          <w:t xml:space="preserve">10.1198/tast.2010.09154</w:t>
         </w:r>
       </w:hyperlink>
       <w:r>
         <w:t xml:space="preserve">.</w:t>
       </w:r>
     </w:p>
+    <w:bookmarkEnd w:id="68"/>
+    <w:bookmarkStart w:id="70" w:name="ref-Friendly:2010:langren-supp"/>
+    <w:p>
+      <w:pPr>
+        <w:pStyle w:val="Bibliography"/>
+      </w:pPr>
+      <w:r>
+        <w:t xml:space="preserve">[4]</w:t>
+      </w:r>
+      <w:r>
+        <w:t xml:space="preserve"> </w:t>
+      </w:r>
+      <w:r>
+        <w:t xml:space="preserve">	</w:t>
+      </w:r>
+      <w:r>
+        <w:t xml:space="preserve">M. Friendly, P. Valero-Mora, and J. Ibáñez Ulargui,</w:t>
+      </w:r>
+      <w:r>
+        <w:t xml:space="preserve"> </w:t>
+      </w:r>
+      <w:r>
+        <w:t xml:space="preserve">“The first (known) statistical graph: Supplementary materials.”</w:t>
+      </w:r>
+      <w:r>
+        <w:t xml:space="preserve"> </w:t>
+      </w:r>
+      <w:r>
+        <w:t xml:space="preserve">Includes the ciphertext and a transcription and English translation of</w:t>
+      </w:r>
+      <w:r>
+        <w:t xml:space="preserve"> </w:t>
+      </w:r>
+      <w:r>
+        <w:rPr>
+          <w:i/>
+          <w:iCs/>
+        </w:rPr>
+        <w:t xml:space="preserve">La Verdadera</w:t>
+      </w:r>
+      <w:r>
+        <w:t xml:space="preserve">, 2010. Available:</w:t>
+      </w:r>
+      <w:r>
+        <w:t xml:space="preserve"> </w:t>
+      </w:r>
+      <w:hyperlink r:id="rId69">
+        <w:r>
+          <w:rPr>
+            <w:rStyle w:val="Hyperlink"/>
+          </w:rPr>
+          <w:t xml:space="preserve">https://www.datavis.ca/gallery/langren/</w:t>
+        </w:r>
+      </w:hyperlink>
+    </w:p>
+    <w:bookmarkEnd w:id="70"/>
+    <w:bookmarkStart w:id="72" w:name="ref-Langren:1645"/>
+    <w:p>
+      <w:pPr>
+        <w:pStyle w:val="Bibliography"/>
+      </w:pPr>
+      <w:r>
+        <w:t xml:space="preserve">[5]</w:t>
+      </w:r>
+      <w:r>
+        <w:t xml:space="preserve"> </w:t>
+      </w:r>
+      <w:r>
+        <w:t xml:space="preserve">	</w:t>
+      </w:r>
+      <w:r>
+        <w:t xml:space="preserve">M. F. van Langren,</w:t>
+      </w:r>
+      <w:r>
+        <w:t xml:space="preserve"> </w:t>
+      </w:r>
+      <w:r>
+        <w:t xml:space="preserve">“</w:t>
+      </w:r>
+      <w:r>
+        <w:t xml:space="preserve">Plenilunii Lumina Austriaca Philippica</w:t>
+      </w:r>
+      <w:r>
+        <w:t xml:space="preserve">.”</w:t>
+      </w:r>
+      <w:r>
+        <w:t xml:space="preserve"> </w:t>
+      </w:r>
+      <w:r>
+        <w:t xml:space="preserve">Engraved map of the Moon, Brussels, 1645. Available:</w:t>
+      </w:r>
+      <w:r>
+        <w:t xml:space="preserve"> </w:t>
+      </w:r>
+      <w:hyperlink r:id="rId71">
+        <w:r>
+          <w:rPr>
+            <w:rStyle w:val="Hyperlink"/>
+          </w:rPr>
+          <w:t xml:space="preserve">https://commons.wikimedia.org/wiki/File:Langrenus_map_of_the_Moon_1645.jpg</w:t>
+        </w:r>
+      </w:hyperlink>
+    </w:p>
+    <w:bookmarkEnd w:id="72"/>
+    <w:bookmarkStart w:id="74" w:name="ref-Oranchak:2024"/>
+    <w:p>
+      <w:pPr>
+        <w:pStyle w:val="Bibliography"/>
+      </w:pPr>
+      <w:r>
+        <w:t xml:space="preserve">[6]</w:t>
+      </w:r>
+      <w:r>
+        <w:t xml:space="preserve"> </w:t>
+      </w:r>
+      <w:r>
+        <w:t xml:space="preserve">	</w:t>
+      </w:r>
+      <w:r>
+        <w:t xml:space="preserve">D. Oranchak, S. Blake, and J. Van Eycke,</w:t>
+      </w:r>
+      <w:r>
+        <w:t xml:space="preserve"> </w:t>
+      </w:r>
+      <w:r>
+        <w:t xml:space="preserve">“The solution of the</w:t>
+      </w:r>
+      <w:r>
+        <w:t xml:space="preserve"> </w:t>
+      </w:r>
+      <w:r>
+        <w:t xml:space="preserve">Zodiac Killer’s</w:t>
+      </w:r>
+      <w:r>
+        <w:t xml:space="preserve"> </w:t>
+      </w:r>
+      <w:r>
+        <w:t xml:space="preserve">340-character cipher.”</w:t>
+      </w:r>
+      <w:r>
+        <w:t xml:space="preserve"> </w:t>
+      </w:r>
+      <w:r>
+        <w:t xml:space="preserve">arXiv:2403.17350, 2024. doi:</w:t>
+      </w:r>
+      <w:r>
+        <w:t xml:space="preserve"> </w:t>
+      </w:r>
+      <w:hyperlink r:id="rId73">
+        <w:r>
+          <w:rPr>
+            <w:rStyle w:val="Hyperlink"/>
+          </w:rPr>
+          <w:t xml:space="preserve">10.48550/arXiv.2403.17350</w:t>
+        </w:r>
+      </w:hyperlink>
+      <w:r>
+        <w:t xml:space="preserve">.</w:t>
+      </w:r>
+    </w:p>
+    <w:bookmarkEnd w:id="74"/>
+    <w:bookmarkStart w:id="76" w:name="ref-Schmeh:2021"/>
+    <w:p>
+      <w:pPr>
+        <w:pStyle w:val="Bibliography"/>
+      </w:pPr>
+      <w:r>
+        <w:t xml:space="preserve">[7]</w:t>
+      </w:r>
+      <w:r>
+        <w:t xml:space="preserve"> </w:t>
+      </w:r>
+      <w:r>
+        <w:t xml:space="preserve">	</w:t>
+      </w:r>
+      <w:r>
+        <w:t xml:space="preserve">K. Schmeh,</w:t>
+      </w:r>
+      <w:r>
+        <w:t xml:space="preserve"> </w:t>
+      </w:r>
+      <w:r>
+        <w:t xml:space="preserve">“Jarl</w:t>
+      </w:r>
+      <w:r>
+        <w:t xml:space="preserve"> </w:t>
+      </w:r>
+      <w:r>
+        <w:t xml:space="preserve">Van Eycke</w:t>
+      </w:r>
+      <w:r>
+        <w:t xml:space="preserve"> </w:t>
+      </w:r>
+      <w:r>
+        <w:t xml:space="preserve">solves 400 year old longitude message.”</w:t>
+      </w:r>
+      <w:r>
+        <w:t xml:space="preserve"> </w:t>
+      </w:r>
+      <w:r>
+        <w:t xml:space="preserve">Cipherbrain (blog), 18 February, 2021. Available:</w:t>
+      </w:r>
+      <w:r>
+        <w:t xml:space="preserve"> </w:t>
+      </w:r>
+      <w:hyperlink r:id="rId75">
+        <w:r>
+          <w:rPr>
+            <w:rStyle w:val="Hyperlink"/>
+          </w:rPr>
+          <w:t xml:space="preserve">https://scienceblogs.de/klausis-krypto-kolumne/jarl-van-eycke-solves-400-year-old-longitude-message/</w:t>
+        </w:r>
+      </w:hyperlink>
+    </w:p>
+    <w:bookmarkEnd w:id="76"/>
+    <w:bookmarkStart w:id="78" w:name="ref-RMG:harrison"/>
+    <w:p>
+      <w:pPr>
+        <w:pStyle w:val="Bibliography"/>
+      </w:pPr>
+      <w:r>
+        <w:t xml:space="preserve">[8]</w:t>
+      </w:r>
+      <w:r>
+        <w:t xml:space="preserve"> </w:t>
+      </w:r>
+      <w:r>
+        <w:t xml:space="preserve">	</w:t>
+      </w:r>
+      <w:r>
+        <w:t xml:space="preserve">Royal Museums Greenwich,</w:t>
+      </w:r>
+      <w:r>
+        <w:t xml:space="preserve"> </w:t>
+      </w:r>
+      <w:r>
+        <w:t xml:space="preserve">“Longitude found: The story of</w:t>
+      </w:r>
+      <w:r>
+        <w:t xml:space="preserve"> </w:t>
+      </w:r>
+      <w:r>
+        <w:t xml:space="preserve">Harrison’s</w:t>
+      </w:r>
+      <w:r>
+        <w:t xml:space="preserve"> </w:t>
+      </w:r>
+      <w:r>
+        <w:t xml:space="preserve">timekeepers.”</w:t>
+      </w:r>
+      <w:r>
+        <w:t xml:space="preserve"> </w:t>
+      </w:r>
+      <w:r>
+        <w:t xml:space="preserve">Online. Available:</w:t>
+      </w:r>
+      <w:r>
+        <w:t xml:space="preserve"> </w:t>
+      </w:r>
+      <w:hyperlink r:id="rId77">
+        <w:r>
+          <w:rPr>
+            <w:rStyle w:val="Hyperlink"/>
+          </w:rPr>
+          <w:t xml:space="preserve">https://www.rmg.co.uk/stories/time/harrisons-clocks-longitude-problem</w:t>
+        </w:r>
+      </w:hyperlink>
+    </w:p>
+    <w:bookmarkEnd w:id="78"/>
+    <w:bookmarkStart w:id="79" w:name="ref-Friendly:2006:hbook"/>
+    <w:p>
+      <w:pPr>
+        <w:pStyle w:val="Bibliography"/>
+      </w:pPr>
+      <w:r>
+        <w:t xml:space="preserve">[9]</w:t>
+      </w:r>
+      <w:r>
+        <w:t xml:space="preserve"> </w:t>
+      </w:r>
+      <w:r>
+        <w:t xml:space="preserve">	</w:t>
+      </w:r>
+      <w:r>
+        <w:t xml:space="preserve">M. Friendly,</w:t>
+      </w:r>
+      <w:r>
+        <w:t xml:space="preserve"> </w:t>
+      </w:r>
+      <w:r>
+        <w:t xml:space="preserve">“A brief history of data visualization,”</w:t>
+      </w:r>
+      <w:r>
+        <w:t xml:space="preserve"> </w:t>
+      </w:r>
+      <w:r>
+        <w:t xml:space="preserve">in</w:t>
+      </w:r>
+      <w:r>
+        <w:t xml:space="preserve"> </w:t>
+      </w:r>
+      <w:r>
+        <w:rPr>
+          <w:i/>
+          <w:iCs/>
+        </w:rPr>
+        <w:t xml:space="preserve">Handbook of computational statistics: Data visualization</w:t>
+      </w:r>
+      <w:r>
+        <w:t xml:space="preserve">, vol. III, C. Chen, W. Härdle, and A. Unwin, Eds., Heidelberg: Springer-Verlag, 2007, ch. 1, pp. 1–34.</w:t>
+      </w:r>
+    </w:p>
+    <w:bookmarkEnd w:id="79"/>
+    <w:bookmarkStart w:id="81" w:name="ref-R-HistData"/>
+    <w:p>
+      <w:pPr>
+        <w:pStyle w:val="Bibliography"/>
+      </w:pPr>
+      <w:r>
+        <w:t xml:space="preserve">[10]</w:t>
+      </w:r>
+      <w:r>
+        <w:t xml:space="preserve"> </w:t>
+      </w:r>
+      <w:r>
+        <w:t xml:space="preserve">	</w:t>
+      </w:r>
+      <w:r>
+        <w:t xml:space="preserve">M. Friendly, S. Dray, P. Li, and D. Bellhouse,</w:t>
+      </w:r>
+      <w:r>
+        <w:t xml:space="preserve"> </w:t>
+      </w:r>
+      <w:r>
+        <w:rPr>
+          <w:i/>
+          <w:iCs/>
+        </w:rPr>
+        <w:t xml:space="preserve">HistData: Data sets from the history of statistics and data visualization</w:t>
+      </w:r>
+      <w:r>
+        <w:t xml:space="preserve">. 2026. Available:</w:t>
+      </w:r>
+      <w:r>
+        <w:t xml:space="preserve"> </w:t>
+      </w:r>
+      <w:hyperlink r:id="rId80">
+        <w:r>
+          <w:rPr>
+            <w:rStyle w:val="Hyperlink"/>
+          </w:rPr>
+          <w:t xml:space="preserve">https://friendly.github.io/HistData/</w:t>
+        </w:r>
+      </w:hyperlink>
+    </w:p>
+    <w:bookmarkEnd w:id="81"/>
+    <w:bookmarkStart w:id="83" w:name="ref-Scherer:2021"/>
+    <w:p>
+      <w:pPr>
+        <w:pStyle w:val="Bibliography"/>
+      </w:pPr>
+      <w:r>
+        <w:t xml:space="preserve">[11]</w:t>
+      </w:r>
+      <w:r>
+        <w:t xml:space="preserve"> </w:t>
+      </w:r>
+      <w:r>
+        <w:t xml:space="preserve">	</w:t>
+      </w:r>
+      <w:r>
+        <w:t xml:space="preserve">C. Scherer,</w:t>
+      </w:r>
+      <w:r>
+        <w:t xml:space="preserve"> </w:t>
+      </w:r>
+      <w:r>
+        <w:t xml:space="preserve">“</w:t>
+      </w:r>
+      <w:r>
+        <w:t xml:space="preserve">#30DayChartChallenge 2021, Day 3: Historical</w:t>
+      </w:r>
+      <w:r>
+        <w:t xml:space="preserve">.”</w:t>
+      </w:r>
+      <w:r>
+        <w:t xml:space="preserve"> </w:t>
+      </w:r>
+      <w:r>
+        <w:t xml:space="preserve">GitHub repository, 2021. Available:</w:t>
+      </w:r>
+      <w:r>
+        <w:t xml:space="preserve"> </w:t>
+      </w:r>
+      <w:hyperlink r:id="rId82">
+        <w:r>
+          <w:rPr>
+            <w:rStyle w:val="Hyperlink"/>
+          </w:rPr>
+          <w:t xml:space="preserve">https://github.com/z3tt/30DayChartChallenge2021/tree/main/03_historical</w:t>
+        </w:r>
+      </w:hyperlink>
+    </w:p>
+    <w:bookmarkEnd w:id="83"/>
     <w:bookmarkEnd w:id="84"/>
     <w:bookmarkEnd w:id="85"/>
-    <w:bookmarkEnd w:id="86"/>
     <w:sectPr/>
   </w:body>
 </w:document>
@@ -3900,7 +4169,7 @@
       </w:r>
     </w:p>
   </w:footnote>
-  <w:footnote w:id="14">
+  <w:footnote w:id="13">
     <w:p>
       <w:pPr>
         <w:pStyle w:val="FootnoteText"/>
@@ -3964,7 +4233,7 @@
       </w:r>
     </w:p>
   </w:footnote>
-  <w:footnote w:id="31">
+  <w:footnote w:id="25">
     <w:p>
       <w:pPr>
         <w:pStyle w:val="FootnoteText"/>
@@ -3983,7 +4252,7 @@
       </w:r>
     </w:p>
   </w:footnote>
-  <w:footnote w:id="35">
+  <w:footnote w:id="27">
     <w:p>
       <w:pPr>
         <w:pStyle w:val="FootnoteText"/>
@@ -4026,7 +4295,7 @@
       </w:r>
     </w:p>
   </w:footnote>
-  <w:footnote w:id="36">
+  <w:footnote w:id="28">
     <w:p>
       <w:pPr>
         <w:pStyle w:val="FootnoteText"/>
@@ -4084,7 +4353,7 @@
       </w:r>
     </w:p>
   </w:footnote>
-  <w:footnote w:id="40">
+  <w:footnote w:id="32">
     <w:p>
       <w:pPr>
         <w:pStyle w:val="FootnoteText"/>
@@ -4104,7 +4373,7 @@
       <w:r>
         <w:t xml:space="preserve"> </w:t>
       </w:r>
-      <w:hyperlink r:id="rId41">
+      <w:hyperlink r:id="rId33">
         <w:r>
           <w:rPr>
             <w:rStyle w:val="Hyperlink"/>
@@ -4118,7 +4387,7 @@
       <w:r>
         <w:t xml:space="preserve"> </w:t>
       </w:r>
-      <w:hyperlink r:id="rId42">
+      <w:hyperlink r:id="rId34">
         <w:r>
           <w:rPr>
             <w:rStyle w:val="Hyperlink"/>

</xml_diff>

<commit_message>
Scherer paragraph: "placed in code by hand"; re-render .docx for Piero
</commit_message>
<xml_diff>
--- a/vanLangren-Secret.docx
+++ b/vanLangren-Secret.docx
@@ -713,7 +713,7 @@
               <w:pStyle w:val="ImageCaption"/>
             </w:pPr>
             <w:r>
-              <w:t xml:space="preserve">Figure 3: Page 8 of</w:t>
+              <w:t xml:space="preserve">Figure 3: The printed cipher from</w:t>
             </w:r>
             <w:r>
               <w:t xml:space="preserve"> </w:t>
@@ -729,7 +729,7 @@
               <w:t xml:space="preserve"> </w:t>
             </w:r>
             <w:r>
-              <w:t xml:space="preserve">(1644): the printed cipher, exactly as van Langren’s readers first saw it.</w:t>
+              <w:t xml:space="preserve">(1644) page 8, exactly as van Langren’s readers first saw it.</w:t>
             </w:r>
             <w:r>
               <w:t xml:space="preserve"> </w:t>
@@ -3313,7 +3313,7 @@
         <w:t xml:space="preserve"> </w:t>
       </w:r>
       <w:r>
-        <w:t xml:space="preserve">from four stacked symbols, and every marker and label placed by hand—down to the</w:t>
+        <w:t xml:space="preserve">from four stacked symbols, and every marker and label placed in code by hand—down to the</w:t>
       </w:r>
       <w:r>
         <w:t xml:space="preserve"> </w:t>

</xml_diff>